<commit_message>
Remove general instructions box from Grade 7 math exam
Co-Authored-By: Claude Opus 5.5 <noreply@anthropic.com>
Claude-Session: https://claude.ai/code/session_01PHgZqhLAeFoDhbHXzt9YLK
</commit_message>
<xml_diff>
--- a/exams/امتحان-رياضيات-السابع-مع-المثلثات.docx
+++ b/exams/امتحان-رياضيات-السابع-مع-المثلثات.docx
@@ -1126,120 +1126,6 @@
         <w:spacing w:before="0" w:after="0" w:line="160" w:lineRule="exact"/>
       </w:pPr>
     </w:p>
-    <w:tbl>
-      <w:tblPr>
-        <w:bidiVisual/>
-        <w:tblW w:w="10440" w:type="dxa"/>
-        <w:jc w:val="center"/>
-        <w:tblBorders>
-          <w:top w:val="nil" w:sz="4" w:space="0" w:color="BFBFBF"/>
-          <w:left w:val="nil" w:sz="4" w:space="0" w:color="BFBFBF"/>
-          <w:bottom w:val="nil" w:sz="4" w:space="0" w:color="BFBFBF"/>
-          <w:right w:val="nil" w:sz="4" w:space="0" w:color="BFBFBF"/>
-          <w:insideH w:val="nil" w:sz="4" w:space="0" w:color="BFBFBF"/>
-          <w:insideV w:val="nil" w:sz="4" w:space="0" w:color="BFBFBF"/>
-        </w:tblBorders>
-        <w:tblLayout w:type="fixed"/>
-        <w:tblCellMar>
-          <w:top w:w="80" w:type="dxa"/>
-          <w:left w:w="110" w:type="dxa"/>
-          <w:bottom w:w="80" w:type="dxa"/>
-          <w:right w:w="110" w:type="dxa"/>
-        </w:tblCellMar>
-        <w:tblLook w:val="04A0" w:firstRow="1" w:lastRow="0" w:firstColumn="1" w:lastColumn="0" w:noHBand="0" w:noVBand="1"/>
-      </w:tblPr>
-      <w:tblGrid>
-        <w:gridCol w:w="10440"/>
-      </w:tblGrid>
-      <w:tr>
-        <w:trPr/>
-        <w:tc>
-          <w:tcPr>
-            <w:tcW w:w="10440" w:type="dxa"/>
-            <w:tcBorders>
-              <w:top w:val="nil" w:sz="4" w:space="0" w:color="BFBFBF"/>
-              <w:left w:val="nil" w:sz="4" w:space="0" w:color="BFBFBF"/>
-              <w:bottom w:val="nil" w:sz="4" w:space="0" w:color="BFBFBF"/>
-              <w:right w:val="single" w:sz="36" w:space="0" w:color="14532D"/>
-            </w:tcBorders>
-            <w:shd w:val="clear" w:color="auto" w:fill="EEF6F1"/>
-            <w:tcMar>
-              <w:top w:w="120" w:type="dxa"/>
-              <w:left w:w="200" w:type="dxa"/>
-              <w:bottom w:w="120" w:type="dxa"/>
-              <w:right w:w="240" w:type="dxa"/>
-            </w:tcMar>
-            <w:vAlign w:val="center"/>
-          </w:tcPr>
-          <w:p>
-            <w:pPr>
-              <w:bidi/>
-              <w:spacing w:before="0" w:after="60" w:line="276" w:lineRule="auto"/>
-            </w:pPr>
-            <w:r>
-              <w:rPr>
-                <w:rFonts w:ascii="Calibri" w:eastAsia="Calibri" w:hAnsi="Calibri" w:cs="Calibri"/>
-                <w:b/>
-                <w:bCs/>
-                <w:color w:val="14532D"/>
-                <w:sz w:val="26"/>
-                <w:szCs w:val="26"/>
-                <w:rtl/>
-              </w:rPr>
-              <w:t xml:space="preserve">تعليمات عامة</w:t>
-            </w:r>
-          </w:p>
-          <w:p>
-            <w:pPr>
-              <w:bidi/>
-              <w:spacing w:before="0" w:after="40" w:line="276" w:lineRule="auto"/>
-            </w:pPr>
-            <w:r>
-              <w:rPr>
-                <w:rFonts w:ascii="Calibri" w:eastAsia="Calibri" w:hAnsi="Calibri" w:cs="Calibri"/>
-                <w:color w:val="1A1A1A"/>
-                <w:sz w:val="24"/>
-                <w:szCs w:val="24"/>
-                <w:rtl/>
-              </w:rPr>
-              <w:t xml:space="preserve">1- اقرأ كل سؤال بتمعّن قبل الإجابة، واكتب إجابتك في المكان المخصّص لها.</w:t>
-            </w:r>
-          </w:p>
-          <w:p>
-            <w:pPr>
-              <w:bidi/>
-              <w:spacing w:before="0" w:after="40" w:line="276" w:lineRule="auto"/>
-            </w:pPr>
-            <w:r>
-              <w:rPr>
-                <w:rFonts w:ascii="Calibri" w:eastAsia="Calibri" w:hAnsi="Calibri" w:cs="Calibri"/>
-                <w:color w:val="1A1A1A"/>
-                <w:sz w:val="24"/>
-                <w:szCs w:val="24"/>
-                <w:rtl/>
-              </w:rPr>
-              <w:t xml:space="preserve">2- العلامة المخصّصة لكل سؤال مكتوبة في الشريط الذهبي بجانبه، وعلامة كل بند بين قوسين.</w:t>
-            </w:r>
-          </w:p>
-          <w:p>
-            <w:pPr>
-              <w:bidi/>
-              <w:spacing w:before="0" w:after="40" w:line="276" w:lineRule="auto"/>
-            </w:pPr>
-            <w:r>
-              <w:rPr>
-                <w:rFonts w:ascii="Calibri" w:eastAsia="Calibri" w:hAnsi="Calibri" w:cs="Calibri"/>
-                <w:color w:val="1A1A1A"/>
-                <w:sz w:val="24"/>
-                <w:szCs w:val="24"/>
-                <w:rtl/>
-              </w:rPr>
-              <w:t xml:space="preserve">3- كل شكل في هذا الامتحان يرافقه إطار أزرق بعنوان «وصف الشكل» يشرح الشكل بالكلمات، ويحتوي على كل المعطيات اللازمة للحل، ليتمكّن الطلاب المكفوفون وضعاف البصر من الإجابة (قراءةً بطريقة برايل أو بقارئ الشاشة أو بقراءة المعلّم).</w:t>
-            </w:r>
-          </w:p>
-        </w:tc>
-      </w:tr>
-    </w:tbl>
     <w:p>
       <w:pPr>
         <w:bidi/>

</xml_diff>

<commit_message>
Remove marks distribution table and end-of-exam line
Co-Authored-By: Claude Opus 5.5 <noreply@anthropic.com>
Claude-Session: https://claude.ai/code/session_01PHgZqhLAeFoDhbHXzt9YLK
</commit_message>
<xml_diff>
--- a/exams/امتحان-رياضيات-السابع-مع-المثلثات.docx
+++ b/exams/امتحان-رياضيات-السابع-مع-المثلثات.docx
@@ -312,822 +312,6 @@
     </w:p>
     <w:p>
       <w:pPr>
-        <w:keepNext/>
-        <w:bidi/>
-        <w:spacing w:before="0" w:after="60" w:line="276" w:lineRule="auto"/>
-      </w:pPr>
-      <w:r>
-        <w:rPr>
-          <w:rFonts w:ascii="Calibri" w:eastAsia="Calibri" w:hAnsi="Calibri" w:cs="Calibri"/>
-          <w:b/>
-          <w:bCs/>
-          <w:color w:val="14532D"/>
-          <w:sz w:val="26"/>
-          <w:szCs w:val="26"/>
-          <w:rtl/>
-        </w:rPr>
-        <w:t xml:space="preserve">جدول توزيع العلامات</w:t>
-      </w:r>
-    </w:p>
-    <w:tbl>
-      <w:tblPr>
-        <w:bidiVisual/>
-        <w:tblW w:w="10440" w:type="dxa"/>
-        <w:jc w:val="center"/>
-        <w:tblBorders>
-          <w:top w:val="single" w:sz="6" w:space="0" w:color="A7C4B2"/>
-          <w:left w:val="single" w:sz="6" w:space="0" w:color="A7C4B2"/>
-          <w:bottom w:val="single" w:sz="6" w:space="0" w:color="A7C4B2"/>
-          <w:right w:val="single" w:sz="6" w:space="0" w:color="A7C4B2"/>
-          <w:insideH w:val="single" w:sz="6" w:space="0" w:color="A7C4B2"/>
-          <w:insideV w:val="single" w:sz="6" w:space="0" w:color="A7C4B2"/>
-        </w:tblBorders>
-        <w:tblLayout w:type="fixed"/>
-        <w:tblCellMar>
-          <w:top w:w="80" w:type="dxa"/>
-          <w:left w:w="110" w:type="dxa"/>
-          <w:bottom w:w="80" w:type="dxa"/>
-          <w:right w:w="110" w:type="dxa"/>
-        </w:tblCellMar>
-        <w:tblLook w:val="04A0" w:firstRow="1" w:lastRow="0" w:firstColumn="1" w:lastColumn="0" w:noHBand="0" w:noVBand="1"/>
-      </w:tblPr>
-      <w:tblGrid>
-        <w:gridCol w:w="1640"/>
-        <w:gridCol w:w="880"/>
-        <w:gridCol w:w="880"/>
-        <w:gridCol w:w="880"/>
-        <w:gridCol w:w="880"/>
-        <w:gridCol w:w="880"/>
-        <w:gridCol w:w="880"/>
-        <w:gridCol w:w="880"/>
-        <w:gridCol w:w="880"/>
-        <w:gridCol w:w="1760"/>
-      </w:tblGrid>
-      <w:tr>
-        <w:trPr>
-          <w:cantSplit/>
-          <w:trHeight w:val="420"/>
-          <w:tblHeader/>
-        </w:trPr>
-        <w:tc>
-          <w:tcPr>
-            <w:tcW w:w="1640" w:type="dxa"/>
-            <w:shd w:val="clear" w:color="auto" w:fill="14532D"/>
-            <w:vAlign w:val="center"/>
-          </w:tcPr>
-          <w:p>
-            <w:pPr>
-              <w:bidi/>
-              <w:spacing w:before="0" w:after="0" w:line="276" w:lineRule="auto"/>
-              <w:jc w:val="center"/>
-            </w:pPr>
-            <w:r>
-              <w:rPr>
-                <w:rFonts w:ascii="Calibri" w:eastAsia="Calibri" w:hAnsi="Calibri" w:cs="Calibri"/>
-                <w:b/>
-                <w:bCs/>
-                <w:color w:val="FFFFFF"/>
-                <w:sz w:val="22"/>
-                <w:szCs w:val="22"/>
-                <w:rtl/>
-              </w:rPr>
-              <w:t xml:space="preserve">السؤال</w:t>
-            </w:r>
-          </w:p>
-        </w:tc>
-        <w:tc>
-          <w:tcPr>
-            <w:tcW w:w="880" w:type="dxa"/>
-            <w:shd w:val="clear" w:color="auto" w:fill="14532D"/>
-            <w:vAlign w:val="center"/>
-          </w:tcPr>
-          <w:p>
-            <w:pPr>
-              <w:bidi/>
-              <w:spacing w:before="0" w:after="0" w:line="276" w:lineRule="auto"/>
-              <w:jc w:val="center"/>
-            </w:pPr>
-            <w:r>
-              <w:rPr>
-                <w:rFonts w:ascii="Calibri" w:eastAsia="Calibri" w:hAnsi="Calibri" w:cs="Calibri"/>
-                <w:b/>
-                <w:bCs/>
-                <w:color w:val="FFFFFF"/>
-                <w:sz w:val="24"/>
-                <w:szCs w:val="24"/>
-                <w:rtl/>
-              </w:rPr>
-              <w:t xml:space="preserve">س1</w:t>
-            </w:r>
-          </w:p>
-        </w:tc>
-        <w:tc>
-          <w:tcPr>
-            <w:tcW w:w="880" w:type="dxa"/>
-            <w:shd w:val="clear" w:color="auto" w:fill="14532D"/>
-            <w:vAlign w:val="center"/>
-          </w:tcPr>
-          <w:p>
-            <w:pPr>
-              <w:bidi/>
-              <w:spacing w:before="0" w:after="0" w:line="276" w:lineRule="auto"/>
-              <w:jc w:val="center"/>
-            </w:pPr>
-            <w:r>
-              <w:rPr>
-                <w:rFonts w:ascii="Calibri" w:eastAsia="Calibri" w:hAnsi="Calibri" w:cs="Calibri"/>
-                <w:b/>
-                <w:bCs/>
-                <w:color w:val="FFFFFF"/>
-                <w:sz w:val="24"/>
-                <w:szCs w:val="24"/>
-                <w:rtl/>
-              </w:rPr>
-              <w:t xml:space="preserve">س2</w:t>
-            </w:r>
-          </w:p>
-        </w:tc>
-        <w:tc>
-          <w:tcPr>
-            <w:tcW w:w="880" w:type="dxa"/>
-            <w:shd w:val="clear" w:color="auto" w:fill="14532D"/>
-            <w:vAlign w:val="center"/>
-          </w:tcPr>
-          <w:p>
-            <w:pPr>
-              <w:bidi/>
-              <w:spacing w:before="0" w:after="0" w:line="276" w:lineRule="auto"/>
-              <w:jc w:val="center"/>
-            </w:pPr>
-            <w:r>
-              <w:rPr>
-                <w:rFonts w:ascii="Calibri" w:eastAsia="Calibri" w:hAnsi="Calibri" w:cs="Calibri"/>
-                <w:b/>
-                <w:bCs/>
-                <w:color w:val="FFFFFF"/>
-                <w:sz w:val="24"/>
-                <w:szCs w:val="24"/>
-                <w:rtl/>
-              </w:rPr>
-              <w:t xml:space="preserve">س3</w:t>
-            </w:r>
-          </w:p>
-        </w:tc>
-        <w:tc>
-          <w:tcPr>
-            <w:tcW w:w="880" w:type="dxa"/>
-            <w:shd w:val="clear" w:color="auto" w:fill="14532D"/>
-            <w:vAlign w:val="center"/>
-          </w:tcPr>
-          <w:p>
-            <w:pPr>
-              <w:bidi/>
-              <w:spacing w:before="0" w:after="0" w:line="276" w:lineRule="auto"/>
-              <w:jc w:val="center"/>
-            </w:pPr>
-            <w:r>
-              <w:rPr>
-                <w:rFonts w:ascii="Calibri" w:eastAsia="Calibri" w:hAnsi="Calibri" w:cs="Calibri"/>
-                <w:b/>
-                <w:bCs/>
-                <w:color w:val="FFFFFF"/>
-                <w:sz w:val="24"/>
-                <w:szCs w:val="24"/>
-                <w:rtl/>
-              </w:rPr>
-              <w:t xml:space="preserve">س4</w:t>
-            </w:r>
-          </w:p>
-        </w:tc>
-        <w:tc>
-          <w:tcPr>
-            <w:tcW w:w="880" w:type="dxa"/>
-            <w:shd w:val="clear" w:color="auto" w:fill="14532D"/>
-            <w:vAlign w:val="center"/>
-          </w:tcPr>
-          <w:p>
-            <w:pPr>
-              <w:bidi/>
-              <w:spacing w:before="0" w:after="0" w:line="276" w:lineRule="auto"/>
-              <w:jc w:val="center"/>
-            </w:pPr>
-            <w:r>
-              <w:rPr>
-                <w:rFonts w:ascii="Calibri" w:eastAsia="Calibri" w:hAnsi="Calibri" w:cs="Calibri"/>
-                <w:b/>
-                <w:bCs/>
-                <w:color w:val="FFFFFF"/>
-                <w:sz w:val="24"/>
-                <w:szCs w:val="24"/>
-                <w:rtl/>
-              </w:rPr>
-              <w:t xml:space="preserve">س5</w:t>
-            </w:r>
-          </w:p>
-        </w:tc>
-        <w:tc>
-          <w:tcPr>
-            <w:tcW w:w="880" w:type="dxa"/>
-            <w:shd w:val="clear" w:color="auto" w:fill="14532D"/>
-            <w:vAlign w:val="center"/>
-          </w:tcPr>
-          <w:p>
-            <w:pPr>
-              <w:bidi/>
-              <w:spacing w:before="0" w:after="0" w:line="276" w:lineRule="auto"/>
-              <w:jc w:val="center"/>
-            </w:pPr>
-            <w:r>
-              <w:rPr>
-                <w:rFonts w:ascii="Calibri" w:eastAsia="Calibri" w:hAnsi="Calibri" w:cs="Calibri"/>
-                <w:b/>
-                <w:bCs/>
-                <w:color w:val="FFFFFF"/>
-                <w:sz w:val="24"/>
-                <w:szCs w:val="24"/>
-                <w:rtl/>
-              </w:rPr>
-              <w:t xml:space="preserve">س6</w:t>
-            </w:r>
-          </w:p>
-        </w:tc>
-        <w:tc>
-          <w:tcPr>
-            <w:tcW w:w="880" w:type="dxa"/>
-            <w:shd w:val="clear" w:color="auto" w:fill="14532D"/>
-            <w:vAlign w:val="center"/>
-          </w:tcPr>
-          <w:p>
-            <w:pPr>
-              <w:bidi/>
-              <w:spacing w:before="0" w:after="0" w:line="276" w:lineRule="auto"/>
-              <w:jc w:val="center"/>
-            </w:pPr>
-            <w:r>
-              <w:rPr>
-                <w:rFonts w:ascii="Calibri" w:eastAsia="Calibri" w:hAnsi="Calibri" w:cs="Calibri"/>
-                <w:b/>
-                <w:bCs/>
-                <w:color w:val="FFFFFF"/>
-                <w:sz w:val="24"/>
-                <w:szCs w:val="24"/>
-                <w:rtl/>
-              </w:rPr>
-              <w:t xml:space="preserve">س7</w:t>
-            </w:r>
-          </w:p>
-        </w:tc>
-        <w:tc>
-          <w:tcPr>
-            <w:tcW w:w="880" w:type="dxa"/>
-            <w:shd w:val="clear" w:color="auto" w:fill="14532D"/>
-            <w:vAlign w:val="center"/>
-          </w:tcPr>
-          <w:p>
-            <w:pPr>
-              <w:bidi/>
-              <w:spacing w:before="0" w:after="0" w:line="276" w:lineRule="auto"/>
-              <w:jc w:val="center"/>
-            </w:pPr>
-            <w:r>
-              <w:rPr>
-                <w:rFonts w:ascii="Calibri" w:eastAsia="Calibri" w:hAnsi="Calibri" w:cs="Calibri"/>
-                <w:b/>
-                <w:bCs/>
-                <w:color w:val="FFFFFF"/>
-                <w:sz w:val="24"/>
-                <w:szCs w:val="24"/>
-                <w:rtl/>
-              </w:rPr>
-              <w:t xml:space="preserve">س8</w:t>
-            </w:r>
-          </w:p>
-        </w:tc>
-        <w:tc>
-          <w:tcPr>
-            <w:tcW w:w="1760" w:type="dxa"/>
-            <w:shd w:val="clear" w:color="auto" w:fill="B8860B"/>
-            <w:vAlign w:val="center"/>
-          </w:tcPr>
-          <w:p>
-            <w:pPr>
-              <w:bidi/>
-              <w:spacing w:before="0" w:after="0" w:line="276" w:lineRule="auto"/>
-              <w:jc w:val="center"/>
-            </w:pPr>
-            <w:r>
-              <w:rPr>
-                <w:rFonts w:ascii="Calibri" w:eastAsia="Calibri" w:hAnsi="Calibri" w:cs="Calibri"/>
-                <w:b/>
-                <w:bCs/>
-                <w:color w:val="FFFFFF"/>
-                <w:sz w:val="22"/>
-                <w:szCs w:val="22"/>
-                <w:rtl/>
-              </w:rPr>
-              <w:t xml:space="preserve">المجموع</w:t>
-            </w:r>
-          </w:p>
-        </w:tc>
-      </w:tr>
-      <w:tr>
-        <w:trPr>
-          <w:cantSplit/>
-          <w:trHeight w:val="420"/>
-        </w:trPr>
-        <w:tc>
-          <w:tcPr>
-            <w:tcW w:w="1640" w:type="dxa"/>
-            <w:shd w:val="clear" w:color="auto" w:fill="EEF6F1"/>
-            <w:vAlign w:val="center"/>
-          </w:tcPr>
-          <w:p>
-            <w:pPr>
-              <w:bidi/>
-              <w:spacing w:before="0" w:after="0" w:line="276" w:lineRule="auto"/>
-              <w:jc w:val="center"/>
-            </w:pPr>
-            <w:r>
-              <w:rPr>
-                <w:rFonts w:ascii="Calibri" w:eastAsia="Calibri" w:hAnsi="Calibri" w:cs="Calibri"/>
-                <w:b/>
-                <w:bCs/>
-                <w:color w:val="14532D"/>
-                <w:sz w:val="22"/>
-                <w:szCs w:val="22"/>
-                <w:rtl/>
-              </w:rPr>
-              <w:t xml:space="preserve">العلامة القصوى</w:t>
-            </w:r>
-          </w:p>
-        </w:tc>
-        <w:tc>
-          <w:tcPr>
-            <w:tcW w:w="880" w:type="dxa"/>
-            <w:vAlign w:val="center"/>
-          </w:tcPr>
-          <w:p>
-            <w:pPr>
-              <w:bidi/>
-              <w:spacing w:before="0" w:after="0" w:line="276" w:lineRule="auto"/>
-              <w:jc w:val="center"/>
-            </w:pPr>
-            <w:r>
-              <w:rPr>
-                <w:rFonts w:ascii="Calibri" w:eastAsia="Calibri" w:hAnsi="Calibri" w:cs="Calibri"/>
-                <w:b/>
-                <w:bCs/>
-                <w:color w:val="1A1A1A"/>
-                <w:sz w:val="26"/>
-                <w:szCs w:val="26"/>
-                <w:rtl/>
-              </w:rPr>
-              <w:t xml:space="preserve">3</w:t>
-            </w:r>
-          </w:p>
-        </w:tc>
-        <w:tc>
-          <w:tcPr>
-            <w:tcW w:w="880" w:type="dxa"/>
-            <w:vAlign w:val="center"/>
-          </w:tcPr>
-          <w:p>
-            <w:pPr>
-              <w:bidi/>
-              <w:spacing w:before="0" w:after="0" w:line="276" w:lineRule="auto"/>
-              <w:jc w:val="center"/>
-            </w:pPr>
-            <w:r>
-              <w:rPr>
-                <w:rFonts w:ascii="Calibri" w:eastAsia="Calibri" w:hAnsi="Calibri" w:cs="Calibri"/>
-                <w:b/>
-                <w:bCs/>
-                <w:color w:val="1A1A1A"/>
-                <w:sz w:val="26"/>
-                <w:szCs w:val="26"/>
-                <w:rtl/>
-              </w:rPr>
-              <w:t xml:space="preserve">1.5</w:t>
-            </w:r>
-          </w:p>
-        </w:tc>
-        <w:tc>
-          <w:tcPr>
-            <w:tcW w:w="880" w:type="dxa"/>
-            <w:vAlign w:val="center"/>
-          </w:tcPr>
-          <w:p>
-            <w:pPr>
-              <w:bidi/>
-              <w:spacing w:before="0" w:after="0" w:line="276" w:lineRule="auto"/>
-              <w:jc w:val="center"/>
-            </w:pPr>
-            <w:r>
-              <w:rPr>
-                <w:rFonts w:ascii="Calibri" w:eastAsia="Calibri" w:hAnsi="Calibri" w:cs="Calibri"/>
-                <w:b/>
-                <w:bCs/>
-                <w:color w:val="1A1A1A"/>
-                <w:sz w:val="26"/>
-                <w:szCs w:val="26"/>
-                <w:rtl/>
-              </w:rPr>
-              <w:t xml:space="preserve">2</w:t>
-            </w:r>
-          </w:p>
-        </w:tc>
-        <w:tc>
-          <w:tcPr>
-            <w:tcW w:w="880" w:type="dxa"/>
-            <w:vAlign w:val="center"/>
-          </w:tcPr>
-          <w:p>
-            <w:pPr>
-              <w:bidi/>
-              <w:spacing w:before="0" w:after="0" w:line="276" w:lineRule="auto"/>
-              <w:jc w:val="center"/>
-            </w:pPr>
-            <w:r>
-              <w:rPr>
-                <w:rFonts w:ascii="Calibri" w:eastAsia="Calibri" w:hAnsi="Calibri" w:cs="Calibri"/>
-                <w:b/>
-                <w:bCs/>
-                <w:color w:val="1A1A1A"/>
-                <w:sz w:val="26"/>
-                <w:szCs w:val="26"/>
-                <w:rtl/>
-              </w:rPr>
-              <w:t xml:space="preserve">1</w:t>
-            </w:r>
-          </w:p>
-        </w:tc>
-        <w:tc>
-          <w:tcPr>
-            <w:tcW w:w="880" w:type="dxa"/>
-            <w:vAlign w:val="center"/>
-          </w:tcPr>
-          <w:p>
-            <w:pPr>
-              <w:bidi/>
-              <w:spacing w:before="0" w:after="0" w:line="276" w:lineRule="auto"/>
-              <w:jc w:val="center"/>
-            </w:pPr>
-            <w:r>
-              <w:rPr>
-                <w:rFonts w:ascii="Calibri" w:eastAsia="Calibri" w:hAnsi="Calibri" w:cs="Calibri"/>
-                <w:b/>
-                <w:bCs/>
-                <w:color w:val="1A1A1A"/>
-                <w:sz w:val="26"/>
-                <w:szCs w:val="26"/>
-                <w:rtl/>
-              </w:rPr>
-              <w:t xml:space="preserve">2</w:t>
-            </w:r>
-          </w:p>
-        </w:tc>
-        <w:tc>
-          <w:tcPr>
-            <w:tcW w:w="880" w:type="dxa"/>
-            <w:vAlign w:val="center"/>
-          </w:tcPr>
-          <w:p>
-            <w:pPr>
-              <w:bidi/>
-              <w:spacing w:before="0" w:after="0" w:line="276" w:lineRule="auto"/>
-              <w:jc w:val="center"/>
-            </w:pPr>
-            <w:r>
-              <w:rPr>
-                <w:rFonts w:ascii="Calibri" w:eastAsia="Calibri" w:hAnsi="Calibri" w:cs="Calibri"/>
-                <w:b/>
-                <w:bCs/>
-                <w:color w:val="1A1A1A"/>
-                <w:sz w:val="26"/>
-                <w:szCs w:val="26"/>
-                <w:rtl/>
-              </w:rPr>
-              <w:t xml:space="preserve">2</w:t>
-            </w:r>
-          </w:p>
-        </w:tc>
-        <w:tc>
-          <w:tcPr>
-            <w:tcW w:w="880" w:type="dxa"/>
-            <w:vAlign w:val="center"/>
-          </w:tcPr>
-          <w:p>
-            <w:pPr>
-              <w:bidi/>
-              <w:spacing w:before="0" w:after="0" w:line="276" w:lineRule="auto"/>
-              <w:jc w:val="center"/>
-            </w:pPr>
-            <w:r>
-              <w:rPr>
-                <w:rFonts w:ascii="Calibri" w:eastAsia="Calibri" w:hAnsi="Calibri" w:cs="Calibri"/>
-                <w:b/>
-                <w:bCs/>
-                <w:color w:val="1A1A1A"/>
-                <w:sz w:val="26"/>
-                <w:szCs w:val="26"/>
-                <w:rtl/>
-              </w:rPr>
-              <w:t xml:space="preserve">5</w:t>
-            </w:r>
-          </w:p>
-        </w:tc>
-        <w:tc>
-          <w:tcPr>
-            <w:tcW w:w="880" w:type="dxa"/>
-            <w:vAlign w:val="center"/>
-          </w:tcPr>
-          <w:p>
-            <w:pPr>
-              <w:bidi/>
-              <w:spacing w:before="0" w:after="0" w:line="276" w:lineRule="auto"/>
-              <w:jc w:val="center"/>
-            </w:pPr>
-            <w:r>
-              <w:rPr>
-                <w:rFonts w:ascii="Calibri" w:eastAsia="Calibri" w:hAnsi="Calibri" w:cs="Calibri"/>
-                <w:b/>
-                <w:bCs/>
-                <w:color w:val="1A1A1A"/>
-                <w:sz w:val="26"/>
-                <w:szCs w:val="26"/>
-                <w:rtl/>
-              </w:rPr>
-              <w:t xml:space="preserve">3.5</w:t>
-            </w:r>
-          </w:p>
-        </w:tc>
-        <w:tc>
-          <w:tcPr>
-            <w:tcW w:w="1760" w:type="dxa"/>
-            <w:shd w:val="clear" w:color="auto" w:fill="F6E9C6"/>
-            <w:vAlign w:val="center"/>
-          </w:tcPr>
-          <w:p>
-            <w:pPr>
-              <w:bidi/>
-              <w:spacing w:before="0" w:after="0" w:line="276" w:lineRule="auto"/>
-              <w:jc w:val="center"/>
-            </w:pPr>
-            <w:r>
-              <w:rPr>
-                <w:rFonts w:ascii="Calibri" w:eastAsia="Calibri" w:hAnsi="Calibri" w:cs="Calibri"/>
-                <w:b/>
-                <w:bCs/>
-                <w:color w:val="B8860B"/>
-                <w:sz w:val="28"/>
-                <w:szCs w:val="28"/>
-                <w:rtl/>
-              </w:rPr>
-              <w:t xml:space="preserve">20</w:t>
-            </w:r>
-          </w:p>
-        </w:tc>
-      </w:tr>
-      <w:tr>
-        <w:trPr>
-          <w:cantSplit/>
-          <w:trHeight w:val="480"/>
-        </w:trPr>
-        <w:tc>
-          <w:tcPr>
-            <w:tcW w:w="1640" w:type="dxa"/>
-            <w:shd w:val="clear" w:color="auto" w:fill="EEF6F1"/>
-            <w:vAlign w:val="center"/>
-          </w:tcPr>
-          <w:p>
-            <w:pPr>
-              <w:bidi/>
-              <w:spacing w:before="0" w:after="0" w:line="276" w:lineRule="auto"/>
-              <w:jc w:val="center"/>
-            </w:pPr>
-            <w:r>
-              <w:rPr>
-                <w:rFonts w:ascii="Calibri" w:eastAsia="Calibri" w:hAnsi="Calibri" w:cs="Calibri"/>
-                <w:b/>
-                <w:bCs/>
-                <w:color w:val="14532D"/>
-                <w:sz w:val="22"/>
-                <w:szCs w:val="22"/>
-                <w:rtl/>
-              </w:rPr>
-              <w:t xml:space="preserve">علامة الطالب</w:t>
-            </w:r>
-          </w:p>
-        </w:tc>
-        <w:tc>
-          <w:tcPr>
-            <w:tcW w:w="880" w:type="dxa"/>
-            <w:vAlign w:val="center"/>
-          </w:tcPr>
-          <w:p>
-            <w:pPr>
-              <w:bidi/>
-              <w:spacing w:before="0" w:after="100" w:line="276" w:lineRule="auto"/>
-            </w:pPr>
-            <w:r>
-              <w:rPr>
-                <w:rFonts w:ascii="Calibri" w:eastAsia="Calibri" w:hAnsi="Calibri" w:cs="Calibri"/>
-                <w:color w:val="1A1A1A"/>
-                <w:sz w:val="28"/>
-                <w:szCs w:val="28"/>
-                <w:rtl/>
-              </w:rPr>
-              <w:t xml:space="preserve"/>
-            </w:r>
-          </w:p>
-        </w:tc>
-        <w:tc>
-          <w:tcPr>
-            <w:tcW w:w="880" w:type="dxa"/>
-            <w:vAlign w:val="center"/>
-          </w:tcPr>
-          <w:p>
-            <w:pPr>
-              <w:bidi/>
-              <w:spacing w:before="0" w:after="100" w:line="276" w:lineRule="auto"/>
-            </w:pPr>
-            <w:r>
-              <w:rPr>
-                <w:rFonts w:ascii="Calibri" w:eastAsia="Calibri" w:hAnsi="Calibri" w:cs="Calibri"/>
-                <w:color w:val="1A1A1A"/>
-                <w:sz w:val="28"/>
-                <w:szCs w:val="28"/>
-                <w:rtl/>
-              </w:rPr>
-              <w:t xml:space="preserve"/>
-            </w:r>
-          </w:p>
-        </w:tc>
-        <w:tc>
-          <w:tcPr>
-            <w:tcW w:w="880" w:type="dxa"/>
-            <w:vAlign w:val="center"/>
-          </w:tcPr>
-          <w:p>
-            <w:pPr>
-              <w:bidi/>
-              <w:spacing w:before="0" w:after="100" w:line="276" w:lineRule="auto"/>
-            </w:pPr>
-            <w:r>
-              <w:rPr>
-                <w:rFonts w:ascii="Calibri" w:eastAsia="Calibri" w:hAnsi="Calibri" w:cs="Calibri"/>
-                <w:color w:val="1A1A1A"/>
-                <w:sz w:val="28"/>
-                <w:szCs w:val="28"/>
-                <w:rtl/>
-              </w:rPr>
-              <w:t xml:space="preserve"/>
-            </w:r>
-          </w:p>
-        </w:tc>
-        <w:tc>
-          <w:tcPr>
-            <w:tcW w:w="880" w:type="dxa"/>
-            <w:vAlign w:val="center"/>
-          </w:tcPr>
-          <w:p>
-            <w:pPr>
-              <w:bidi/>
-              <w:spacing w:before="0" w:after="100" w:line="276" w:lineRule="auto"/>
-            </w:pPr>
-            <w:r>
-              <w:rPr>
-                <w:rFonts w:ascii="Calibri" w:eastAsia="Calibri" w:hAnsi="Calibri" w:cs="Calibri"/>
-                <w:color w:val="1A1A1A"/>
-                <w:sz w:val="28"/>
-                <w:szCs w:val="28"/>
-                <w:rtl/>
-              </w:rPr>
-              <w:t xml:space="preserve"/>
-            </w:r>
-          </w:p>
-        </w:tc>
-        <w:tc>
-          <w:tcPr>
-            <w:tcW w:w="880" w:type="dxa"/>
-            <w:vAlign w:val="center"/>
-          </w:tcPr>
-          <w:p>
-            <w:pPr>
-              <w:bidi/>
-              <w:spacing w:before="0" w:after="100" w:line="276" w:lineRule="auto"/>
-            </w:pPr>
-            <w:r>
-              <w:rPr>
-                <w:rFonts w:ascii="Calibri" w:eastAsia="Calibri" w:hAnsi="Calibri" w:cs="Calibri"/>
-                <w:color w:val="1A1A1A"/>
-                <w:sz w:val="28"/>
-                <w:szCs w:val="28"/>
-                <w:rtl/>
-              </w:rPr>
-              <w:t xml:space="preserve"/>
-            </w:r>
-          </w:p>
-        </w:tc>
-        <w:tc>
-          <w:tcPr>
-            <w:tcW w:w="880" w:type="dxa"/>
-            <w:vAlign w:val="center"/>
-          </w:tcPr>
-          <w:p>
-            <w:pPr>
-              <w:bidi/>
-              <w:spacing w:before="0" w:after="100" w:line="276" w:lineRule="auto"/>
-            </w:pPr>
-            <w:r>
-              <w:rPr>
-                <w:rFonts w:ascii="Calibri" w:eastAsia="Calibri" w:hAnsi="Calibri" w:cs="Calibri"/>
-                <w:color w:val="1A1A1A"/>
-                <w:sz w:val="28"/>
-                <w:szCs w:val="28"/>
-                <w:rtl/>
-              </w:rPr>
-              <w:t xml:space="preserve"/>
-            </w:r>
-          </w:p>
-        </w:tc>
-        <w:tc>
-          <w:tcPr>
-            <w:tcW w:w="880" w:type="dxa"/>
-            <w:vAlign w:val="center"/>
-          </w:tcPr>
-          <w:p>
-            <w:pPr>
-              <w:bidi/>
-              <w:spacing w:before="0" w:after="100" w:line="276" w:lineRule="auto"/>
-            </w:pPr>
-            <w:r>
-              <w:rPr>
-                <w:rFonts w:ascii="Calibri" w:eastAsia="Calibri" w:hAnsi="Calibri" w:cs="Calibri"/>
-                <w:color w:val="1A1A1A"/>
-                <w:sz w:val="28"/>
-                <w:szCs w:val="28"/>
-                <w:rtl/>
-              </w:rPr>
-              <w:t xml:space="preserve"/>
-            </w:r>
-          </w:p>
-        </w:tc>
-        <w:tc>
-          <w:tcPr>
-            <w:tcW w:w="880" w:type="dxa"/>
-            <w:vAlign w:val="center"/>
-          </w:tcPr>
-          <w:p>
-            <w:pPr>
-              <w:bidi/>
-              <w:spacing w:before="0" w:after="100" w:line="276" w:lineRule="auto"/>
-            </w:pPr>
-            <w:r>
-              <w:rPr>
-                <w:rFonts w:ascii="Calibri" w:eastAsia="Calibri" w:hAnsi="Calibri" w:cs="Calibri"/>
-                <w:color w:val="1A1A1A"/>
-                <w:sz w:val="28"/>
-                <w:szCs w:val="28"/>
-                <w:rtl/>
-              </w:rPr>
-              <w:t xml:space="preserve"/>
-            </w:r>
-          </w:p>
-        </w:tc>
-        <w:tc>
-          <w:tcPr>
-            <w:tcW w:w="1760" w:type="dxa"/>
-            <w:shd w:val="clear" w:color="auto" w:fill="F6E9C6"/>
-            <w:vAlign w:val="center"/>
-          </w:tcPr>
-          <w:p>
-            <w:pPr>
-              <w:bidi/>
-              <w:spacing w:before="0" w:after="100" w:line="276" w:lineRule="auto"/>
-            </w:pPr>
-            <w:r>
-              <w:rPr>
-                <w:rFonts w:ascii="Calibri" w:eastAsia="Calibri" w:hAnsi="Calibri" w:cs="Calibri"/>
-                <w:color w:val="1A1A1A"/>
-                <w:sz w:val="28"/>
-                <w:szCs w:val="28"/>
-                <w:rtl/>
-              </w:rPr>
-              <w:t xml:space="preserve"/>
-            </w:r>
-          </w:p>
-        </w:tc>
-      </w:tr>
-    </w:tbl>
-    <w:p>
-      <w:pPr>
-        <w:bidi/>
-        <w:spacing w:before="0" w:after="0" w:line="160" w:lineRule="exact"/>
-      </w:pPr>
-    </w:p>
-    <w:p>
-      <w:pPr>
         <w:bidi/>
         <w:spacing w:before="0" w:after="0" w:line="200" w:lineRule="exact"/>
       </w:pPr>
@@ -5404,25 +4588,6 @@
         <w:bidi/>
         <w:spacing w:before="0" w:after="0" w:line="240" w:lineRule="exact"/>
       </w:pPr>
-    </w:p>
-    <w:p>
-      <w:pPr>
-        <w:bidi/>
-        <w:spacing w:before="0" w:after="60" w:line="276" w:lineRule="auto"/>
-        <w:jc w:val="center"/>
-      </w:pPr>
-      <w:r>
-        <w:rPr>
-          <w:rFonts w:ascii="Calibri" w:eastAsia="Calibri" w:hAnsi="Calibri" w:cs="Calibri"/>
-          <w:b/>
-          <w:bCs/>
-          <w:color w:val="14532D"/>
-          <w:sz w:val="26"/>
-          <w:szCs w:val="26"/>
-          <w:rtl/>
-        </w:rPr>
-        <w:t xml:space="preserve">— انتهت الأسئلة —</w:t>
-      </w:r>
     </w:p>
     <w:p>
       <w:pPr>

</xml_diff>

<commit_message>
Shorten triangles question and set its font to 18pt
Co-Authored-By: Claude Opus 5.5 <noreply@anthropic.com>
Claude-Session: https://claude.ai/code/session_01PHgZqhLAeFoDhbHXzt9YLK
</commit_message>
<xml_diff>
--- a/exams/امتحان-رياضيات-السابع-مع-المثلثات.docx
+++ b/exams/امتحان-رياضيات-السابع-مع-المثلثات.docx
@@ -2396,7 +2396,7 @@
                 <w:szCs w:val="32"/>
                 <w:rtl/>
               </w:rPr>
-              <w:t xml:space="preserve">السؤال السابع: المثلثات – أنواعها وحساب زواياها</w:t>
+              <w:t xml:space="preserve">السؤال السابع: المثلثات</w:t>
             </w:r>
           </w:p>
         </w:tc>
@@ -2439,7 +2439,7 @@
       <w:pPr>
         <w:keepNext/>
         <w:bidi/>
-        <w:spacing w:before="0" w:after="40" w:line="276" w:lineRule="auto"/>
+        <w:spacing w:before="0" w:after="60" w:line="276" w:lineRule="auto"/>
       </w:pPr>
       <w:r>
         <w:rPr>
@@ -2447,8 +2447,8 @@
           <w:b/>
           <w:bCs/>
           <w:color w:val="14532D"/>
-          <w:sz w:val="28"/>
-          <w:szCs w:val="28"/>
+          <w:sz w:val="36"/>
+          <w:szCs w:val="36"/>
           <w:rtl/>
         </w:rPr>
         <w:t xml:space="preserve">أ) </w:t>
@@ -2459,11 +2459,11 @@
           <w:b/>
           <w:bCs/>
           <w:color w:val="1A1A1A"/>
-          <w:sz w:val="28"/>
-          <w:szCs w:val="28"/>
-          <w:rtl/>
-        </w:rPr>
-        <w:t xml:space="preserve">صنّف كل مثلث من المثلثات الأربعة التالية:</w:t>
+          <w:sz w:val="36"/>
+          <w:szCs w:val="36"/>
+          <w:rtl/>
+        </w:rPr>
+        <w:t xml:space="preserve">صنّف كل مثلث حسب أضلاعه وحسب زواياه.</w:t>
       </w:r>
       <w:r>
         <w:rPr>
@@ -2475,41 +2475,7 @@
           <w:szCs w:val="22"/>
           <w:rtl/>
         </w:rPr>
-        <w:t xml:space="preserve">   (علامتان)</w:t>
-      </w:r>
-    </w:p>
-    <w:p>
-      <w:pPr>
-        <w:keepNext/>
-        <w:bidi/>
-        <w:spacing w:before="0" w:after="20" w:line="276" w:lineRule="auto"/>
-      </w:pPr>
-      <w:r>
-        <w:rPr>
-          <w:rFonts w:ascii="Calibri" w:eastAsia="Calibri" w:hAnsi="Calibri" w:cs="Calibri"/>
-          <w:color w:val="1A1A1A"/>
-          <w:sz w:val="26"/>
-          <w:szCs w:val="26"/>
-          <w:rtl/>
-        </w:rPr>
-        <w:t xml:space="preserve">• حسب أضلاعه: متساوي الأضلاع – متساوي الساقين – مختلف الأضلاع.</w:t>
-      </w:r>
-    </w:p>
-    <w:p>
-      <w:pPr>
-        <w:keepNext/>
-        <w:bidi/>
-        <w:spacing w:before="0" w:after="60" w:line="276" w:lineRule="auto"/>
-      </w:pPr>
-      <w:r>
-        <w:rPr>
-          <w:rFonts w:ascii="Calibri" w:eastAsia="Calibri" w:hAnsi="Calibri" w:cs="Calibri"/>
-          <w:color w:val="1A1A1A"/>
-          <w:sz w:val="26"/>
-          <w:szCs w:val="26"/>
-          <w:rtl/>
-        </w:rPr>
-        <w:t xml:space="preserve">• حسب زواياه: حادّ الزوايا – قائم الزاوية – منفرج الزاوية.</w:t>
+        <w:t xml:space="preserve">   (3 علامات)</w:t>
       </w:r>
     </w:p>
     <w:p>
@@ -2522,9 +2488,9 @@
       <w:r>
         <w:drawing>
           <wp:inline distT="0" distB="0" distL="0" distR="0">
-            <wp:extent cx="5943600" cy="1835500"/>
+            <wp:extent cx="4754880" cy="1957900"/>
             <wp:effectExtent l="0" t="0" r="0" b="0"/>
-            <wp:docPr id="9001" name="tri_types" descr="أربعة مثلثات مرقمة من 1 إلى 4 لتصنيفها حسب الأضلاع والزوايا"/>
+            <wp:docPr id="9001" name="tri_types" descr="ثلاثة مثلثات مرقمة من 1 إلى 3 لتصنيفها"/>
             <wp:cNvGraphicFramePr>
               <a:graphicFrameLocks xmlns:a="http://schemas.openxmlformats.org/drawingml/2006/main" noChangeAspect="1"/>
             </wp:cNvGraphicFramePr>
@@ -2532,7 +2498,7 @@
               <a:graphicData uri="http://schemas.openxmlformats.org/drawingml/2006/picture">
                 <pic:pic xmlns:pic="http://schemas.openxmlformats.org/drawingml/2006/picture">
                   <pic:nvPicPr>
-                    <pic:cNvPr id="9001" name="tri_types" descr="أربعة مثلثات مرقمة من 1 إلى 4 لتصنيفها حسب الأضلاع والزوايا"/>
+                    <pic:cNvPr id="9001" name="tri_types" descr="ثلاثة مثلثات مرقمة من 1 إلى 3 لتصنيفها"/>
                     <pic:cNvPicPr/>
                   </pic:nvPicPr>
                   <pic:blipFill>
@@ -2544,7 +2510,7 @@
                   <pic:spPr>
                     <a:xfrm>
                       <a:off x="0" y="0"/>
-                      <a:ext cx="5943600" cy="1835500"/>
+                      <a:ext cx="4754880" cy="1957900"/>
                     </a:xfrm>
                     <a:prstGeom prst="rect">
                       <a:avLst/>
@@ -2560,26 +2526,7 @@
     <w:p>
       <w:pPr>
         <w:bidi/>
-        <w:spacing w:before="0" w:after="40" w:line="276" w:lineRule="auto"/>
-        <w:jc w:val="center"/>
-      </w:pPr>
-      <w:r>
-        <w:rPr>
-          <w:rFonts w:ascii="Calibri" w:eastAsia="Calibri" w:hAnsi="Calibri" w:cs="Calibri"/>
-          <w:i/>
-          <w:iCs/>
-          <w:color w:val="6B6B6B"/>
-          <w:sz w:val="20"/>
-          <w:szCs w:val="20"/>
-          <w:rtl/>
-        </w:rPr>
-        <w:t xml:space="preserve">(الأشكال للتوضيح وليست بمقياس رسم حقيقي)</w:t>
-      </w:r>
-    </w:p>
-    <w:p>
-      <w:pPr>
-        <w:bidi/>
-        <w:spacing w:before="0" w:after="0" w:line="80" w:lineRule="exact"/>
+        <w:spacing w:before="0" w:after="0" w:line="60" w:lineRule="exact"/>
       </w:pPr>
     </w:p>
     <w:tbl>
@@ -2620,9 +2567,9 @@
             </w:tcBorders>
             <w:shd w:val="clear" w:color="auto" w:fill="EAF2FB"/>
             <w:tcMar>
-              <w:top w:w="120" w:type="dxa"/>
+              <w:top w:w="100" w:type="dxa"/>
               <w:left w:w="200" w:type="dxa"/>
-              <w:bottom w:w="120" w:type="dxa"/>
+              <w:bottom w:w="100" w:type="dxa"/>
               <w:right w:w="240" w:type="dxa"/>
             </w:tcMar>
             <w:vAlign w:val="center"/>
@@ -2631,7 +2578,7 @@
             <w:pPr>
               <w:keepNext/>
               <w:bidi/>
-              <w:spacing w:before="0" w:after="80" w:line="276" w:lineRule="auto"/>
+              <w:spacing w:before="0" w:after="60" w:line="276" w:lineRule="auto"/>
             </w:pPr>
             <w:r>
               <w:rPr>
@@ -2639,75 +2586,59 @@
                 <w:b/>
                 <w:bCs/>
                 <w:color w:val="1F4E79"/>
-                <w:sz w:val="26"/>
-                <w:szCs w:val="26"/>
-                <w:rtl/>
-              </w:rPr>
-              <w:t xml:space="preserve">وصف الشكل (للطلاب المكفوفين وضعاف البصر):</w:t>
-            </w:r>
-          </w:p>
-          <w:p>
-            <w:pPr>
-              <w:bidi/>
-              <w:spacing w:before="0" w:after="60" w:line="276" w:lineRule="auto"/>
+                <w:sz w:val="36"/>
+                <w:szCs w:val="36"/>
+                <w:rtl/>
+              </w:rPr>
+              <w:t xml:space="preserve">وصف الشكل للمكفوفين:</w:t>
+            </w:r>
+          </w:p>
+          <w:p>
+            <w:pPr>
+              <w:bidi/>
+              <w:spacing w:before="0" w:after="40" w:line="276" w:lineRule="auto"/>
             </w:pPr>
             <w:r>
               <w:rPr>
                 <w:rFonts w:ascii="Calibri" w:eastAsia="Calibri" w:hAnsi="Calibri" w:cs="Calibri"/>
                 <w:color w:val="1A1A1A"/>
-                <w:sz w:val="26"/>
-                <w:szCs w:val="26"/>
-                <w:rtl/>
-              </w:rPr>
-              <w:t xml:space="preserve">• المثلث (1) ABC: أضلاعه الثلاثة متساوية، طول كل ضلع 4 cm، وقياس كل زاوية من زواياه 60°‎.</w:t>
-            </w:r>
-          </w:p>
-          <w:p>
-            <w:pPr>
-              <w:bidi/>
-              <w:spacing w:before="0" w:after="60" w:line="276" w:lineRule="auto"/>
+                <w:sz w:val="36"/>
+                <w:szCs w:val="36"/>
+                <w:rtl/>
+              </w:rPr>
+              <w:t xml:space="preserve">(1) ABC: أضلاعه 4 cm و 4 cm و 4 cm، وزواياه 60°‎.</w:t>
+            </w:r>
+          </w:p>
+          <w:p>
+            <w:pPr>
+              <w:bidi/>
+              <w:spacing w:before="0" w:after="40" w:line="276" w:lineRule="auto"/>
             </w:pPr>
             <w:r>
               <w:rPr>
                 <w:rFonts w:ascii="Calibri" w:eastAsia="Calibri" w:hAnsi="Calibri" w:cs="Calibri"/>
                 <w:color w:val="1A1A1A"/>
-                <w:sz w:val="26"/>
-                <w:szCs w:val="26"/>
-                <w:rtl/>
-              </w:rPr>
-              <w:t xml:space="preserve">• المثلث (2) DEF: الضلعان DE و EF متساويان وطول كل منهما 5 cm، والزاوية E قائمة (قياسها 90°‎)، وقياس كل من الزاويتين D و F يساوي 45°‎.</w:t>
-            </w:r>
-          </w:p>
-          <w:p>
-            <w:pPr>
-              <w:bidi/>
-              <w:spacing w:before="0" w:after="60" w:line="276" w:lineRule="auto"/>
+                <w:sz w:val="36"/>
+                <w:szCs w:val="36"/>
+                <w:rtl/>
+              </w:rPr>
+              <w:t xml:space="preserve">(2) DEF: الضلعان DE و EF طول كل منهما 5 cm، والزاوية E قائمة.</w:t>
+            </w:r>
+          </w:p>
+          <w:p>
+            <w:pPr>
+              <w:bidi/>
+              <w:spacing w:before="0" w:after="40" w:line="276" w:lineRule="auto"/>
             </w:pPr>
             <w:r>
               <w:rPr>
                 <w:rFonts w:ascii="Calibri" w:eastAsia="Calibri" w:hAnsi="Calibri" w:cs="Calibri"/>
                 <w:color w:val="1A1A1A"/>
-                <w:sz w:val="26"/>
-                <w:szCs w:val="26"/>
-                <w:rtl/>
-              </w:rPr>
-              <w:t xml:space="preserve">• المثلث (3) GHI: أطوال أضلاعه GI = 3 cm و GH = 5 cm و HI = 7 cm (أطوال مختلفة)، وقياس الزاوية G يساوي 120°‎.</w:t>
-            </w:r>
-          </w:p>
-          <w:p>
-            <w:pPr>
-              <w:bidi/>
-              <w:spacing w:before="0" w:after="60" w:line="276" w:lineRule="auto"/>
-            </w:pPr>
-            <w:r>
-              <w:rPr>
-                <w:rFonts w:ascii="Calibri" w:eastAsia="Calibri" w:hAnsi="Calibri" w:cs="Calibri"/>
-                <w:color w:val="1A1A1A"/>
-                <w:sz w:val="26"/>
-                <w:szCs w:val="26"/>
-                <w:rtl/>
-              </w:rPr>
-              <w:t xml:space="preserve">• المثلث (4) KLM: أطوال أضلاعه KL = 7 cm و LM = 5 cm و KM = 6 cm (أطوال مختلفة)، وقياسات زواياه: K = 44°‎ و L = 57°‎ و M = 79°‎.</w:t>
+                <w:sz w:val="36"/>
+                <w:szCs w:val="36"/>
+                <w:rtl/>
+              </w:rPr>
+              <w:t xml:space="preserve">(3) GHI: أضلاعه 3 cm و 5 cm و 7 cm، والزاوية G = 120°‎.</w:t>
             </w:r>
           </w:p>
         </w:tc>
@@ -2716,7 +2647,7 @@
     <w:p>
       <w:pPr>
         <w:bidi/>
-        <w:spacing w:before="0" w:after="0" w:line="120" w:lineRule="exact"/>
+        <w:spacing w:before="0" w:after="0" w:line="100" w:lineRule="exact"/>
       </w:pPr>
     </w:p>
     <w:tbl>
@@ -2749,7 +2680,7 @@
       <w:tr>
         <w:trPr>
           <w:cantSplit/>
-          <w:trHeight w:val="440"/>
+          <w:trHeight w:val="480"/>
           <w:tblHeader/>
         </w:trPr>
         <w:tc>
@@ -2770,8 +2701,8 @@
                 <w:b/>
                 <w:bCs/>
                 <w:color w:val="FFFFFF"/>
-                <w:sz w:val="24"/>
-                <w:szCs w:val="24"/>
+                <w:sz w:val="28"/>
+                <w:szCs w:val="28"/>
                 <w:rtl/>
               </w:rPr>
               <w:t xml:space="preserve">المثلث</w:t>
@@ -2796,11 +2727,11 @@
                 <w:b/>
                 <w:bCs/>
                 <w:color w:val="FFFFFF"/>
-                <w:sz w:val="24"/>
-                <w:szCs w:val="24"/>
-                <w:rtl/>
-              </w:rPr>
-              <w:t xml:space="preserve">نوعه حسب الأضلاع</w:t>
+                <w:sz w:val="28"/>
+                <w:szCs w:val="28"/>
+                <w:rtl/>
+              </w:rPr>
+              <w:t xml:space="preserve">حسب الأضلاع</w:t>
             </w:r>
           </w:p>
         </w:tc>
@@ -2822,11 +2753,11 @@
                 <w:b/>
                 <w:bCs/>
                 <w:color w:val="FFFFFF"/>
-                <w:sz w:val="24"/>
-                <w:szCs w:val="24"/>
-                <w:rtl/>
-              </w:rPr>
-              <w:t xml:space="preserve">نوعه حسب الزوايا</w:t>
+                <w:sz w:val="28"/>
+                <w:szCs w:val="28"/>
+                <w:rtl/>
+              </w:rPr>
+              <w:t xml:space="preserve">حسب الزوايا</w:t>
             </w:r>
           </w:p>
         </w:tc>
@@ -2834,7 +2765,7 @@
       <w:tr>
         <w:trPr>
           <w:cantSplit/>
-          <w:trHeight w:val="600"/>
+          <w:trHeight w:val="640"/>
         </w:trPr>
         <w:tc>
           <w:tcPr>
@@ -2854,8 +2785,8 @@
                 <w:b/>
                 <w:bCs/>
                 <w:color w:val="14532D"/>
-                <w:sz w:val="26"/>
-                <w:szCs w:val="26"/>
+                <w:sz w:val="36"/>
+                <w:szCs w:val="36"/>
                 <w:rtl/>
               </w:rPr>
               <w:t xml:space="preserve">(1) ABC</w:t>
@@ -2910,7 +2841,7 @@
       <w:tr>
         <w:trPr>
           <w:cantSplit/>
-          <w:trHeight w:val="600"/>
+          <w:trHeight w:val="640"/>
         </w:trPr>
         <w:tc>
           <w:tcPr>
@@ -2930,8 +2861,8 @@
                 <w:b/>
                 <w:bCs/>
                 <w:color w:val="14532D"/>
-                <w:sz w:val="26"/>
-                <w:szCs w:val="26"/>
+                <w:sz w:val="36"/>
+                <w:szCs w:val="36"/>
                 <w:rtl/>
               </w:rPr>
               <w:t xml:space="preserve">(2) DEF</w:t>
@@ -2986,7 +2917,7 @@
       <w:tr>
         <w:trPr>
           <w:cantSplit/>
-          <w:trHeight w:val="600"/>
+          <w:trHeight w:val="640"/>
         </w:trPr>
         <w:tc>
           <w:tcPr>
@@ -3006,8 +2937,8 @@
                 <w:b/>
                 <w:bCs/>
                 <w:color w:val="14532D"/>
-                <w:sz w:val="26"/>
-                <w:szCs w:val="26"/>
+                <w:sz w:val="36"/>
+                <w:szCs w:val="36"/>
                 <w:rtl/>
               </w:rPr>
               <w:t xml:space="preserve">(3) GHI</w:t>
@@ -3059,106 +2990,12 @@
           </w:p>
         </w:tc>
       </w:tr>
-      <w:tr>
-        <w:trPr>
-          <w:cantSplit/>
-          <w:trHeight w:val="600"/>
-        </w:trPr>
-        <w:tc>
-          <w:tcPr>
-            <w:tcW w:w="1800" w:type="dxa"/>
-            <w:shd w:val="clear" w:color="auto" w:fill="EEF6F1"/>
-            <w:vAlign w:val="center"/>
-          </w:tcPr>
-          <w:p>
-            <w:pPr>
-              <w:bidi/>
-              <w:spacing w:before="0" w:after="0" w:line="276" w:lineRule="auto"/>
-              <w:jc w:val="center"/>
-            </w:pPr>
-            <w:r>
-              <w:rPr>
-                <w:rFonts w:ascii="Calibri" w:eastAsia="Calibri" w:hAnsi="Calibri" w:cs="Calibri"/>
-                <w:b/>
-                <w:bCs/>
-                <w:color w:val="14532D"/>
-                <w:sz w:val="26"/>
-                <w:szCs w:val="26"/>
-                <w:rtl/>
-              </w:rPr>
-              <w:t xml:space="preserve">(4) KLM</w:t>
-            </w:r>
-          </w:p>
-        </w:tc>
-        <w:tc>
-          <w:tcPr>
-            <w:tcW w:w="4320" w:type="dxa"/>
-            <w:vAlign w:val="center"/>
-          </w:tcPr>
-          <w:p>
-            <w:pPr>
-              <w:bidi/>
-              <w:spacing w:before="0" w:after="100" w:line="276" w:lineRule="auto"/>
-            </w:pPr>
-            <w:r>
-              <w:rPr>
-                <w:rFonts w:ascii="Calibri" w:eastAsia="Calibri" w:hAnsi="Calibri" w:cs="Calibri"/>
-                <w:color w:val="1A1A1A"/>
-                <w:sz w:val="28"/>
-                <w:szCs w:val="28"/>
-                <w:rtl/>
-              </w:rPr>
-              <w:t xml:space="preserve"/>
-            </w:r>
-          </w:p>
-        </w:tc>
-        <w:tc>
-          <w:tcPr>
-            <w:tcW w:w="4320" w:type="dxa"/>
-            <w:vAlign w:val="center"/>
-          </w:tcPr>
-          <w:p>
-            <w:pPr>
-              <w:bidi/>
-              <w:spacing w:before="0" w:after="100" w:line="276" w:lineRule="auto"/>
-            </w:pPr>
-            <w:r>
-              <w:rPr>
-                <w:rFonts w:ascii="Calibri" w:eastAsia="Calibri" w:hAnsi="Calibri" w:cs="Calibri"/>
-                <w:color w:val="1A1A1A"/>
-                <w:sz w:val="28"/>
-                <w:szCs w:val="28"/>
-                <w:rtl/>
-              </w:rPr>
-              <w:t xml:space="preserve"/>
-            </w:r>
-          </w:p>
-        </w:tc>
-      </w:tr>
     </w:tbl>
     <w:p>
       <w:pPr>
-        <w:bidi/>
-        <w:spacing w:before="40" w:after="120" w:line="276" w:lineRule="auto"/>
-      </w:pPr>
-      <w:r>
-        <w:rPr>
-          <w:rFonts w:ascii="Calibri" w:eastAsia="Calibri" w:hAnsi="Calibri" w:cs="Calibri"/>
-          <w:i/>
-          <w:iCs/>
-          <w:color w:val="6B6B6B"/>
-          <w:sz w:val="20"/>
-          <w:szCs w:val="20"/>
-          <w:rtl/>
-        </w:rPr>
-        <w:t xml:space="preserve">(لكل خانة صحيحة 0.25 علامة)</w:t>
-      </w:r>
-    </w:p>
-    <w:p>
-      <w:pPr>
         <w:keepNext/>
         <w:bidi/>
-        <w:spacing w:before="120" w:after="60" w:line="276" w:lineRule="auto"/>
+        <w:spacing w:before="240" w:after="60" w:line="276" w:lineRule="auto"/>
       </w:pPr>
       <w:r>
         <w:rPr>
@@ -3166,8 +3003,8 @@
           <w:b/>
           <w:bCs/>
           <w:color w:val="14532D"/>
-          <w:sz w:val="28"/>
-          <w:szCs w:val="28"/>
+          <w:sz w:val="36"/>
+          <w:szCs w:val="36"/>
           <w:rtl/>
         </w:rPr>
         <w:t xml:space="preserve">ب) </w:t>
@@ -3178,11 +3015,11 @@
           <w:b/>
           <w:bCs/>
           <w:color w:val="1A1A1A"/>
-          <w:sz w:val="28"/>
-          <w:szCs w:val="28"/>
-          <w:rtl/>
-        </w:rPr>
-        <w:t xml:space="preserve">احسب قياس الزاوية المجهولة في كل حالة مما يلي، مع كتابة خطوات الحل:</w:t>
+          <w:sz w:val="36"/>
+          <w:szCs w:val="36"/>
+          <w:rtl/>
+        </w:rPr>
+        <w:t xml:space="preserve">احسب قياس الزاوية المجهولة:</w:t>
       </w:r>
       <w:r>
         <w:rPr>
@@ -3194,7 +3031,7 @@
           <w:szCs w:val="22"/>
           <w:rtl/>
         </w:rPr>
-        <w:t xml:space="preserve">   (3 علامات)</w:t>
+        <w:t xml:space="preserve">   (علامتان)</w:t>
       </w:r>
     </w:p>
     <w:p>
@@ -3207,9 +3044,9 @@
       <w:r>
         <w:drawing>
           <wp:inline distT="0" distB="0" distL="0" distR="0">
-            <wp:extent cx="4754880" cy="1957900"/>
+            <wp:extent cx="3291840" cy="2034000"/>
             <wp:effectExtent l="0" t="0" r="0" b="0"/>
-            <wp:docPr id="9002" name="tri_angles" descr="ثلاثة مثلثات مرقمة من 1 إلى 3 وعلى كل منها زاوية مجهولة مشار إليها بعلامة استفهام"/>
+            <wp:docPr id="9002" name="tri_angles" descr="مثلثان على كل منهما زاوية مجهولة مشار إليها بعلامة استفهام"/>
             <wp:cNvGraphicFramePr>
               <a:graphicFrameLocks xmlns:a="http://schemas.openxmlformats.org/drawingml/2006/main" noChangeAspect="1"/>
             </wp:cNvGraphicFramePr>
@@ -3217,7 +3054,7 @@
               <a:graphicData uri="http://schemas.openxmlformats.org/drawingml/2006/picture">
                 <pic:pic xmlns:pic="http://schemas.openxmlformats.org/drawingml/2006/picture">
                   <pic:nvPicPr>
-                    <pic:cNvPr id="9002" name="tri_angles" descr="ثلاثة مثلثات مرقمة من 1 إلى 3 وعلى كل منها زاوية مجهولة مشار إليها بعلامة استفهام"/>
+                    <pic:cNvPr id="9002" name="tri_angles" descr="مثلثان على كل منهما زاوية مجهولة مشار إليها بعلامة استفهام"/>
                     <pic:cNvPicPr/>
                   </pic:nvPicPr>
                   <pic:blipFill>
@@ -3229,7 +3066,7 @@
                   <pic:spPr>
                     <a:xfrm>
                       <a:off x="0" y="0"/>
-                      <a:ext cx="4754880" cy="1957900"/>
+                      <a:ext cx="3291840" cy="2034000"/>
                     </a:xfrm>
                     <a:prstGeom prst="rect">
                       <a:avLst/>
@@ -3245,7 +3082,7 @@
     <w:p>
       <w:pPr>
         <w:bidi/>
-        <w:spacing w:before="0" w:after="0" w:line="80" w:lineRule="exact"/>
+        <w:spacing w:before="0" w:after="0" w:line="60" w:lineRule="exact"/>
       </w:pPr>
     </w:p>
     <w:tbl>
@@ -3286,9 +3123,9 @@
             </w:tcBorders>
             <w:shd w:val="clear" w:color="auto" w:fill="EAF2FB"/>
             <w:tcMar>
-              <w:top w:w="120" w:type="dxa"/>
+              <w:top w:w="100" w:type="dxa"/>
               <w:left w:w="200" w:type="dxa"/>
-              <w:bottom w:w="120" w:type="dxa"/>
+              <w:bottom w:w="100" w:type="dxa"/>
               <w:right w:w="240" w:type="dxa"/>
             </w:tcMar>
             <w:vAlign w:val="center"/>
@@ -3297,7 +3134,7 @@
             <w:pPr>
               <w:keepNext/>
               <w:bidi/>
-              <w:spacing w:before="0" w:after="80" w:line="276" w:lineRule="auto"/>
+              <w:spacing w:before="0" w:after="60" w:line="276" w:lineRule="auto"/>
             </w:pPr>
             <w:r>
               <w:rPr>
@@ -3305,75 +3142,43 @@
                 <w:b/>
                 <w:bCs/>
                 <w:color w:val="1F4E79"/>
-                <w:sz w:val="26"/>
-                <w:szCs w:val="26"/>
-                <w:rtl/>
-              </w:rPr>
-              <w:t xml:space="preserve">وصف الشكل (للطلاب المكفوفين وضعاف البصر):</w:t>
-            </w:r>
-          </w:p>
-          <w:p>
-            <w:pPr>
-              <w:bidi/>
-              <w:spacing w:before="0" w:after="60" w:line="276" w:lineRule="auto"/>
+                <w:sz w:val="36"/>
+                <w:szCs w:val="36"/>
+                <w:rtl/>
+              </w:rPr>
+              <w:t xml:space="preserve">وصف الشكل للمكفوفين:</w:t>
+            </w:r>
+          </w:p>
+          <w:p>
+            <w:pPr>
+              <w:bidi/>
+              <w:spacing w:before="0" w:after="40" w:line="276" w:lineRule="auto"/>
             </w:pPr>
             <w:r>
               <w:rPr>
                 <w:rFonts w:ascii="Calibri" w:eastAsia="Calibri" w:hAnsi="Calibri" w:cs="Calibri"/>
                 <w:color w:val="1A1A1A"/>
-                <w:sz w:val="26"/>
-                <w:szCs w:val="26"/>
-                <w:rtl/>
-              </w:rPr>
-              <w:t xml:space="preserve">• يُظهر الشكل ثلاثة مثلثات مرقّمة (1) و(2) و(3)، ووُضعت علامة استفهام (?) على كل زاوية مطلوب حسابها.</w:t>
-            </w:r>
-          </w:p>
-          <w:p>
-            <w:pPr>
-              <w:bidi/>
-              <w:spacing w:before="0" w:after="60" w:line="276" w:lineRule="auto"/>
+                <w:sz w:val="36"/>
+                <w:szCs w:val="36"/>
+                <w:rtl/>
+              </w:rPr>
+              <w:t xml:space="preserve">(1) ABC: A = 65°‎ و B = 45°‎، والزاوية C مجهولة.</w:t>
+            </w:r>
+          </w:p>
+          <w:p>
+            <w:pPr>
+              <w:bidi/>
+              <w:spacing w:before="0" w:after="40" w:line="276" w:lineRule="auto"/>
             </w:pPr>
             <w:r>
               <w:rPr>
                 <w:rFonts w:ascii="Calibri" w:eastAsia="Calibri" w:hAnsi="Calibri" w:cs="Calibri"/>
                 <w:color w:val="1A1A1A"/>
-                <w:sz w:val="26"/>
-                <w:szCs w:val="26"/>
-                <w:rtl/>
-              </w:rPr>
-              <w:t xml:space="preserve">• المثلث (1) ABC: الزاوية A = 65°‎ والزاوية B = 45°‎، والزاوية C مجهولة.</w:t>
-            </w:r>
-          </w:p>
-          <w:p>
-            <w:pPr>
-              <w:bidi/>
-              <w:spacing w:before="0" w:after="60" w:line="276" w:lineRule="auto"/>
-            </w:pPr>
-            <w:r>
-              <w:rPr>
-                <w:rFonts w:ascii="Calibri" w:eastAsia="Calibri" w:hAnsi="Calibri" w:cs="Calibri"/>
-                <w:color w:val="1A1A1A"/>
-                <w:sz w:val="26"/>
-                <w:szCs w:val="26"/>
-                <w:rtl/>
-              </w:rPr>
-              <w:t xml:space="preserve">• المثلث (2) DEF: الرأس D في الأعلى، والضلعان DE و DF متساويان (عليهما إشارة تساوٍ)، والزاوية D = 40°‎، والزاويتان E و F مجهولتان.</w:t>
-            </w:r>
-          </w:p>
-          <w:p>
-            <w:pPr>
-              <w:bidi/>
-              <w:spacing w:before="0" w:after="60" w:line="276" w:lineRule="auto"/>
-            </w:pPr>
-            <w:r>
-              <w:rPr>
-                <w:rFonts w:ascii="Calibri" w:eastAsia="Calibri" w:hAnsi="Calibri" w:cs="Calibri"/>
-                <w:color w:val="1A1A1A"/>
-                <w:sz w:val="26"/>
-                <w:szCs w:val="26"/>
-                <w:rtl/>
-              </w:rPr>
-              <w:t xml:space="preserve">• المثلث (3) KLM: الزاوية K قائمة (عليها مربع صغير)، والزاوية L = 35°‎، والزاوية M مجهولة.</w:t>
+                <w:sz w:val="36"/>
+                <w:szCs w:val="36"/>
+                <w:rtl/>
+              </w:rPr>
+              <w:t xml:space="preserve">(2) DEF متساوي الساقين (DE = DF) و D = 40°‎، والزاويتان E و F مجهولتان.</w:t>
             </w:r>
           </w:p>
         </w:tc>
@@ -3382,24 +3187,24 @@
     <w:p>
       <w:pPr>
         <w:bidi/>
-        <w:spacing w:before="0" w:after="0" w:line="120" w:lineRule="exact"/>
+        <w:spacing w:before="0" w:after="0" w:line="100" w:lineRule="exact"/>
       </w:pPr>
     </w:p>
     <w:p>
       <w:pPr>
         <w:keepNext/>
         <w:bidi/>
-        <w:spacing w:before="120" w:after="0" w:line="276" w:lineRule="auto"/>
+        <w:spacing w:before="100" w:after="0" w:line="276" w:lineRule="auto"/>
       </w:pPr>
       <w:r>
         <w:rPr>
           <w:rFonts w:ascii="Calibri" w:eastAsia="Calibri" w:hAnsi="Calibri" w:cs="Calibri"/>
           <w:color w:val="1A1A1A"/>
-          <w:sz w:val="28"/>
-          <w:szCs w:val="28"/>
-          <w:rtl/>
-        </w:rPr>
-        <w:t xml:space="preserve">1) في المثلث ABC: قياس الزاوية A = 65°‎ وقياس الزاوية B = 45°‎. احسب قياس الزاوية C.</w:t>
+          <w:sz w:val="36"/>
+          <w:szCs w:val="36"/>
+          <w:rtl/>
+        </w:rPr>
+        <w:t xml:space="preserve">1) في المثلث ABC، احسب قياس الزاوية C.</w:t>
       </w:r>
       <w:r>
         <w:rPr>
@@ -3458,86 +3263,17 @@
       <w:pPr>
         <w:keepNext/>
         <w:bidi/>
-        <w:spacing w:before="120" w:after="0" w:line="276" w:lineRule="auto"/>
+        <w:spacing w:before="100" w:after="0" w:line="276" w:lineRule="auto"/>
       </w:pPr>
       <w:r>
         <w:rPr>
           <w:rFonts w:ascii="Calibri" w:eastAsia="Calibri" w:hAnsi="Calibri" w:cs="Calibri"/>
           <w:color w:val="1A1A1A"/>
-          <w:sz w:val="28"/>
-          <w:szCs w:val="28"/>
-          <w:rtl/>
-        </w:rPr>
-        <w:t xml:space="preserve">2) المثلث DEF متساوي الساقين رأسه D (أي DE = DF)، وقياس الزاوية D = 40°‎. احسب قياس كل من الزاويتين E و F.</w:t>
-      </w:r>
-      <w:r>
-        <w:rPr>
-          <w:rFonts w:ascii="Calibri" w:eastAsia="Calibri" w:hAnsi="Calibri" w:cs="Calibri"/>
-          <w:b/>
-          <w:bCs/>
-          <w:color w:val="B8860B"/>
-          <w:sz w:val="22"/>
-          <w:szCs w:val="22"/>
-          <w:rtl/>
-        </w:rPr>
-        <w:t xml:space="preserve">   (1)</w:t>
-      </w:r>
-    </w:p>
-    <w:p>
-      <w:pPr>
-        <w:pBdr>
-          <w:bottom w:val="dotted" w:sz="6" w:space="1" w:color="9E9E9E"/>
-          <w:between w:val="dotted" w:sz="6" w:space="1" w:color="9E9E9E"/>
-        </w:pBdr>
-        <w:bidi/>
-        <w:spacing w:before="300" w:after="0" w:line="276" w:lineRule="auto"/>
-      </w:pPr>
-      <w:r>
-        <w:rPr>
-          <w:rFonts w:ascii="Calibri" w:eastAsia="Calibri" w:hAnsi="Calibri" w:cs="Calibri"/>
-          <w:color w:val="1A1A1A"/>
-          <w:sz w:val="28"/>
-          <w:szCs w:val="28"/>
-          <w:rtl/>
-        </w:rPr>
-        <w:t xml:space="preserve"/>
-      </w:r>
-    </w:p>
-    <w:p>
-      <w:pPr>
-        <w:pBdr>
-          <w:bottom w:val="dotted" w:sz="6" w:space="1" w:color="9E9E9E"/>
-          <w:between w:val="dotted" w:sz="6" w:space="1" w:color="9E9E9E"/>
-        </w:pBdr>
-        <w:bidi/>
-        <w:spacing w:before="300" w:after="0" w:line="276" w:lineRule="auto"/>
-      </w:pPr>
-      <w:r>
-        <w:rPr>
-          <w:rFonts w:ascii="Calibri" w:eastAsia="Calibri" w:hAnsi="Calibri" w:cs="Calibri"/>
-          <w:color w:val="1A1A1A"/>
-          <w:sz w:val="28"/>
-          <w:szCs w:val="28"/>
-          <w:rtl/>
-        </w:rPr>
-        <w:t xml:space="preserve"/>
-      </w:r>
-    </w:p>
-    <w:p>
-      <w:pPr>
-        <w:keepNext/>
-        <w:bidi/>
-        <w:spacing w:before="120" w:after="0" w:line="276" w:lineRule="auto"/>
-      </w:pPr>
-      <w:r>
-        <w:rPr>
-          <w:rFonts w:ascii="Calibri" w:eastAsia="Calibri" w:hAnsi="Calibri" w:cs="Calibri"/>
-          <w:color w:val="1A1A1A"/>
-          <w:sz w:val="28"/>
-          <w:szCs w:val="28"/>
-          <w:rtl/>
-        </w:rPr>
-        <w:t xml:space="preserve">3) المثلث KLM قائم الزاوية في K، وقياس الزاوية L = 35°‎. احسب قياس الزاوية M.</w:t>
+          <w:sz w:val="36"/>
+          <w:szCs w:val="36"/>
+          <w:rtl/>
+        </w:rPr>
+        <w:t xml:space="preserve">2) في المثلث DEF، احسب قياس الزاويتين E و F.</w:t>
       </w:r>
       <w:r>
         <w:rPr>

</xml_diff>

<commit_message>
Simplify triangle-type question and enlarge triangle figures
Co-Authored-By: Claude Opus 5.5 <noreply@anthropic.com>
Claude-Session: https://claude.ai/code/session_01PHgZqhLAeFoDhbHXzt9YLK
</commit_message>
<xml_diff>
--- a/exams/امتحان-رياضيات-السابع-مع-المثلثات.docx
+++ b/exams/امتحان-رياضيات-السابع-مع-المثلثات.docx
@@ -2463,7 +2463,7 @@
           <w:szCs w:val="36"/>
           <w:rtl/>
         </w:rPr>
-        <w:t xml:space="preserve">صنّف كل مثلث حسب أضلاعه وحسب زواياه.</w:t>
+        <w:t xml:space="preserve">حدّد نوع كل مثلث من المثلثات التالية.</w:t>
       </w:r>
       <w:r>
         <w:rPr>
@@ -2488,9 +2488,9 @@
       <w:r>
         <w:drawing>
           <wp:inline distT="0" distB="0" distL="0" distR="0">
-            <wp:extent cx="4754880" cy="1957900"/>
+            <wp:extent cx="6583680" cy="2493818"/>
             <wp:effectExtent l="0" t="0" r="0" b="0"/>
-            <wp:docPr id="9001" name="tri_types" descr="ثلاثة مثلثات مرقمة من 1 إلى 3 لتصنيفها"/>
+            <wp:docPr id="9001" name="tri_types" descr="ثلاثة مثلثات مرقمة من 1 إلى 3 لتحديد نوع كل منها"/>
             <wp:cNvGraphicFramePr>
               <a:graphicFrameLocks xmlns:a="http://schemas.openxmlformats.org/drawingml/2006/main" noChangeAspect="1"/>
             </wp:cNvGraphicFramePr>
@@ -2498,7 +2498,7 @@
               <a:graphicData uri="http://schemas.openxmlformats.org/drawingml/2006/picture">
                 <pic:pic xmlns:pic="http://schemas.openxmlformats.org/drawingml/2006/picture">
                   <pic:nvPicPr>
-                    <pic:cNvPr id="9001" name="tri_types" descr="ثلاثة مثلثات مرقمة من 1 إلى 3 لتصنيفها"/>
+                    <pic:cNvPr id="9001" name="tri_types" descr="ثلاثة مثلثات مرقمة من 1 إلى 3 لتحديد نوع كل منها"/>
                     <pic:cNvPicPr/>
                   </pic:nvPicPr>
                   <pic:blipFill>
@@ -2510,7 +2510,7 @@
                   <pic:spPr>
                     <a:xfrm>
                       <a:off x="0" y="0"/>
-                      <a:ext cx="4754880" cy="1957900"/>
+                      <a:ext cx="6583680" cy="2493818"/>
                     </a:xfrm>
                     <a:prstGeom prst="rect">
                       <a:avLst/>
@@ -2606,7 +2606,7 @@
                 <w:szCs w:val="36"/>
                 <w:rtl/>
               </w:rPr>
-              <w:t xml:space="preserve">(1) ABC: أضلاعه 4 cm و 4 cm و 4 cm، وزواياه 60°‎.</w:t>
+              <w:t xml:space="preserve">(1) ABC: أضلاعه الثلاثة متساوية، طول كل منها 4 cm.</w:t>
             </w:r>
           </w:p>
           <w:p>
@@ -2622,7 +2622,7 @@
                 <w:szCs w:val="36"/>
                 <w:rtl/>
               </w:rPr>
-              <w:t xml:space="preserve">(2) DEF: الضلعان DE و EF طول كل منهما 5 cm، والزاوية E قائمة.</w:t>
+              <w:t xml:space="preserve">(2) DEF: الزاوية E قائمة (90°‎)، وأضلاعه 3 cm و 4 cm و 5 cm.</w:t>
             </w:r>
           </w:p>
           <w:p>
@@ -2638,7 +2638,7 @@
                 <w:szCs w:val="36"/>
                 <w:rtl/>
               </w:rPr>
-              <w:t xml:space="preserve">(3) GHI: أضلاعه 3 cm و 5 cm و 7 cm، والزاوية G = 120°‎.</w:t>
+              <w:t xml:space="preserve">(3) GHI: الضلعان GH و GI متساويان، طول كل منهما 5 cm، والضلع الثالث HI أقصر منهما.</w:t>
             </w:r>
           </w:p>
         </w:tc>
@@ -2673,9 +2673,8 @@
         <w:tblLook w:val="04A0" w:firstRow="1" w:lastRow="0" w:firstColumn="1" w:lastColumn="0" w:noHBand="0" w:noVBand="1"/>
       </w:tblPr>
       <w:tblGrid>
-        <w:gridCol w:w="1800"/>
-        <w:gridCol w:w="4320"/>
-        <w:gridCol w:w="4320"/>
+        <w:gridCol w:w="3000"/>
+        <w:gridCol w:w="7440"/>
       </w:tblGrid>
       <w:tr>
         <w:trPr>
@@ -2685,7 +2684,7 @@
         </w:trPr>
         <w:tc>
           <w:tcPr>
-            <w:tcW w:w="1800" w:type="dxa"/>
+            <w:tcW w:w="3000" w:type="dxa"/>
             <w:shd w:val="clear" w:color="auto" w:fill="14532D"/>
             <w:vAlign w:val="center"/>
           </w:tcPr>
@@ -2711,7 +2710,7 @@
         </w:tc>
         <w:tc>
           <w:tcPr>
-            <w:tcW w:w="4320" w:type="dxa"/>
+            <w:tcW w:w="7440" w:type="dxa"/>
             <w:shd w:val="clear" w:color="auto" w:fill="14532D"/>
             <w:vAlign w:val="center"/>
           </w:tcPr>
@@ -2731,33 +2730,7 @@
                 <w:szCs w:val="28"/>
                 <w:rtl/>
               </w:rPr>
-              <w:t xml:space="preserve">حسب الأضلاع</w:t>
-            </w:r>
-          </w:p>
-        </w:tc>
-        <w:tc>
-          <w:tcPr>
-            <w:tcW w:w="4320" w:type="dxa"/>
-            <w:shd w:val="clear" w:color="auto" w:fill="14532D"/>
-            <w:vAlign w:val="center"/>
-          </w:tcPr>
-          <w:p>
-            <w:pPr>
-              <w:bidi/>
-              <w:spacing w:before="0" w:after="0" w:line="276" w:lineRule="auto"/>
-              <w:jc w:val="center"/>
-            </w:pPr>
-            <w:r>
-              <w:rPr>
-                <w:rFonts w:ascii="Calibri" w:eastAsia="Calibri" w:hAnsi="Calibri" w:cs="Calibri"/>
-                <w:b/>
-                <w:bCs/>
-                <w:color w:val="FFFFFF"/>
-                <w:sz w:val="28"/>
-                <w:szCs w:val="28"/>
-                <w:rtl/>
-              </w:rPr>
-              <w:t xml:space="preserve">حسب الزوايا</w:t>
+              <w:t xml:space="preserve">نوع المثلث</w:t>
             </w:r>
           </w:p>
         </w:tc>
@@ -2769,7 +2742,7 @@
         </w:trPr>
         <w:tc>
           <w:tcPr>
-            <w:tcW w:w="1800" w:type="dxa"/>
+            <w:tcW w:w="3000" w:type="dxa"/>
             <w:shd w:val="clear" w:color="auto" w:fill="EEF6F1"/>
             <w:vAlign w:val="center"/>
           </w:tcPr>
@@ -2795,29 +2768,7 @@
         </w:tc>
         <w:tc>
           <w:tcPr>
-            <w:tcW w:w="4320" w:type="dxa"/>
-            <w:vAlign w:val="center"/>
-          </w:tcPr>
-          <w:p>
-            <w:pPr>
-              <w:bidi/>
-              <w:spacing w:before="0" w:after="100" w:line="276" w:lineRule="auto"/>
-            </w:pPr>
-            <w:r>
-              <w:rPr>
-                <w:rFonts w:ascii="Calibri" w:eastAsia="Calibri" w:hAnsi="Calibri" w:cs="Calibri"/>
-                <w:color w:val="1A1A1A"/>
-                <w:sz w:val="28"/>
-                <w:szCs w:val="28"/>
-                <w:rtl/>
-              </w:rPr>
-              <w:t xml:space="preserve"/>
-            </w:r>
-          </w:p>
-        </w:tc>
-        <w:tc>
-          <w:tcPr>
-            <w:tcW w:w="4320" w:type="dxa"/>
+            <w:tcW w:w="7440" w:type="dxa"/>
             <w:vAlign w:val="center"/>
           </w:tcPr>
           <w:p>
@@ -2845,7 +2796,7 @@
         </w:trPr>
         <w:tc>
           <w:tcPr>
-            <w:tcW w:w="1800" w:type="dxa"/>
+            <w:tcW w:w="3000" w:type="dxa"/>
             <w:shd w:val="clear" w:color="auto" w:fill="EEF6F1"/>
             <w:vAlign w:val="center"/>
           </w:tcPr>
@@ -2871,29 +2822,7 @@
         </w:tc>
         <w:tc>
           <w:tcPr>
-            <w:tcW w:w="4320" w:type="dxa"/>
-            <w:vAlign w:val="center"/>
-          </w:tcPr>
-          <w:p>
-            <w:pPr>
-              <w:bidi/>
-              <w:spacing w:before="0" w:after="100" w:line="276" w:lineRule="auto"/>
-            </w:pPr>
-            <w:r>
-              <w:rPr>
-                <w:rFonts w:ascii="Calibri" w:eastAsia="Calibri" w:hAnsi="Calibri" w:cs="Calibri"/>
-                <w:color w:val="1A1A1A"/>
-                <w:sz w:val="28"/>
-                <w:szCs w:val="28"/>
-                <w:rtl/>
-              </w:rPr>
-              <w:t xml:space="preserve"/>
-            </w:r>
-          </w:p>
-        </w:tc>
-        <w:tc>
-          <w:tcPr>
-            <w:tcW w:w="4320" w:type="dxa"/>
+            <w:tcW w:w="7440" w:type="dxa"/>
             <w:vAlign w:val="center"/>
           </w:tcPr>
           <w:p>
@@ -2921,7 +2850,7 @@
         </w:trPr>
         <w:tc>
           <w:tcPr>
-            <w:tcW w:w="1800" w:type="dxa"/>
+            <w:tcW w:w="3000" w:type="dxa"/>
             <w:shd w:val="clear" w:color="auto" w:fill="EEF6F1"/>
             <w:vAlign w:val="center"/>
           </w:tcPr>
@@ -2947,29 +2876,7 @@
         </w:tc>
         <w:tc>
           <w:tcPr>
-            <w:tcW w:w="4320" w:type="dxa"/>
-            <w:vAlign w:val="center"/>
-          </w:tcPr>
-          <w:p>
-            <w:pPr>
-              <w:bidi/>
-              <w:spacing w:before="0" w:after="100" w:line="276" w:lineRule="auto"/>
-            </w:pPr>
-            <w:r>
-              <w:rPr>
-                <w:rFonts w:ascii="Calibri" w:eastAsia="Calibri" w:hAnsi="Calibri" w:cs="Calibri"/>
-                <w:color w:val="1A1A1A"/>
-                <w:sz w:val="28"/>
-                <w:szCs w:val="28"/>
-                <w:rtl/>
-              </w:rPr>
-              <w:t xml:space="preserve"/>
-            </w:r>
-          </w:p>
-        </w:tc>
-        <w:tc>
-          <w:tcPr>
-            <w:tcW w:w="4320" w:type="dxa"/>
+            <w:tcW w:w="7440" w:type="dxa"/>
             <w:vAlign w:val="center"/>
           </w:tcPr>
           <w:p>
@@ -3044,7 +2951,7 @@
       <w:r>
         <w:drawing>
           <wp:inline distT="0" distB="0" distL="0" distR="0">
-            <wp:extent cx="3291840" cy="2034000"/>
+            <wp:extent cx="5029200" cy="2857500"/>
             <wp:effectExtent l="0" t="0" r="0" b="0"/>
             <wp:docPr id="9002" name="tri_angles" descr="مثلثان على كل منهما زاوية مجهولة مشار إليها بعلامة استفهام"/>
             <wp:cNvGraphicFramePr>
@@ -3066,7 +2973,7 @@
                   <pic:spPr>
                     <a:xfrm>
                       <a:off x="0" y="0"/>
-                      <a:ext cx="3291840" cy="2034000"/>
+                      <a:ext cx="5029200" cy="2857500"/>
                     </a:xfrm>
                     <a:prstGeom prst="rect">
                       <a:avLst/>

</xml_diff>

<commit_message>
Reduce circle figure size and add answer key (bareme)
Co-Authored-By: Claude Opus 5.5 <noreply@anthropic.com>
Claude-Session: https://claude.ai/code/session_01PHgZqhLAeFoDhbHXzt9YLK
</commit_message>
<xml_diff>
--- a/exams/امتحان-رياضيات-السابع-مع-المثلثات.docx
+++ b/exams/امتحان-رياضيات-السابع-مع-المثلثات.docx
@@ -2820,7 +2820,7 @@
         </w:rPr>
         <w:drawing>
           <wp:inline distT="0" distB="0" distL="0" distR="0" wp14:anchorId="6B57460B" wp14:editId="4923BDD4">
-            <wp:extent cx="4754880" cy="4117032"/>
+            <wp:extent cx="3291840" cy="2850253"/>
             <wp:effectExtent l="0" t="0" r="0" b="0"/>
             <wp:docPr id="1438249767" name="Picture 1438249767" descr="دائرة مركزها O وقطرها AB، مع الشعاع OE والنقاط C و D و M"/>
             <wp:cNvGraphicFramePr>
@@ -2845,7 +2845,7 @@
                   <pic:spPr bwMode="auto">
                     <a:xfrm>
                       <a:off x="0" y="0"/>
-                      <a:ext cx="4754880" cy="4117032"/>
+                      <a:ext cx="3291840" cy="2850253"/>
                     </a:xfrm>
                     <a:prstGeom prst="rect">
                       <a:avLst/>

</xml_diff>

<commit_message>
Reorganize exam layout: uniform styles and one question per page block
Co-Authored-By: Claude Opus 5.5 <noreply@anthropic.com>
Claude-Session: https://claude.ai/code/session_01PHgZqhLAeFoDhbHXzt9YLK
</commit_message>
<xml_diff>
--- a/exams/امتحان-رياضيات-السابع-مع-المثلثات.docx
+++ b/exams/امتحان-رياضيات-السابع-مع-المثلثات.docx
@@ -345,7 +345,7 @@
       <w:tr>
         <w:trPr>
           <w:cantSplit/>
-          <w:trHeight w:val="560"/>
+          <w:trHeight w:val="580"/>
         </w:trPr>
         <w:tc>
           <w:tcPr>
@@ -395,8 +395,8 @@
                 <w:b/>
                 <w:bCs/>
                 <w:color w:val="14532D"/>
-                <w:sz w:val="26"/>
-                <w:szCs w:val="26"/>
+                <w:sz w:val="28"/>
+                <w:szCs w:val="28"/>
                 <w:rtl/>
               </w:rPr>
               <w:t xml:space="preserve">3.5 علامات</w:t>
@@ -408,14 +408,14 @@
     <w:p>
       <w:pPr>
         <w:bidi/>
-        <w:spacing w:before="0" w:after="0" w:line="120" w:lineRule="exact"/>
+        <w:spacing w:before="0" w:after="0" w:line="140" w:lineRule="exact"/>
       </w:pPr>
     </w:p>
     <w:p>
       <w:pPr>
         <w:keepNext/>
         <w:bidi/>
-        <w:spacing w:before="0" w:after="20" w:line="276" w:lineRule="auto"/>
+        <w:spacing w:before="0" w:after="40" w:line="276" w:lineRule="auto"/>
       </w:pPr>
       <w:r>
         <w:rPr>
@@ -423,11 +423,11 @@
           <w:b/>
           <w:bCs/>
           <w:color w:val="1A1A1A"/>
-          <w:sz w:val="26"/>
-          <w:szCs w:val="26"/>
-          <w:rtl/>
-        </w:rPr>
-        <w:t xml:space="preserve">ضع إشارة (✓) في الخانة المناسبة لكل عبارة. </w:t>
+          <w:sz w:val="34"/>
+          <w:szCs w:val="34"/>
+          <w:rtl/>
+        </w:rPr>
+        <w:t xml:space="preserve">ضع إشارة (✓) في الخانة المناسبة.</w:t>
       </w:r>
       <w:r>
         <w:rPr>
@@ -435,18 +435,18 @@
           <w:b/>
           <w:bCs/>
           <w:color w:val="B8860B"/>
-          <w:sz w:val="22"/>
-          <w:szCs w:val="22"/>
-          <w:rtl/>
-        </w:rPr>
-        <w:t xml:space="preserve">   (0.5 لكل عبارة)</w:t>
+          <w:sz w:val="24"/>
+          <w:szCs w:val="24"/>
+          <w:rtl/>
+        </w:rPr>
+        <w:t xml:space="preserve">  (0.5 لكل عبارة)</w:t>
       </w:r>
     </w:p>
     <w:p>
       <w:pPr>
         <w:keepNext/>
         <w:bidi/>
-        <w:spacing w:before="0" w:after="80" w:line="276" w:lineRule="auto"/>
+        <w:spacing w:before="0" w:after="100" w:line="276" w:lineRule="auto"/>
       </w:pPr>
       <w:r>
         <w:rPr>
@@ -454,11 +454,11 @@
           <w:i/>
           <w:iCs/>
           <w:color w:val="1F4E79"/>
-          <w:sz w:val="24"/>
-          <w:szCs w:val="24"/>
-          <w:rtl/>
-        </w:rPr>
-        <w:t xml:space="preserve">للطلاب المكفوفين: تُقرأ كل عبارة كاملة، ويجيب الطالب بكلمة «صح» أو «خطأ» كتابةً بطريقة برايل أو شفهياً.</w:t>
+          <w:sz w:val="26"/>
+          <w:szCs w:val="26"/>
+          <w:rtl/>
+        </w:rPr>
+        <w:t xml:space="preserve">للمكفوفين: تُقرأ العبارة ويجيب الطالب بكلمة «صح» أو «خطأ».</w:t>
       </w:r>
     </w:p>
     <w:tbl>
@@ -484,20 +484,20 @@
         <w:tblLook w:val="04A0" w:firstRow="1" w:lastRow="0" w:firstColumn="1" w:lastColumn="0" w:noHBand="0" w:noVBand="1"/>
       </w:tblPr>
       <w:tblGrid>
-        <w:gridCol w:w="1000"/>
-        <w:gridCol w:w="7240"/>
+        <w:gridCol w:w="1100"/>
+        <w:gridCol w:w="7140"/>
         <w:gridCol w:w="1100"/>
         <w:gridCol w:w="1100"/>
       </w:tblGrid>
       <w:tr>
         <w:trPr>
           <w:cantSplit/>
-          <w:trHeight w:val="440"/>
+          <w:trHeight w:val="460"/>
           <w:tblHeader/>
         </w:trPr>
         <w:tc>
           <w:tcPr>
-            <w:tcW w:w="1000" w:type="dxa"/>
+            <w:tcW w:w="1100" w:type="dxa"/>
             <w:shd w:val="clear" w:color="auto" w:fill="14532D"/>
             <w:vAlign w:val="center"/>
           </w:tcPr>
@@ -513,8 +513,8 @@
                 <w:b/>
                 <w:bCs/>
                 <w:color w:val="FFFFFF"/>
-                <w:sz w:val="24"/>
-                <w:szCs w:val="24"/>
+                <w:sz w:val="30"/>
+                <w:szCs w:val="30"/>
                 <w:rtl/>
               </w:rPr>
               <w:t xml:space="preserve">الرقم</w:t>
@@ -523,7 +523,7 @@
         </w:tc>
         <w:tc>
           <w:tcPr>
-            <w:tcW w:w="7240" w:type="dxa"/>
+            <w:tcW w:w="7140" w:type="dxa"/>
             <w:shd w:val="clear" w:color="auto" w:fill="14532D"/>
             <w:vAlign w:val="center"/>
           </w:tcPr>
@@ -539,8 +539,8 @@
                 <w:b/>
                 <w:bCs/>
                 <w:color w:val="FFFFFF"/>
-                <w:sz w:val="24"/>
-                <w:szCs w:val="24"/>
+                <w:sz w:val="30"/>
+                <w:szCs w:val="30"/>
                 <w:rtl/>
               </w:rPr>
               <w:t xml:space="preserve">العبارة</w:t>
@@ -565,8 +565,8 @@
                 <w:b/>
                 <w:bCs/>
                 <w:color w:val="FFFFFF"/>
-                <w:sz w:val="24"/>
-                <w:szCs w:val="24"/>
+                <w:sz w:val="30"/>
+                <w:szCs w:val="30"/>
                 <w:rtl/>
               </w:rPr>
               <w:t xml:space="preserve">صح</w:t>
@@ -591,8 +591,8 @@
                 <w:b/>
                 <w:bCs/>
                 <w:color w:val="FFFFFF"/>
-                <w:sz w:val="24"/>
-                <w:szCs w:val="24"/>
+                <w:sz w:val="30"/>
+                <w:szCs w:val="30"/>
                 <w:rtl/>
               </w:rPr>
               <w:t xml:space="preserve">خطأ</w:t>
@@ -607,7 +607,7 @@
         </w:trPr>
         <w:tc>
           <w:tcPr>
-            <w:tcW w:w="1000" w:type="dxa"/>
+            <w:tcW w:w="1100" w:type="dxa"/>
             <w:shd w:val="clear" w:color="auto" w:fill="EEF6F1"/>
             <w:vAlign w:val="center"/>
           </w:tcPr>
@@ -623,8 +623,8 @@
                 <w:b/>
                 <w:bCs/>
                 <w:color w:val="14532D"/>
-                <w:sz w:val="26"/>
-                <w:szCs w:val="26"/>
+                <w:sz w:val="30"/>
+                <w:szCs w:val="30"/>
                 <w:rtl/>
               </w:rPr>
               <w:t xml:space="preserve">1</w:t>
@@ -633,7 +633,7 @@
         </w:tc>
         <w:tc>
           <w:tcPr>
-            <w:tcW w:w="7240" w:type="dxa"/>
+            <w:tcW w:w="7140" w:type="dxa"/>
             <w:vAlign w:val="center"/>
           </w:tcPr>
           <w:p>
@@ -645,8 +645,8 @@
               <w:rPr>
                 <w:rFonts w:ascii="Calibri" w:eastAsia="Calibri" w:hAnsi="Calibri" w:cs="Calibri"/>
                 <w:color w:val="1A1A1A"/>
-                <w:sz w:val="26"/>
-                <w:szCs w:val="26"/>
+                <w:sz w:val="30"/>
+                <w:szCs w:val="30"/>
                 <w:rtl/>
               </w:rPr>
               <w:t xml:space="preserve">مجموع قياسات زوايا أي مثلث يساوي 180°‎.</w:t>
@@ -668,8 +668,8 @@
               <w:rPr>
                 <w:rFonts w:ascii="Calibri" w:eastAsia="Calibri" w:hAnsi="Calibri" w:cs="Calibri"/>
                 <w:color w:val="7A7A7A"/>
-                <w:sz w:val="32"/>
-                <w:szCs w:val="32"/>
+                <w:sz w:val="34"/>
+                <w:szCs w:val="34"/>
                 <w:rtl/>
               </w:rPr>
               <w:t xml:space="preserve">☐</w:t>
@@ -691,8 +691,8 @@
               <w:rPr>
                 <w:rFonts w:ascii="Calibri" w:eastAsia="Calibri" w:hAnsi="Calibri" w:cs="Calibri"/>
                 <w:color w:val="7A7A7A"/>
-                <w:sz w:val="32"/>
-                <w:szCs w:val="32"/>
+                <w:sz w:val="34"/>
+                <w:szCs w:val="34"/>
                 <w:rtl/>
               </w:rPr>
               <w:t xml:space="preserve">☐</w:t>
@@ -707,7 +707,7 @@
         </w:trPr>
         <w:tc>
           <w:tcPr>
-            <w:tcW w:w="1000" w:type="dxa"/>
+            <w:tcW w:w="1100" w:type="dxa"/>
             <w:shd w:val="clear" w:color="auto" w:fill="EEF6F1"/>
             <w:vAlign w:val="center"/>
           </w:tcPr>
@@ -723,8 +723,8 @@
                 <w:b/>
                 <w:bCs/>
                 <w:color w:val="14532D"/>
-                <w:sz w:val="26"/>
-                <w:szCs w:val="26"/>
+                <w:sz w:val="30"/>
+                <w:szCs w:val="30"/>
                 <w:rtl/>
               </w:rPr>
               <w:t xml:space="preserve">2</w:t>
@@ -733,7 +733,7 @@
         </w:tc>
         <w:tc>
           <w:tcPr>
-            <w:tcW w:w="7240" w:type="dxa"/>
+            <w:tcW w:w="7140" w:type="dxa"/>
             <w:vAlign w:val="center"/>
           </w:tcPr>
           <w:p>
@@ -745,8 +745,8 @@
               <w:rPr>
                 <w:rFonts w:ascii="Calibri" w:eastAsia="Calibri" w:hAnsi="Calibri" w:cs="Calibri"/>
                 <w:color w:val="1A1A1A"/>
-                <w:sz w:val="26"/>
-                <w:szCs w:val="26"/>
+                <w:sz w:val="30"/>
+                <w:szCs w:val="30"/>
                 <w:rtl/>
               </w:rPr>
               <w:t xml:space="preserve">في المثلث المتساوي الأضلاع، قياس كل زاوية يساوي 60°‎.</w:t>
@@ -768,8 +768,8 @@
               <w:rPr>
                 <w:rFonts w:ascii="Calibri" w:eastAsia="Calibri" w:hAnsi="Calibri" w:cs="Calibri"/>
                 <w:color w:val="7A7A7A"/>
-                <w:sz w:val="32"/>
-                <w:szCs w:val="32"/>
+                <w:sz w:val="34"/>
+                <w:szCs w:val="34"/>
                 <w:rtl/>
               </w:rPr>
               <w:t xml:space="preserve">☐</w:t>
@@ -791,8 +791,8 @@
               <w:rPr>
                 <w:rFonts w:ascii="Calibri" w:eastAsia="Calibri" w:hAnsi="Calibri" w:cs="Calibri"/>
                 <w:color w:val="7A7A7A"/>
-                <w:sz w:val="32"/>
-                <w:szCs w:val="32"/>
+                <w:sz w:val="34"/>
+                <w:szCs w:val="34"/>
                 <w:rtl/>
               </w:rPr>
               <w:t xml:space="preserve">☐</w:t>
@@ -807,7 +807,7 @@
         </w:trPr>
         <w:tc>
           <w:tcPr>
-            <w:tcW w:w="1000" w:type="dxa"/>
+            <w:tcW w:w="1100" w:type="dxa"/>
             <w:shd w:val="clear" w:color="auto" w:fill="EEF6F1"/>
             <w:vAlign w:val="center"/>
           </w:tcPr>
@@ -823,8 +823,8 @@
                 <w:b/>
                 <w:bCs/>
                 <w:color w:val="14532D"/>
-                <w:sz w:val="26"/>
-                <w:szCs w:val="26"/>
+                <w:sz w:val="30"/>
+                <w:szCs w:val="30"/>
                 <w:rtl/>
               </w:rPr>
               <w:t xml:space="preserve">3</w:t>
@@ -833,7 +833,7 @@
         </w:tc>
         <w:tc>
           <w:tcPr>
-            <w:tcW w:w="7240" w:type="dxa"/>
+            <w:tcW w:w="7140" w:type="dxa"/>
             <w:vAlign w:val="center"/>
           </w:tcPr>
           <w:p>
@@ -845,8 +845,8 @@
               <w:rPr>
                 <w:rFonts w:ascii="Calibri" w:eastAsia="Calibri" w:hAnsi="Calibri" w:cs="Calibri"/>
                 <w:color w:val="1A1A1A"/>
-                <w:sz w:val="26"/>
-                <w:szCs w:val="26"/>
+                <w:sz w:val="30"/>
+                <w:szCs w:val="30"/>
                 <w:rtl/>
               </w:rPr>
               <w:t xml:space="preserve">يمكن أن يحتوي المثلث على زاويتين قائمتين.</w:t>
@@ -868,8 +868,8 @@
               <w:rPr>
                 <w:rFonts w:ascii="Calibri" w:eastAsia="Calibri" w:hAnsi="Calibri" w:cs="Calibri"/>
                 <w:color w:val="7A7A7A"/>
-                <w:sz w:val="32"/>
-                <w:szCs w:val="32"/>
+                <w:sz w:val="34"/>
+                <w:szCs w:val="34"/>
                 <w:rtl/>
               </w:rPr>
               <w:t xml:space="preserve">☐</w:t>
@@ -891,8 +891,8 @@
               <w:rPr>
                 <w:rFonts w:ascii="Calibri" w:eastAsia="Calibri" w:hAnsi="Calibri" w:cs="Calibri"/>
                 <w:color w:val="7A7A7A"/>
-                <w:sz w:val="32"/>
-                <w:szCs w:val="32"/>
+                <w:sz w:val="34"/>
+                <w:szCs w:val="34"/>
                 <w:rtl/>
               </w:rPr>
               <w:t xml:space="preserve">☐</w:t>
@@ -907,7 +907,7 @@
         </w:trPr>
         <w:tc>
           <w:tcPr>
-            <w:tcW w:w="1000" w:type="dxa"/>
+            <w:tcW w:w="1100" w:type="dxa"/>
             <w:shd w:val="clear" w:color="auto" w:fill="EEF6F1"/>
             <w:vAlign w:val="center"/>
           </w:tcPr>
@@ -923,8 +923,8 @@
                 <w:b/>
                 <w:bCs/>
                 <w:color w:val="14532D"/>
-                <w:sz w:val="26"/>
-                <w:szCs w:val="26"/>
+                <w:sz w:val="30"/>
+                <w:szCs w:val="30"/>
                 <w:rtl/>
               </w:rPr>
               <w:t xml:space="preserve">4</w:t>
@@ -933,7 +933,7 @@
         </w:tc>
         <w:tc>
           <w:tcPr>
-            <w:tcW w:w="7240" w:type="dxa"/>
+            <w:tcW w:w="7140" w:type="dxa"/>
             <w:vAlign w:val="center"/>
           </w:tcPr>
           <w:p>
@@ -945,8 +945,8 @@
               <w:rPr>
                 <w:rFonts w:ascii="Calibri" w:eastAsia="Calibri" w:hAnsi="Calibri" w:cs="Calibri"/>
                 <w:color w:val="1A1A1A"/>
-                <w:sz w:val="26"/>
-                <w:szCs w:val="26"/>
+                <w:sz w:val="30"/>
+                <w:szCs w:val="30"/>
                 <w:rtl/>
               </w:rPr>
               <w:t xml:space="preserve">تقريب العدد 5.49 إلى أقرب عدد صحيح هو 6.</w:t>
@@ -968,8 +968,8 @@
               <w:rPr>
                 <w:rFonts w:ascii="Calibri" w:eastAsia="Calibri" w:hAnsi="Calibri" w:cs="Calibri"/>
                 <w:color w:val="7A7A7A"/>
-                <w:sz w:val="32"/>
-                <w:szCs w:val="32"/>
+                <w:sz w:val="34"/>
+                <w:szCs w:val="34"/>
                 <w:rtl/>
               </w:rPr>
               <w:t xml:space="preserve">☐</w:t>
@@ -991,8 +991,8 @@
               <w:rPr>
                 <w:rFonts w:ascii="Calibri" w:eastAsia="Calibri" w:hAnsi="Calibri" w:cs="Calibri"/>
                 <w:color w:val="7A7A7A"/>
-                <w:sz w:val="32"/>
-                <w:szCs w:val="32"/>
+                <w:sz w:val="34"/>
+                <w:szCs w:val="34"/>
                 <w:rtl/>
               </w:rPr>
               <w:t xml:space="preserve">☐</w:t>
@@ -1007,7 +1007,7 @@
         </w:trPr>
         <w:tc>
           <w:tcPr>
-            <w:tcW w:w="1000" w:type="dxa"/>
+            <w:tcW w:w="1100" w:type="dxa"/>
             <w:shd w:val="clear" w:color="auto" w:fill="EEF6F1"/>
             <w:vAlign w:val="center"/>
           </w:tcPr>
@@ -1023,8 +1023,8 @@
                 <w:b/>
                 <w:bCs/>
                 <w:color w:val="14532D"/>
-                <w:sz w:val="26"/>
-                <w:szCs w:val="26"/>
+                <w:sz w:val="30"/>
+                <w:szCs w:val="30"/>
                 <w:rtl/>
               </w:rPr>
               <w:t xml:space="preserve">5</w:t>
@@ -1033,7 +1033,7 @@
         </w:tc>
         <w:tc>
           <w:tcPr>
-            <w:tcW w:w="7240" w:type="dxa"/>
+            <w:tcW w:w="7140" w:type="dxa"/>
             <w:vAlign w:val="center"/>
           </w:tcPr>
           <w:p>
@@ -1045,8 +1045,8 @@
               <w:rPr>
                 <w:rFonts w:ascii="Calibri" w:eastAsia="Calibri" w:hAnsi="Calibri" w:cs="Calibri"/>
                 <w:color w:val="1A1A1A"/>
-                <w:sz w:val="26"/>
-                <w:szCs w:val="26"/>
+                <w:sz w:val="30"/>
+                <w:szCs w:val="30"/>
                 <w:rtl/>
               </w:rPr>
               <w:t xml:space="preserve">طول القطر في الدائرة يساوي ضعف طول الشعاع.</w:t>
@@ -1068,8 +1068,8 @@
               <w:rPr>
                 <w:rFonts w:ascii="Calibri" w:eastAsia="Calibri" w:hAnsi="Calibri" w:cs="Calibri"/>
                 <w:color w:val="7A7A7A"/>
-                <w:sz w:val="32"/>
-                <w:szCs w:val="32"/>
+                <w:sz w:val="34"/>
+                <w:szCs w:val="34"/>
                 <w:rtl/>
               </w:rPr>
               <w:t xml:space="preserve">☐</w:t>
@@ -1091,8 +1091,8 @@
               <w:rPr>
                 <w:rFonts w:ascii="Calibri" w:eastAsia="Calibri" w:hAnsi="Calibri" w:cs="Calibri"/>
                 <w:color w:val="7A7A7A"/>
-                <w:sz w:val="32"/>
-                <w:szCs w:val="32"/>
+                <w:sz w:val="34"/>
+                <w:szCs w:val="34"/>
                 <w:rtl/>
               </w:rPr>
               <w:t xml:space="preserve">☐</w:t>
@@ -1107,7 +1107,7 @@
         </w:trPr>
         <w:tc>
           <w:tcPr>
-            <w:tcW w:w="1000" w:type="dxa"/>
+            <w:tcW w:w="1100" w:type="dxa"/>
             <w:shd w:val="clear" w:color="auto" w:fill="EEF6F1"/>
             <w:vAlign w:val="center"/>
           </w:tcPr>
@@ -1123,8 +1123,8 @@
                 <w:b/>
                 <w:bCs/>
                 <w:color w:val="14532D"/>
-                <w:sz w:val="26"/>
-                <w:szCs w:val="26"/>
+                <w:sz w:val="30"/>
+                <w:szCs w:val="30"/>
                 <w:rtl/>
               </w:rPr>
               <w:t xml:space="preserve">6</w:t>
@@ -1133,7 +1133,7 @@
         </w:tc>
         <w:tc>
           <w:tcPr>
-            <w:tcW w:w="7240" w:type="dxa"/>
+            <w:tcW w:w="7140" w:type="dxa"/>
             <w:vAlign w:val="center"/>
           </w:tcPr>
           <w:p>
@@ -1145,8 +1145,8 @@
               <w:rPr>
                 <w:rFonts w:ascii="Calibri" w:eastAsia="Calibri" w:hAnsi="Calibri" w:cs="Calibri"/>
                 <w:color w:val="1A1A1A"/>
-                <w:sz w:val="26"/>
-                <w:szCs w:val="26"/>
+                <w:sz w:val="30"/>
+                <w:szCs w:val="30"/>
                 <w:rtl/>
               </w:rPr>
               <w:t xml:space="preserve">العدد العشري 0.7 يُكتب على شكل الكسر 7/100.</w:t>
@@ -1168,8 +1168,8 @@
               <w:rPr>
                 <w:rFonts w:ascii="Calibri" w:eastAsia="Calibri" w:hAnsi="Calibri" w:cs="Calibri"/>
                 <w:color w:val="7A7A7A"/>
-                <w:sz w:val="32"/>
-                <w:szCs w:val="32"/>
+                <w:sz w:val="34"/>
+                <w:szCs w:val="34"/>
                 <w:rtl/>
               </w:rPr>
               <w:t xml:space="preserve">☐</w:t>
@@ -1191,8 +1191,8 @@
               <w:rPr>
                 <w:rFonts w:ascii="Calibri" w:eastAsia="Calibri" w:hAnsi="Calibri" w:cs="Calibri"/>
                 <w:color w:val="7A7A7A"/>
-                <w:sz w:val="32"/>
-                <w:szCs w:val="32"/>
+                <w:sz w:val="34"/>
+                <w:szCs w:val="34"/>
                 <w:rtl/>
               </w:rPr>
               <w:t xml:space="preserve">☐</w:t>
@@ -1207,7 +1207,7 @@
         </w:trPr>
         <w:tc>
           <w:tcPr>
-            <w:tcW w:w="1000" w:type="dxa"/>
+            <w:tcW w:w="1100" w:type="dxa"/>
             <w:shd w:val="clear" w:color="auto" w:fill="EEF6F1"/>
             <w:vAlign w:val="center"/>
           </w:tcPr>
@@ -1223,8 +1223,8 @@
                 <w:b/>
                 <w:bCs/>
                 <w:color w:val="14532D"/>
-                <w:sz w:val="26"/>
-                <w:szCs w:val="26"/>
+                <w:sz w:val="30"/>
+                <w:szCs w:val="30"/>
                 <w:rtl/>
               </w:rPr>
               <w:t xml:space="preserve">7</w:t>
@@ -1233,7 +1233,7 @@
         </w:tc>
         <w:tc>
           <w:tcPr>
-            <w:tcW w:w="7240" w:type="dxa"/>
+            <w:tcW w:w="7140" w:type="dxa"/>
             <w:vAlign w:val="center"/>
           </w:tcPr>
           <w:p>
@@ -1245,8 +1245,8 @@
               <w:rPr>
                 <w:rFonts w:ascii="Calibri" w:eastAsia="Calibri" w:hAnsi="Calibri" w:cs="Calibri"/>
                 <w:color w:val="1A1A1A"/>
-                <w:sz w:val="26"/>
-                <w:szCs w:val="26"/>
+                <w:sz w:val="30"/>
+                <w:szCs w:val="30"/>
                 <w:rtl/>
               </w:rPr>
               <w:t xml:space="preserve">م.م.أص ( 4 , 6 ) = 12</w:t>
@@ -1268,8 +1268,8 @@
               <w:rPr>
                 <w:rFonts w:ascii="Calibri" w:eastAsia="Calibri" w:hAnsi="Calibri" w:cs="Calibri"/>
                 <w:color w:val="7A7A7A"/>
-                <w:sz w:val="32"/>
-                <w:szCs w:val="32"/>
+                <w:sz w:val="34"/>
+                <w:szCs w:val="34"/>
                 <w:rtl/>
               </w:rPr>
               <w:t xml:space="preserve">☐</w:t>
@@ -1291,8 +1291,8 @@
               <w:rPr>
                 <w:rFonts w:ascii="Calibri" w:eastAsia="Calibri" w:hAnsi="Calibri" w:cs="Calibri"/>
                 <w:color w:val="7A7A7A"/>
-                <w:sz w:val="32"/>
-                <w:szCs w:val="32"/>
+                <w:sz w:val="34"/>
+                <w:szCs w:val="34"/>
                 <w:rtl/>
               </w:rPr>
               <w:t xml:space="preserve">☐</w:t>
@@ -1303,6 +1303,7 @@
     </w:tbl>
     <w:p>
       <w:pPr>
+        <w:pageBreakBefore/>
         <w:bidi/>
         <w:spacing w:before="0" w:after="0" w:line="200" w:lineRule="exact"/>
       </w:pPr>
@@ -1336,7 +1337,7 @@
       <w:tr>
         <w:trPr>
           <w:cantSplit/>
-          <w:trHeight w:val="560"/>
+          <w:trHeight w:val="580"/>
         </w:trPr>
         <w:tc>
           <w:tcPr>
@@ -1386,8 +1387,8 @@
                 <w:b/>
                 <w:bCs/>
                 <w:color w:val="14532D"/>
-                <w:sz w:val="26"/>
-                <w:szCs w:val="26"/>
+                <w:sz w:val="28"/>
+                <w:szCs w:val="28"/>
                 <w:rtl/>
               </w:rPr>
               <w:t xml:space="preserve">3 علامات</w:t>
@@ -1399,26 +1400,24 @@
     <w:p>
       <w:pPr>
         <w:bidi/>
-        <w:spacing w:before="0" w:after="0" w:line="120" w:lineRule="exact"/>
-      </w:pPr>
-    </w:p>
-    <w:p>
-      <w:pPr>
-        <w:bidi/>
-        <w:spacing w:after="50" w:line="276" w:lineRule="auto"/>
-        <w:rPr>
-          <w:sz w:val="36"/>
-          <w:szCs w:val="36"/>
-        </w:rPr>
-      </w:pPr>
-      <w:r>
-        <w:rPr>
-          <w:rFonts w:ascii="Calibri" w:eastAsia="Calibri" w:hAnsi="Calibri" w:cs="Calibri"/>
-          <w:sz w:val="36"/>
-          <w:szCs w:val="36"/>
-          <w:rtl/>
-        </w:rPr>
-        <w:t>إليك ما يلي:</w:t>
+        <w:spacing w:before="0" w:after="0" w:line="140" w:lineRule="exact"/>
+      </w:pPr>
+    </w:p>
+    <w:p>
+      <w:pPr>
+        <w:keepNext/>
+        <w:bidi/>
+        <w:spacing w:before="0" w:after="80" w:line="276" w:lineRule="auto"/>
+      </w:pPr>
+      <w:r>
+        <w:rPr>
+          <w:rFonts w:ascii="Calibri" w:eastAsia="Calibri" w:hAnsi="Calibri" w:cs="Calibri"/>
+          <w:color w:val="1A1A1A"/>
+          <w:sz w:val="34"/>
+          <w:szCs w:val="34"/>
+          <w:rtl/>
+        </w:rPr>
+        <w:t xml:space="preserve">إليك قائمة أسعار بعض المواد في السوبر ماركت:</w:t>
       </w:r>
     </w:p>
     <w:tbl>
@@ -1746,50 +1745,50 @@
     </w:tbl>
     <w:p>
       <w:pPr>
-        <w:spacing w:after="110" w:line="276" w:lineRule="auto"/>
-        <w:jc w:val="right"/>
-        <w:rPr>
-          <w:sz w:val="36"/>
-          <w:szCs w:val="36"/>
-        </w:rPr>
-      </w:pPr>
-    </w:p>
-    <w:p>
-      <w:pPr>
-        <w:bidi/>
-        <w:spacing w:after="50" w:line="276" w:lineRule="auto"/>
-        <w:rPr>
-          <w:sz w:val="36"/>
-          <w:szCs w:val="36"/>
-        </w:rPr>
-      </w:pPr>
-      <w:r>
-        <w:rPr>
-          <w:rFonts w:ascii="Calibri" w:eastAsia="Calibri" w:hAnsi="Calibri" w:cs="Calibri"/>
-          <w:sz w:val="36"/>
-          <w:szCs w:val="36"/>
-          <w:rtl/>
-        </w:rPr>
-        <w:t>استناداً إلى قيمة الأسعار حدد التالي:</w:t>
-      </w:r>
-    </w:p>
-    <w:p>
-      <w:pPr>
-        <w:bidi/>
-        <w:spacing w:after="50" w:line="276" w:lineRule="auto"/>
-        <w:rPr>
-          <w:sz w:val="36"/>
-          <w:szCs w:val="36"/>
-        </w:rPr>
-      </w:pPr>
-      <w:r>
-        <w:rPr>
-          <w:rFonts w:ascii="Calibri" w:eastAsia="Calibri" w:hAnsi="Calibri" w:cs="Calibri"/>
-          <w:sz w:val="36"/>
-          <w:szCs w:val="36"/>
-          <w:rtl/>
-        </w:rPr>
-        <w:t>1) القيمة المدفوعة في حال اشترت ندى كيلو قهوة وقارورتين من عصير الرمان.</w:t>
+        <w:keepNext/>
+        <w:bidi/>
+        <w:spacing w:before="160" w:after="40" w:line="276" w:lineRule="auto"/>
+      </w:pPr>
+      <w:r>
+        <w:rPr>
+          <w:rFonts w:ascii="Calibri" w:eastAsia="Calibri" w:hAnsi="Calibri" w:cs="Calibri"/>
+          <w:b/>
+          <w:bCs/>
+          <w:color w:val="1A1A1A"/>
+          <w:sz w:val="34"/>
+          <w:szCs w:val="34"/>
+          <w:rtl/>
+        </w:rPr>
+        <w:t xml:space="preserve">استناداً إلى قائمة الأسعار أجب عمّا يلي:</w:t>
+      </w:r>
+    </w:p>
+    <w:p>
+      <w:pPr>
+        <w:keepNext/>
+        <w:bidi/>
+        <w:spacing w:before="120" w:after="40" w:line="276" w:lineRule="auto"/>
+      </w:pPr>
+      <w:r>
+        <w:rPr>
+          <w:rFonts w:ascii="Calibri" w:eastAsia="Calibri" w:hAnsi="Calibri" w:cs="Calibri"/>
+          <w:b/>
+          <w:bCs/>
+          <w:color w:val="14532D"/>
+          <w:sz w:val="34"/>
+          <w:szCs w:val="34"/>
+          <w:rtl/>
+        </w:rPr>
+        <w:t xml:space="preserve">1) </w:t>
+      </w:r>
+      <w:r>
+        <w:rPr>
+          <w:rFonts w:ascii="Calibri" w:eastAsia="Calibri" w:hAnsi="Calibri" w:cs="Calibri"/>
+          <w:color w:val="1A1A1A"/>
+          <w:sz w:val="34"/>
+          <w:szCs w:val="34"/>
+          <w:rtl/>
+        </w:rPr>
+        <w:t xml:space="preserve">القيمة المدفوعة إذا اشترت ندى كيلو قهوة وقارورتين من عصير الرمان.</w:t>
       </w:r>
       <w:r>
         <w:rPr>
@@ -1797,71 +1796,11 @@
           <w:b/>
           <w:bCs/>
           <w:color w:val="B8860B"/>
-          <w:sz w:val="22"/>
-          <w:szCs w:val="22"/>
-          <w:rtl/>
-        </w:rPr>
-        <w:t xml:space="preserve">   (1.5 علامة)</w:t>
-      </w:r>
-    </w:p>
-    <w:p>
-      <w:pPr>
-        <w:bidi/>
-        <w:spacing w:after="50" w:line="276" w:lineRule="auto"/>
-        <w:rPr>
-          <w:sz w:val="36"/>
-          <w:szCs w:val="36"/>
-        </w:rPr>
-      </w:pPr>
-      <w:r>
-        <w:rPr>
-          <w:rFonts w:ascii="Calibri" w:eastAsia="Calibri" w:hAnsi="Calibri" w:cs="Calibri"/>
-          <w:sz w:val="36"/>
-          <w:szCs w:val="36"/>
-          <w:rtl/>
-        </w:rPr>
-        <w:t>2) تراجع سعر كل صنف 10% حدد قائمة الأسعار الجديدة.</w:t>
-      </w:r>
-      <w:r>
-        <w:rPr>
-          <w:rFonts w:ascii="Calibri" w:eastAsia="Calibri" w:hAnsi="Calibri" w:cs="Calibri"/>
-          <w:b/>
-          <w:bCs/>
-          <w:color w:val="B8860B"/>
-          <w:sz w:val="22"/>
-          <w:szCs w:val="22"/>
-          <w:rtl/>
-        </w:rPr>
-        <w:t xml:space="preserve">   (1.5 علامة)</w:t>
-      </w:r>
-    </w:p>
-    <w:p>
-      <w:pPr>
-        <w:spacing w:after="60" w:line="276" w:lineRule="auto"/>
-        <w:jc w:val="right"/>
-        <w:rPr>
-          <w:sz w:val="36"/>
-          <w:szCs w:val="36"/>
-        </w:rPr>
-      </w:pPr>
-    </w:p>
-    <w:p>
-      <w:pPr>
-        <w:bidi/>
-        <w:spacing w:after="80" w:line="276" w:lineRule="auto"/>
-        <w:rPr>
-          <w:sz w:val="36"/>
-          <w:szCs w:val="36"/>
-        </w:rPr>
-      </w:pPr>
-      <w:r>
-        <w:rPr>
-          <w:rFonts w:ascii="Calibri" w:eastAsia="Calibri" w:hAnsi="Calibri" w:cs="Calibri"/>
-          <w:sz w:val="36"/>
-          <w:szCs w:val="36"/>
-          <w:rtl/>
-        </w:rPr>
-        <w:t>الحل:</w:t>
+          <w:sz w:val="24"/>
+          <w:szCs w:val="24"/>
+          <w:rtl/>
+        </w:rPr>
+        <w:t xml:space="preserve">  (1.5)</w:t>
       </w:r>
     </w:p>
     <w:p>
@@ -1906,22 +1845,43 @@
     </w:p>
     <w:p>
       <w:pPr>
-        <w:pBdr>
-          <w:bottom w:val="dotted" w:sz="6" w:space="1" w:color="9E9E9E"/>
-          <w:between w:val="dotted" w:sz="6" w:space="1" w:color="9E9E9E"/>
-        </w:pBdr>
-        <w:bidi/>
-        <w:spacing w:before="300" w:after="0" w:line="276" w:lineRule="auto"/>
-      </w:pPr>
+        <w:keepNext/>
+        <w:bidi/>
+        <w:spacing w:before="200" w:after="40" w:line="276" w:lineRule="auto"/>
+      </w:pPr>
+      <w:r>
+        <w:rPr>
+          <w:rFonts w:ascii="Calibri" w:eastAsia="Calibri" w:hAnsi="Calibri" w:cs="Calibri"/>
+          <w:b/>
+          <w:bCs/>
+          <w:color w:val="14532D"/>
+          <w:sz w:val="34"/>
+          <w:szCs w:val="34"/>
+          <w:rtl/>
+        </w:rPr>
+        <w:t xml:space="preserve">2) </w:t>
+      </w:r>
       <w:r>
         <w:rPr>
           <w:rFonts w:ascii="Calibri" w:eastAsia="Calibri" w:hAnsi="Calibri" w:cs="Calibri"/>
           <w:color w:val="1A1A1A"/>
-          <w:sz w:val="28"/>
-          <w:szCs w:val="28"/>
-          <w:rtl/>
-        </w:rPr>
-        <w:t xml:space="preserve"/>
+          <w:sz w:val="34"/>
+          <w:szCs w:val="34"/>
+          <w:rtl/>
+        </w:rPr>
+        <w:t xml:space="preserve">تراجع سعر كل صنف 10%، حدّد قائمة الأسعار الجديدة.</w:t>
+      </w:r>
+      <w:r>
+        <w:rPr>
+          <w:rFonts w:ascii="Calibri" w:eastAsia="Calibri" w:hAnsi="Calibri" w:cs="Calibri"/>
+          <w:b/>
+          <w:bCs/>
+          <w:color w:val="B8860B"/>
+          <w:sz w:val="24"/>
+          <w:szCs w:val="24"/>
+          <w:rtl/>
+        </w:rPr>
+        <w:t xml:space="preserve">  (1.5)</w:t>
       </w:r>
     </w:p>
     <w:p>
@@ -1999,7 +1959,7 @@
       <w:tr>
         <w:trPr>
           <w:cantSplit/>
-          <w:trHeight w:val="560"/>
+          <w:trHeight w:val="580"/>
         </w:trPr>
         <w:tc>
           <w:tcPr>
@@ -2049,8 +2009,8 @@
                 <w:b/>
                 <w:bCs/>
                 <w:color w:val="14532D"/>
-                <w:sz w:val="26"/>
-                <w:szCs w:val="26"/>
+                <w:sz w:val="28"/>
+                <w:szCs w:val="28"/>
                 <w:rtl/>
               </w:rPr>
               <w:t xml:space="preserve">1.5 علامة</w:t>
@@ -2062,38 +2022,35 @@
     <w:p>
       <w:pPr>
         <w:bidi/>
-        <w:spacing w:before="0" w:after="0" w:line="120" w:lineRule="exact"/>
-      </w:pPr>
-    </w:p>
-    <w:p>
-      <w:pPr>
-        <w:bidi/>
-        <w:spacing w:after="90" w:line="276" w:lineRule="auto"/>
-        <w:rPr>
-          <w:sz w:val="36"/>
-          <w:szCs w:val="36"/>
-        </w:rPr>
+        <w:spacing w:before="0" w:after="0" w:line="140" w:lineRule="exact"/>
+      </w:pPr>
+    </w:p>
+    <w:p>
+      <w:pPr>
+        <w:bidi/>
+        <w:spacing w:before="160" w:after="40" w:line="276" w:lineRule="auto"/>
       </w:pPr>
       <w:r>
         <w:rPr>
           <w:rFonts w:ascii="Calibri" w:eastAsia="Calibri" w:hAnsi="Calibri" w:cs="Calibri"/>
           <w:b/>
           <w:bCs/>
-          <w:sz w:val="36"/>
-          <w:szCs w:val="36"/>
-          <w:rtl/>
-        </w:rPr>
-        <w:t xml:space="preserve">0.638= </w:t>
-      </w:r>
-      <w:r>
-        <w:rPr>
-          <w:rFonts w:ascii="Calibri" w:eastAsia="Calibri" w:hAnsi="Calibri" w:cs="Calibri"/>
-          <w:color w:val="808080"/>
-          <w:sz w:val="36"/>
-          <w:szCs w:val="36"/>
-          <w:rtl/>
-        </w:rPr>
-        <w:t>__________________________________</w:t>
+          <w:color w:val="1A1A1A"/>
+          <w:sz w:val="34"/>
+          <w:szCs w:val="34"/>
+          <w:rtl/>
+        </w:rPr>
+        <w:t xml:space="preserve">0.638  =  </w:t>
+      </w:r>
+      <w:r>
+        <w:rPr>
+          <w:rFonts w:ascii="Calibri" w:eastAsia="Calibri" w:hAnsi="Calibri" w:cs="Calibri"/>
+          <w:color w:val="9E9E9E"/>
+          <w:sz w:val="34"/>
+          <w:szCs w:val="34"/>
+          <w:rtl/>
+        </w:rPr>
+        <w:t xml:space="preserve">......................................</w:t>
       </w:r>
       <w:r>
         <w:rPr>
@@ -2101,42 +2058,39 @@
           <w:b/>
           <w:bCs/>
           <w:color w:val="B8860B"/>
-          <w:sz w:val="22"/>
-          <w:szCs w:val="22"/>
-          <w:rtl/>
-        </w:rPr>
-        <w:t xml:space="preserve">   (0.5)</w:t>
-      </w:r>
-    </w:p>
-    <w:p>
-      <w:pPr>
-        <w:bidi/>
-        <w:spacing w:after="90" w:line="276" w:lineRule="auto"/>
-        <w:rPr>
-          <w:sz w:val="36"/>
-          <w:szCs w:val="36"/>
-        </w:rPr>
+          <w:sz w:val="24"/>
+          <w:szCs w:val="24"/>
+          <w:rtl/>
+        </w:rPr>
+        <w:t xml:space="preserve">  (0.5)</w:t>
+      </w:r>
+    </w:p>
+    <w:p>
+      <w:pPr>
+        <w:bidi/>
+        <w:spacing w:before="160" w:after="40" w:line="276" w:lineRule="auto"/>
       </w:pPr>
       <w:r>
         <w:rPr>
           <w:rFonts w:ascii="Calibri" w:eastAsia="Calibri" w:hAnsi="Calibri" w:cs="Calibri"/>
           <w:b/>
           <w:bCs/>
-          <w:sz w:val="36"/>
-          <w:szCs w:val="36"/>
-          <w:rtl/>
-        </w:rPr>
-        <w:t xml:space="preserve">45.9= </w:t>
-      </w:r>
-      <w:r>
-        <w:rPr>
-          <w:rFonts w:ascii="Calibri" w:eastAsia="Calibri" w:hAnsi="Calibri" w:cs="Calibri"/>
-          <w:color w:val="808080"/>
-          <w:sz w:val="36"/>
-          <w:szCs w:val="36"/>
-          <w:rtl/>
-        </w:rPr>
-        <w:t>__________________________________</w:t>
+          <w:color w:val="1A1A1A"/>
+          <w:sz w:val="34"/>
+          <w:szCs w:val="34"/>
+          <w:rtl/>
+        </w:rPr>
+        <w:t xml:space="preserve">45.9  =  </w:t>
+      </w:r>
+      <w:r>
+        <w:rPr>
+          <w:rFonts w:ascii="Calibri" w:eastAsia="Calibri" w:hAnsi="Calibri" w:cs="Calibri"/>
+          <w:color w:val="9E9E9E"/>
+          <w:sz w:val="34"/>
+          <w:szCs w:val="34"/>
+          <w:rtl/>
+        </w:rPr>
+        <w:t xml:space="preserve">......................................</w:t>
       </w:r>
       <w:r>
         <w:rPr>
@@ -2144,45 +2098,39 @@
           <w:b/>
           <w:bCs/>
           <w:color w:val="B8860B"/>
-          <w:sz w:val="22"/>
-          <w:szCs w:val="22"/>
-          <w:rtl/>
-        </w:rPr>
-        <w:t xml:space="preserve">   (0.5)</w:t>
-      </w:r>
-    </w:p>
-    <w:p>
-      <w:pPr>
-        <w:bidi/>
-        <w:spacing w:after="90" w:line="276" w:lineRule="auto"/>
-        <w:rPr>
-          <w:rFonts w:ascii="Calibri" w:eastAsia="Calibri" w:hAnsi="Calibri" w:cs="Calibri"/>
-          <w:color w:val="808080"/>
-          <w:sz w:val="36"/>
-          <w:szCs w:val="36"/>
-          <w:rtl/>
-        </w:rPr>
+          <w:sz w:val="24"/>
+          <w:szCs w:val="24"/>
+          <w:rtl/>
+        </w:rPr>
+        <w:t xml:space="preserve">  (0.5)</w:t>
+      </w:r>
+    </w:p>
+    <w:p>
+      <w:pPr>
+        <w:bidi/>
+        <w:spacing w:before="160" w:after="40" w:line="276" w:lineRule="auto"/>
       </w:pPr>
       <w:r>
         <w:rPr>
           <w:rFonts w:ascii="Calibri" w:eastAsia="Calibri" w:hAnsi="Calibri" w:cs="Calibri"/>
           <w:b/>
           <w:bCs/>
-          <w:sz w:val="36"/>
-          <w:szCs w:val="36"/>
-          <w:rtl/>
-        </w:rPr>
-        <w:t xml:space="preserve">0.0056= </w:t>
-      </w:r>
-      <w:r>
-        <w:rPr>
-          <w:rFonts w:ascii="Calibri" w:eastAsia="Calibri" w:hAnsi="Calibri" w:cs="Calibri"/>
-          <w:color w:val="808080"/>
-          <w:sz w:val="36"/>
-          <w:szCs w:val="36"/>
-          <w:rtl/>
-        </w:rPr>
-        <w:t>__________________________________</w:t>
+          <w:color w:val="1A1A1A"/>
+          <w:sz w:val="34"/>
+          <w:szCs w:val="34"/>
+          <w:rtl/>
+        </w:rPr>
+        <w:t xml:space="preserve">0.0056  =  </w:t>
+      </w:r>
+      <w:r>
+        <w:rPr>
+          <w:rFonts w:ascii="Calibri" w:eastAsia="Calibri" w:hAnsi="Calibri" w:cs="Calibri"/>
+          <w:color w:val="9E9E9E"/>
+          <w:sz w:val="34"/>
+          <w:szCs w:val="34"/>
+          <w:rtl/>
+        </w:rPr>
+        <w:t xml:space="preserve">......................................</w:t>
       </w:r>
       <w:r>
         <w:rPr>
@@ -2190,11 +2138,11 @@
           <w:b/>
           <w:bCs/>
           <w:color w:val="B8860B"/>
-          <w:sz w:val="22"/>
-          <w:szCs w:val="22"/>
-          <w:rtl/>
-        </w:rPr>
-        <w:t xml:space="preserve">   (0.5)</w:t>
+          <w:sz w:val="24"/>
+          <w:szCs w:val="24"/>
+          <w:rtl/>
+        </w:rPr>
+        <w:t xml:space="preserve">  (0.5)</w:t>
       </w:r>
     </w:p>
     <w:p>
@@ -2232,7 +2180,7 @@
       <w:tr>
         <w:trPr>
           <w:cantSplit/>
-          <w:trHeight w:val="560"/>
+          <w:trHeight w:val="580"/>
         </w:trPr>
         <w:tc>
           <w:tcPr>
@@ -2259,7 +2207,7 @@
                 <w:szCs w:val="32"/>
                 <w:rtl/>
               </w:rPr>
-              <w:t xml:space="preserve">السؤال الرابع: إنجاز العمليات الحسابية التالية</w:t>
+              <w:t xml:space="preserve">السؤال الرابع: أنجز العمليات الحسابية التالية</w:t>
             </w:r>
           </w:p>
         </w:tc>
@@ -2282,8 +2230,8 @@
                 <w:b/>
                 <w:bCs/>
                 <w:color w:val="14532D"/>
-                <w:sz w:val="26"/>
-                <w:szCs w:val="26"/>
+                <w:sz w:val="28"/>
+                <w:szCs w:val="28"/>
                 <w:rtl/>
               </w:rPr>
               <w:t xml:space="preserve">علامتان</w:t>
@@ -2295,38 +2243,28 @@
     <w:p>
       <w:pPr>
         <w:bidi/>
-        <w:spacing w:before="0" w:after="0" w:line="120" w:lineRule="exact"/>
-      </w:pPr>
-    </w:p>
-    <w:p>
-      <w:pPr>
-        <w:bidi/>
-        <w:spacing w:after="110" w:line="276" w:lineRule="auto"/>
+        <w:spacing w:before="0" w:after="0" w:line="140" w:lineRule="exact"/>
+      </w:pPr>
+    </w:p>
+    <w:p>
+      <w:pPr>
+        <w:bidi/>
+        <w:spacing w:before="160" w:after="40" w:line="276" w:lineRule="auto"/>
+      </w:pPr>
+      <w:r>
         <w:rPr>
           <w:rFonts w:ascii="Calibri" w:eastAsia="Calibri" w:hAnsi="Calibri" w:cs="Calibri"/>
           <w:b/>
           <w:bCs/>
-          <w:sz w:val="36"/>
-          <w:szCs w:val="36"/>
-          <w:rtl/>
-        </w:rPr>
-      </w:pPr>
-      <w:r>
-        <w:rPr>
-          <w:rFonts w:ascii="Calibri" w:eastAsia="Calibri" w:hAnsi="Calibri" w:cs="Calibri"/>
-          <w:b/>
-          <w:bCs/>
-          <w:sz w:val="36"/>
-          <w:szCs w:val="36"/>
-          <w:rtl/>
-        </w:rPr>
-        <w:t xml:space="preserve">1)  </w:t>
+          <w:color w:val="14532D"/>
+          <w:sz w:val="34"/>
+          <w:szCs w:val="34"/>
+          <w:rtl/>
+        </w:rPr>
+        <w:t xml:space="preserve">1) </w:t>
       </w:r>
       <m:oMath>
         <m:r>
-          <m:rPr>
-            <m:sty m:val="bi"/>
-          </m:rPr>
           <w:rPr>
             <w:rFonts w:ascii="Cambria Math" w:hAnsi="Cambria Math"/>
             <w:sz w:val="36"/>
@@ -2339,8 +2277,6 @@
             <m:ctrlPr>
               <w:rPr>
                 <w:rFonts w:ascii="Cambria Math" w:hAnsi="Cambria Math"/>
-                <w:b/>
-                <w:bCs/>
                 <w:sz w:val="36"/>
                 <w:szCs w:val="36"/>
               </w:rPr>
@@ -2348,9 +2284,6 @@
           </m:fPr>
           <m:num>
             <m:r>
-              <m:rPr>
-                <m:sty m:val="bi"/>
-              </m:rPr>
               <w:rPr>
                 <w:rFonts w:ascii="Cambria Math" w:hAnsi="Cambria Math"/>
                 <w:sz w:val="36"/>
@@ -2361,9 +2294,6 @@
           </m:num>
           <m:den>
             <m:r>
-              <m:rPr>
-                <m:sty m:val="bi"/>
-              </m:rPr>
               <w:rPr>
                 <w:rFonts w:ascii="Cambria Math" w:hAnsi="Cambria Math"/>
                 <w:sz w:val="36"/>
@@ -2379,34 +2309,22 @@
           <w:rFonts w:ascii="Calibri" w:eastAsia="Calibri" w:hAnsi="Calibri" w:cs="Calibri"/>
           <w:b/>
           <w:bCs/>
-          <w:sz w:val="36"/>
-          <w:szCs w:val="36"/>
-          <w:rtl/>
-        </w:rPr>
-        <w:t xml:space="preserve">  =</w:t>
-      </w:r>
-      <w:r>
-        <w:rPr>
-          <w:rFonts w:ascii="Calibri" w:eastAsia="Calibri" w:hAnsi="Calibri" w:cs="Calibri"/>
-          <w:b/>
-          <w:bCs/>
-          <w:color w:val="808080"/>
-          <w:sz w:val="36"/>
-          <w:szCs w:val="36"/>
-          <w:rtl/>
-        </w:rPr>
-        <w:t xml:space="preserve"> </w:t>
-      </w:r>
-      <w:r>
-        <w:rPr>
-          <w:rFonts w:ascii="Calibri" w:eastAsia="Calibri" w:hAnsi="Calibri" w:cs="Calibri"/>
-          <w:b/>
-          <w:bCs/>
-          <w:sz w:val="36"/>
-          <w:szCs w:val="36"/>
-          <w:rtl/>
-        </w:rPr>
-        <w:t xml:space="preserve"> ..........................</w:t>
+          <w:color w:val="1A1A1A"/>
+          <w:sz w:val="34"/>
+          <w:szCs w:val="34"/>
+          <w:rtl/>
+        </w:rPr>
+        <w:t xml:space="preserve">  =  </w:t>
+      </w:r>
+      <w:r>
+        <w:rPr>
+          <w:rFonts w:ascii="Calibri" w:eastAsia="Calibri" w:hAnsi="Calibri" w:cs="Calibri"/>
+          <w:color w:val="9E9E9E"/>
+          <w:sz w:val="34"/>
+          <w:szCs w:val="34"/>
+          <w:rtl/>
+        </w:rPr>
+        <w:t xml:space="preserve">......................................</w:t>
       </w:r>
       <w:r>
         <w:rPr>
@@ -2414,48 +2332,39 @@
           <w:b/>
           <w:bCs/>
           <w:color w:val="B8860B"/>
-          <w:sz w:val="22"/>
-          <w:szCs w:val="22"/>
-          <w:rtl/>
-        </w:rPr>
-        <w:t xml:space="preserve">   (1)</w:t>
-      </w:r>
-    </w:p>
-    <w:p>
-      <w:pPr>
-        <w:bidi/>
-        <w:spacing w:after="110" w:line="276" w:lineRule="auto"/>
-        <w:rPr>
+          <w:sz w:val="24"/>
+          <w:szCs w:val="24"/>
+          <w:rtl/>
+        </w:rPr>
+        <w:t xml:space="preserve">  (1)</w:t>
+      </w:r>
+    </w:p>
+    <w:p>
+      <w:pPr>
+        <w:bidi/>
+        <w:spacing w:before="160" w:after="40" w:line="276" w:lineRule="auto"/>
+      </w:pPr>
+      <w:r>
+        <w:rPr>
+          <w:rFonts w:ascii="Calibri" w:eastAsia="Calibri" w:hAnsi="Calibri" w:cs="Calibri"/>
           <w:b/>
           <w:bCs/>
-          <w:sz w:val="36"/>
-          <w:szCs w:val="36"/>
-        </w:rPr>
-      </w:pPr>
-    </w:p>
-    <w:p>
-      <w:pPr>
-        <w:bidi/>
-        <w:spacing w:after="50" w:line="276" w:lineRule="auto"/>
-        <w:rPr>
-          <w:rFonts w:ascii="Calibri" w:eastAsia="Calibri" w:hAnsi="Calibri" w:cs="Calibri"/>
-          <w:b/>
-          <w:bCs/>
-          <w:sz w:val="36"/>
-          <w:szCs w:val="36"/>
-          <w:rtl/>
-        </w:rPr>
-      </w:pPr>
-      <w:r>
-        <w:rPr>
-          <w:rFonts w:ascii="Calibri" w:eastAsia="Calibri" w:hAnsi="Calibri" w:cs="Calibri"/>
-          <w:b/>
-          <w:bCs/>
-          <w:sz w:val="36"/>
-          <w:szCs w:val="36"/>
-          <w:rtl/>
-        </w:rPr>
-        <w:t>2) 0.42 + 56.7 = ..........................</w:t>
+          <w:color w:val="1A1A1A"/>
+          <w:sz w:val="34"/>
+          <w:szCs w:val="34"/>
+          <w:rtl/>
+        </w:rPr>
+        <w:t xml:space="preserve">2) 0.42 + 56.7  =  </w:t>
+      </w:r>
+      <w:r>
+        <w:rPr>
+          <w:rFonts w:ascii="Calibri" w:eastAsia="Calibri" w:hAnsi="Calibri" w:cs="Calibri"/>
+          <w:color w:val="9E9E9E"/>
+          <w:sz w:val="34"/>
+          <w:szCs w:val="34"/>
+          <w:rtl/>
+        </w:rPr>
+        <w:t xml:space="preserve">......................................</w:t>
       </w:r>
       <w:r>
         <w:rPr>
@@ -2463,15 +2372,16 @@
           <w:b/>
           <w:bCs/>
           <w:color w:val="B8860B"/>
-          <w:sz w:val="22"/>
-          <w:szCs w:val="22"/>
-          <w:rtl/>
-        </w:rPr>
-        <w:t xml:space="preserve">   (1)</w:t>
-      </w:r>
-    </w:p>
-    <w:p>
-      <w:pPr>
+          <w:sz w:val="24"/>
+          <w:szCs w:val="24"/>
+          <w:rtl/>
+        </w:rPr>
+        <w:t xml:space="preserve">  (1)</w:t>
+      </w:r>
+    </w:p>
+    <w:p>
+      <w:pPr>
+        <w:pageBreakBefore/>
         <w:bidi/>
         <w:spacing w:before="0" w:after="0" w:line="200" w:lineRule="exact"/>
       </w:pPr>
@@ -2505,7 +2415,7 @@
       <w:tr>
         <w:trPr>
           <w:cantSplit/>
-          <w:trHeight w:val="560"/>
+          <w:trHeight w:val="580"/>
         </w:trPr>
         <w:tc>
           <w:tcPr>
@@ -2532,7 +2442,7 @@
                 <w:szCs w:val="32"/>
                 <w:rtl/>
               </w:rPr>
-              <w:t xml:space="preserve">السؤال الخامس: التقريب لأقرب عدد صحيح</w:t>
+              <w:t xml:space="preserve">السؤال الخامس: قرّب إلى أقرب عدد صحيح</w:t>
             </w:r>
           </w:p>
         </w:tc>
@@ -2555,8 +2465,8 @@
                 <w:b/>
                 <w:bCs/>
                 <w:color w:val="14532D"/>
-                <w:sz w:val="26"/>
-                <w:szCs w:val="26"/>
+                <w:sz w:val="28"/>
+                <w:szCs w:val="28"/>
                 <w:rtl/>
               </w:rPr>
               <w:t xml:space="preserve">علامة واحدة</w:t>
@@ -2568,38 +2478,35 @@
     <w:p>
       <w:pPr>
         <w:bidi/>
-        <w:spacing w:before="0" w:after="0" w:line="120" w:lineRule="exact"/>
-      </w:pPr>
-    </w:p>
-    <w:p>
-      <w:pPr>
-        <w:bidi/>
-        <w:spacing w:after="90" w:line="276" w:lineRule="auto"/>
-        <w:rPr>
-          <w:sz w:val="36"/>
-          <w:szCs w:val="36"/>
-        </w:rPr>
+        <w:spacing w:before="0" w:after="0" w:line="140" w:lineRule="exact"/>
+      </w:pPr>
+    </w:p>
+    <w:p>
+      <w:pPr>
+        <w:bidi/>
+        <w:spacing w:before="160" w:after="40" w:line="276" w:lineRule="auto"/>
       </w:pPr>
       <w:r>
         <w:rPr>
           <w:rFonts w:ascii="Calibri" w:eastAsia="Calibri" w:hAnsi="Calibri" w:cs="Calibri"/>
           <w:b/>
           <w:bCs/>
-          <w:sz w:val="36"/>
-          <w:szCs w:val="36"/>
-          <w:rtl/>
-        </w:rPr>
-        <w:t xml:space="preserve">208.416= </w:t>
-      </w:r>
-      <w:r>
-        <w:rPr>
-          <w:rFonts w:ascii="Calibri" w:eastAsia="Calibri" w:hAnsi="Calibri" w:cs="Calibri"/>
-          <w:color w:val="808080"/>
-          <w:sz w:val="36"/>
-          <w:szCs w:val="36"/>
-          <w:rtl/>
-        </w:rPr>
-        <w:t>__________________________________</w:t>
+          <w:color w:val="1A1A1A"/>
+          <w:sz w:val="34"/>
+          <w:szCs w:val="34"/>
+          <w:rtl/>
+        </w:rPr>
+        <w:t xml:space="preserve">208.416  =  </w:t>
+      </w:r>
+      <w:r>
+        <w:rPr>
+          <w:rFonts w:ascii="Calibri" w:eastAsia="Calibri" w:hAnsi="Calibri" w:cs="Calibri"/>
+          <w:color w:val="9E9E9E"/>
+          <w:sz w:val="34"/>
+          <w:szCs w:val="34"/>
+          <w:rtl/>
+        </w:rPr>
+        <w:t xml:space="preserve">......................................</w:t>
       </w:r>
       <w:r>
         <w:rPr>
@@ -2607,42 +2514,39 @@
           <w:b/>
           <w:bCs/>
           <w:color w:val="B8860B"/>
-          <w:sz w:val="22"/>
-          <w:szCs w:val="22"/>
-          <w:rtl/>
-        </w:rPr>
-        <w:t xml:space="preserve">   (0.5)</w:t>
-      </w:r>
-    </w:p>
-    <w:p>
-      <w:pPr>
-        <w:bidi/>
-        <w:spacing w:after="90" w:line="276" w:lineRule="auto"/>
-        <w:rPr>
-          <w:sz w:val="36"/>
-          <w:szCs w:val="36"/>
-        </w:rPr>
+          <w:sz w:val="24"/>
+          <w:szCs w:val="24"/>
+          <w:rtl/>
+        </w:rPr>
+        <w:t xml:space="preserve">  (0.5)</w:t>
+      </w:r>
+    </w:p>
+    <w:p>
+      <w:pPr>
+        <w:bidi/>
+        <w:spacing w:before="160" w:after="40" w:line="276" w:lineRule="auto"/>
       </w:pPr>
       <w:r>
         <w:rPr>
           <w:rFonts w:ascii="Calibri" w:eastAsia="Calibri" w:hAnsi="Calibri" w:cs="Calibri"/>
           <w:b/>
           <w:bCs/>
-          <w:sz w:val="36"/>
-          <w:szCs w:val="36"/>
-          <w:rtl/>
-        </w:rPr>
-        <w:t xml:space="preserve">9.63= </w:t>
-      </w:r>
-      <w:r>
-        <w:rPr>
-          <w:rFonts w:ascii="Calibri" w:eastAsia="Calibri" w:hAnsi="Calibri" w:cs="Calibri"/>
-          <w:color w:val="808080"/>
-          <w:sz w:val="36"/>
-          <w:szCs w:val="36"/>
-          <w:rtl/>
-        </w:rPr>
-        <w:t>__________________________________</w:t>
+          <w:color w:val="1A1A1A"/>
+          <w:sz w:val="34"/>
+          <w:szCs w:val="34"/>
+          <w:rtl/>
+        </w:rPr>
+        <w:t xml:space="preserve">9.63  =  </w:t>
+      </w:r>
+      <w:r>
+        <w:rPr>
+          <w:rFonts w:ascii="Calibri" w:eastAsia="Calibri" w:hAnsi="Calibri" w:cs="Calibri"/>
+          <w:color w:val="9E9E9E"/>
+          <w:sz w:val="34"/>
+          <w:szCs w:val="34"/>
+          <w:rtl/>
+        </w:rPr>
+        <w:t xml:space="preserve">......................................</w:t>
       </w:r>
       <w:r>
         <w:rPr>
@@ -2650,11 +2554,11 @@
           <w:b/>
           <w:bCs/>
           <w:color w:val="B8860B"/>
-          <w:sz w:val="22"/>
-          <w:szCs w:val="22"/>
-          <w:rtl/>
-        </w:rPr>
-        <w:t xml:space="preserve">   (0.5)</w:t>
+          <w:sz w:val="24"/>
+          <w:szCs w:val="24"/>
+          <w:rtl/>
+        </w:rPr>
+        <w:t xml:space="preserve">  (0.5)</w:t>
       </w:r>
     </w:p>
     <w:p>
@@ -2692,7 +2596,7 @@
       <w:tr>
         <w:trPr>
           <w:cantSplit/>
-          <w:trHeight w:val="560"/>
+          <w:trHeight w:val="580"/>
         </w:trPr>
         <w:tc>
           <w:tcPr>
@@ -2742,8 +2646,8 @@
                 <w:b/>
                 <w:bCs/>
                 <w:color w:val="14532D"/>
-                <w:sz w:val="26"/>
-                <w:szCs w:val="26"/>
+                <w:sz w:val="28"/>
+                <w:szCs w:val="28"/>
                 <w:rtl/>
               </w:rPr>
               <w:t xml:space="preserve">علامتان</w:t>
@@ -2755,72 +2659,59 @@
     <w:p>
       <w:pPr>
         <w:bidi/>
-        <w:spacing w:before="0" w:after="0" w:line="120" w:lineRule="exact"/>
-      </w:pPr>
-    </w:p>
-    <w:p>
-      <w:pPr>
-        <w:bidi/>
-        <w:spacing w:after="30" w:line="276" w:lineRule="auto"/>
-        <w:rPr>
+        <w:spacing w:before="0" w:after="0" w:line="140" w:lineRule="exact"/>
+      </w:pPr>
+    </w:p>
+    <w:p>
+      <w:pPr>
+        <w:keepNext/>
+        <w:bidi/>
+        <w:spacing w:before="0" w:after="60" w:line="276" w:lineRule="auto"/>
+      </w:pPr>
+      <w:r>
+        <w:rPr>
+          <w:rFonts w:ascii="Calibri" w:eastAsia="Calibri" w:hAnsi="Calibri" w:cs="Calibri"/>
+          <w:color w:val="1A1A1A"/>
+          <w:sz w:val="34"/>
+          <w:szCs w:val="34"/>
+          <w:rtl/>
+        </w:rPr>
+        <w:t xml:space="preserve">لدينا الدائرة (C) التالية بحيث أن </w:t>
+      </w:r>
+      <w:r>
+        <w:rPr>
+          <w:rFonts w:ascii="Calibri" w:eastAsia="Calibri" w:hAnsi="Calibri" w:cs="Calibri"/>
           <w:b/>
           <w:bCs/>
-          <w:sz w:val="36"/>
-          <w:szCs w:val="36"/>
-        </w:rPr>
-      </w:pPr>
-      <w:r>
-        <w:rPr>
-          <w:rFonts w:ascii="Calibri" w:eastAsia="Calibri" w:hAnsi="Calibri" w:cs="Calibri"/>
-          <w:b/>
-          <w:bCs/>
-          <w:sz w:val="36"/>
-          <w:szCs w:val="36"/>
-          <w:rtl/>
-        </w:rPr>
-        <w:t>لدينا دائرة (C) التالية بحيث أن:</w:t>
-      </w:r>
-    </w:p>
-    <w:p>
-      <w:pPr>
-        <w:bidi/>
-        <w:spacing w:after="100" w:line="276" w:lineRule="auto"/>
-        <w:rPr>
-          <w:sz w:val="36"/>
-          <w:szCs w:val="36"/>
-        </w:rPr>
-      </w:pPr>
-      <w:r>
-        <w:rPr>
-          <w:rFonts w:ascii="Calibri" w:eastAsia="Calibri" w:hAnsi="Calibri" w:cs="Calibri"/>
-          <w:b/>
-          <w:bCs/>
-          <w:sz w:val="36"/>
-          <w:szCs w:val="36"/>
-          <w:rtl/>
-        </w:rPr>
-        <w:t>AB = 8 cm</w:t>
+          <w:color w:val="1A1A1A"/>
+          <w:sz w:val="34"/>
+          <w:szCs w:val="34"/>
+          <w:rtl/>
+        </w:rPr>
+        <w:t xml:space="preserve">AB = 8 cm</w:t>
+      </w:r>
+      <w:r>
+        <w:rPr>
+          <w:rFonts w:ascii="Calibri" w:eastAsia="Calibri" w:hAnsi="Calibri" w:cs="Calibri"/>
+          <w:color w:val="1A1A1A"/>
+          <w:sz w:val="34"/>
+          <w:szCs w:val="34"/>
+          <w:rtl/>
+        </w:rPr>
+        <w:t xml:space="preserve">:</w:t>
       </w:r>
     </w:p>
     <w:p>
       <w:pPr>
         <w:keepNext/>
-        <w:spacing w:after="120"/>
+        <w:bidi/>
+        <w:spacing w:before="60" w:after="60"/>
         <w:jc w:val="center"/>
-        <w:rPr>
-          <w:sz w:val="36"/>
-          <w:szCs w:val="36"/>
-        </w:rPr>
-      </w:pPr>
-      <w:r>
-        <w:rPr>
-          <w:noProof/>
-          <w:sz w:val="36"/>
-          <w:szCs w:val="36"/>
-        </w:rPr>
+      </w:pPr>
+      <w:r>
         <w:drawing>
           <wp:inline distT="0" distB="0" distL="0" distR="0" wp14:anchorId="6B57460B" wp14:editId="4923BDD4">
-            <wp:extent cx="3291840" cy="2850253"/>
+            <wp:extent cx="2926080" cy="2533558"/>
             <wp:effectExtent l="0" t="0" r="0" b="0"/>
             <wp:docPr id="1438249767" name="Picture 1438249767" descr="دائرة مركزها O وقطرها AB، مع الشعاع OE والنقاط C و D و M"/>
             <wp:cNvGraphicFramePr>
@@ -2845,7 +2736,7 @@
                   <pic:spPr bwMode="auto">
                     <a:xfrm>
                       <a:off x="0" y="0"/>
-                      <a:ext cx="3291840" cy="2850253"/>
+                      <a:ext cx="2926080" cy="2533558"/>
                     </a:xfrm>
                     <a:prstGeom prst="rect">
                       <a:avLst/>
@@ -2861,7 +2752,7 @@
     <w:p>
       <w:pPr>
         <w:bidi/>
-        <w:spacing w:before="0" w:after="0" w:line="80" w:lineRule="exact"/>
+        <w:spacing w:before="0" w:after="0" w:line="60" w:lineRule="exact"/>
       </w:pPr>
     </w:p>
     <w:tbl>
@@ -2890,7 +2781,9 @@
         <w:gridCol w:w="10440"/>
       </w:tblGrid>
       <w:tr>
-        <w:trPr/>
+        <w:trPr>
+          <w:cantSplit/>
+        </w:trPr>
         <w:tc>
           <w:tcPr>
             <w:tcW w:w="10440" w:type="dxa"/>
@@ -2902,9 +2795,9 @@
             </w:tcBorders>
             <w:shd w:val="clear" w:color="auto" w:fill="EAF2FB"/>
             <w:tcMar>
-              <w:top w:w="120" w:type="dxa"/>
+              <w:top w:w="100" w:type="dxa"/>
               <w:left w:w="200" w:type="dxa"/>
-              <w:bottom w:w="120" w:type="dxa"/>
+              <w:bottom w:w="100" w:type="dxa"/>
               <w:right w:w="240" w:type="dxa"/>
             </w:tcMar>
             <w:vAlign w:val="center"/>
@@ -2913,7 +2806,7 @@
             <w:pPr>
               <w:keepNext/>
               <w:bidi/>
-              <w:spacing w:before="0" w:after="80" w:line="276" w:lineRule="auto"/>
+              <w:spacing w:before="0" w:after="60" w:line="276" w:lineRule="auto"/>
             </w:pPr>
             <w:r>
               <w:rPr>
@@ -2921,91 +2814,79 @@
                 <w:b/>
                 <w:bCs/>
                 <w:color w:val="1F4E79"/>
-                <w:sz w:val="26"/>
-                <w:szCs w:val="26"/>
-                <w:rtl/>
-              </w:rPr>
-              <w:t xml:space="preserve">وصف الشكل (للطلاب المكفوفين وضعاف البصر):</w:t>
-            </w:r>
-          </w:p>
-          <w:p>
-            <w:pPr>
-              <w:bidi/>
-              <w:spacing w:before="0" w:after="60" w:line="276" w:lineRule="auto"/>
+                <w:sz w:val="30"/>
+                <w:szCs w:val="30"/>
+                <w:rtl/>
+              </w:rPr>
+              <w:t xml:space="preserve">وصف الشكل للمكفوفين:</w:t>
+            </w:r>
+          </w:p>
+          <w:p>
+            <w:pPr>
+              <w:keepNext/>
+              <w:bidi/>
+              <w:spacing w:before="0" w:after="40" w:line="276" w:lineRule="auto"/>
             </w:pPr>
             <w:r>
               <w:rPr>
                 <w:rFonts w:ascii="Calibri" w:eastAsia="Calibri" w:hAnsi="Calibri" w:cs="Calibri"/>
                 <w:color w:val="1A1A1A"/>
-                <w:sz w:val="26"/>
-                <w:szCs w:val="26"/>
-                <w:rtl/>
-              </w:rPr>
-              <w:t xml:space="preserve">• دائرة اسمها (C) ومركزها النقطة O.</w:t>
-            </w:r>
-          </w:p>
-          <w:p>
-            <w:pPr>
-              <w:bidi/>
-              <w:spacing w:before="0" w:after="60" w:line="276" w:lineRule="auto"/>
+                <w:sz w:val="30"/>
+                <w:szCs w:val="30"/>
+                <w:rtl/>
+              </w:rPr>
+              <w:t xml:space="preserve">• دائرة (C) مركزها O، و[AB] قطر أفقي يمرّ بالمركز، طوله 8 cm.</w:t>
+            </w:r>
+          </w:p>
+          <w:p>
+            <w:pPr>
+              <w:keepNext/>
+              <w:bidi/>
+              <w:spacing w:before="0" w:after="40" w:line="276" w:lineRule="auto"/>
             </w:pPr>
             <w:r>
               <w:rPr>
                 <w:rFonts w:ascii="Calibri" w:eastAsia="Calibri" w:hAnsi="Calibri" w:cs="Calibri"/>
                 <w:color w:val="1A1A1A"/>
-                <w:sz w:val="26"/>
-                <w:szCs w:val="26"/>
-                <w:rtl/>
-              </w:rPr>
-              <w:t xml:space="preserve">• القطعة [AB] قطر أفقي يمرّ بالمركز O: النقطة A على يسار الدائرة والنقطة B على يمينها، وطوله AB = 8 cm.</w:t>
-            </w:r>
-          </w:p>
-          <w:p>
-            <w:pPr>
-              <w:bidi/>
-              <w:spacing w:before="0" w:after="60" w:line="276" w:lineRule="auto"/>
+                <w:sz w:val="30"/>
+                <w:szCs w:val="30"/>
+                <w:rtl/>
+              </w:rPr>
+              <w:t xml:space="preserve">• [OE] قطعة تصل المركز O بالنقطة E على الدائرة (أعلى اليسار).</w:t>
+            </w:r>
+          </w:p>
+          <w:p>
+            <w:pPr>
+              <w:keepNext/>
+              <w:bidi/>
+              <w:spacing w:before="0" w:after="40" w:line="276" w:lineRule="auto"/>
             </w:pPr>
             <w:r>
               <w:rPr>
                 <w:rFonts w:ascii="Calibri" w:eastAsia="Calibri" w:hAnsi="Calibri" w:cs="Calibri"/>
                 <w:color w:val="1A1A1A"/>
-                <w:sz w:val="26"/>
-                <w:szCs w:val="26"/>
-                <w:rtl/>
-              </w:rPr>
-              <w:t xml:space="preserve">• القطعة [OE] تصل المركز O بالنقطة E الواقعة على الدائرة في الجهة العليا اليسرى.</w:t>
-            </w:r>
-          </w:p>
-          <w:p>
-            <w:pPr>
-              <w:bidi/>
-              <w:spacing w:before="0" w:after="60" w:line="276" w:lineRule="auto"/>
+                <w:sz w:val="30"/>
+                <w:szCs w:val="30"/>
+                <w:rtl/>
+              </w:rPr>
+              <w:t xml:space="preserve">• من النقطة C على الدائرة (أعلى اليمين) تنطلق قطعة تقطع الدائرة قرب B وتنتهي عند M خارجها.</w:t>
+            </w:r>
+          </w:p>
+          <w:p>
+            <w:pPr>
+              <w:keepNext/>
+              <w:bidi/>
+              <w:spacing w:before="0" w:after="40" w:line="276" w:lineRule="auto"/>
             </w:pPr>
             <w:r>
               <w:rPr>
                 <w:rFonts w:ascii="Calibri" w:eastAsia="Calibri" w:hAnsi="Calibri" w:cs="Calibri"/>
                 <w:color w:val="1A1A1A"/>
-                <w:sz w:val="26"/>
-                <w:szCs w:val="26"/>
-                <w:rtl/>
-              </w:rPr>
-              <w:t xml:space="preserve">• النقطة C تقع على الدائرة في الجهة العليا اليمنى، ومنها تنطلق قطعة مستقيمة مائلة إلى الأسفل تخرج من الدائرة قرب النقطة B وتنتهي عند النقطة M خارج الدائرة.</w:t>
-            </w:r>
-          </w:p>
-          <w:p>
-            <w:pPr>
-              <w:bidi/>
-              <w:spacing w:before="0" w:after="60" w:line="276" w:lineRule="auto"/>
-            </w:pPr>
-            <w:r>
-              <w:rPr>
-                <w:rFonts w:ascii="Calibri" w:eastAsia="Calibri" w:hAnsi="Calibri" w:cs="Calibri"/>
-                <w:color w:val="1A1A1A"/>
-                <w:sz w:val="26"/>
-                <w:szCs w:val="26"/>
-                <w:rtl/>
-              </w:rPr>
-              <w:t xml:space="preserve">• النقطة D تقع على الدائرة في الجهة السفلى.</w:t>
+                <w:sz w:val="30"/>
+                <w:szCs w:val="30"/>
+                <w:rtl/>
+              </w:rPr>
+              <w:t xml:space="preserve">• النقطة D على الدائرة من الأسفل.</w:t>
             </w:r>
           </w:p>
         </w:tc>
@@ -3014,26 +2895,36 @@
     <w:p>
       <w:pPr>
         <w:bidi/>
-        <w:spacing w:before="0" w:after="0" w:line="120" w:lineRule="exact"/>
-      </w:pPr>
-    </w:p>
-    <w:p>
-      <w:pPr>
-        <w:bidi/>
-        <w:spacing w:after="50"/>
-        <w:rPr>
-          <w:sz w:val="36"/>
-          <w:szCs w:val="36"/>
-        </w:rPr>
-      </w:pPr>
-      <w:r>
-        <w:rPr>
-          <w:rFonts w:ascii="Calibri" w:eastAsia="Calibri" w:hAnsi="Calibri" w:cs="Calibri"/>
-          <w:sz w:val="36"/>
-          <w:szCs w:val="36"/>
-          <w:rtl/>
-        </w:rPr>
-        <w:t>1) حدد طول الشعاع</w:t>
+        <w:spacing w:before="0" w:after="0" w:line="100" w:lineRule="exact"/>
+      </w:pPr>
+    </w:p>
+    <w:p>
+      <w:pPr>
+        <w:keepNext/>
+        <w:bidi/>
+        <w:spacing w:before="120" w:after="40" w:line="276" w:lineRule="auto"/>
+      </w:pPr>
+      <w:r>
+        <w:rPr>
+          <w:rFonts w:ascii="Calibri" w:eastAsia="Calibri" w:hAnsi="Calibri" w:cs="Calibri"/>
+          <w:b/>
+          <w:bCs/>
+          <w:color w:val="14532D"/>
+          <w:sz w:val="34"/>
+          <w:szCs w:val="34"/>
+          <w:rtl/>
+        </w:rPr>
+        <w:t xml:space="preserve">1) </w:t>
+      </w:r>
+      <w:r>
+        <w:rPr>
+          <w:rFonts w:ascii="Calibri" w:eastAsia="Calibri" w:hAnsi="Calibri" w:cs="Calibri"/>
+          <w:color w:val="1A1A1A"/>
+          <w:sz w:val="34"/>
+          <w:szCs w:val="34"/>
+          <w:rtl/>
+        </w:rPr>
+        <w:t xml:space="preserve">حدّد طول الشعاع.</w:t>
       </w:r>
       <w:r>
         <w:rPr>
@@ -3041,44 +2932,11 @@
           <w:b/>
           <w:bCs/>
           <w:color w:val="B8860B"/>
-          <w:sz w:val="22"/>
-          <w:szCs w:val="22"/>
-          <w:rtl/>
-        </w:rPr>
-        <w:t xml:space="preserve">   (1)</w:t>
-      </w:r>
-    </w:p>
-    <w:p>
-      <w:pPr>
-        <w:bidi/>
-        <w:spacing w:after="50"/>
-        <w:rPr>
-          <w:rFonts w:ascii="Calibri" w:eastAsia="Calibri" w:hAnsi="Calibri" w:cs="Calibri"/>
-          <w:sz w:val="36"/>
-          <w:szCs w:val="36"/>
-          <w:rtl/>
-        </w:rPr>
-      </w:pPr>
-      <w:r>
-        <w:rPr>
-          <w:rFonts w:ascii="Calibri" w:eastAsia="Calibri" w:hAnsi="Calibri" w:cs="Calibri"/>
-          <w:sz w:val="36"/>
-          <w:szCs w:val="36"/>
-          <w:rtl/>
-        </w:rPr>
-        <w:t>2) حدد الوتر وأحسب طوله إذا كان طوله يساوي ثلثي القطر</w:t>
-      </w:r>
-      <w:r>
-        <w:rPr>
-          <w:rFonts w:ascii="Calibri" w:eastAsia="Calibri" w:hAnsi="Calibri" w:cs="Calibri"/>
-          <w:b/>
-          <w:bCs/>
-          <w:color w:val="B8860B"/>
-          <w:sz w:val="22"/>
-          <w:szCs w:val="22"/>
-          <w:rtl/>
-        </w:rPr>
-        <w:t xml:space="preserve">   (1)</w:t>
+          <w:sz w:val="24"/>
+          <w:szCs w:val="24"/>
+          <w:rtl/>
+        </w:rPr>
+        <w:t xml:space="preserve">  (1)</w:t>
       </w:r>
     </w:p>
     <w:p>
@@ -3103,6 +2961,47 @@
     </w:p>
     <w:p>
       <w:pPr>
+        <w:keepNext/>
+        <w:bidi/>
+        <w:spacing w:before="200" w:after="40" w:line="276" w:lineRule="auto"/>
+      </w:pPr>
+      <w:r>
+        <w:rPr>
+          <w:rFonts w:ascii="Calibri" w:eastAsia="Calibri" w:hAnsi="Calibri" w:cs="Calibri"/>
+          <w:b/>
+          <w:bCs/>
+          <w:color w:val="14532D"/>
+          <w:sz w:val="34"/>
+          <w:szCs w:val="34"/>
+          <w:rtl/>
+        </w:rPr>
+        <w:t xml:space="preserve">2) </w:t>
+      </w:r>
+      <w:r>
+        <w:rPr>
+          <w:rFonts w:ascii="Calibri" w:eastAsia="Calibri" w:hAnsi="Calibri" w:cs="Calibri"/>
+          <w:color w:val="1A1A1A"/>
+          <w:sz w:val="34"/>
+          <w:szCs w:val="34"/>
+          <w:rtl/>
+        </w:rPr>
+        <w:t xml:space="preserve">حدّد الوتر واحسب طوله إذا كان طوله يساوي ثلثي القطر.</w:t>
+      </w:r>
+      <w:r>
+        <w:rPr>
+          <w:rFonts w:ascii="Calibri" w:eastAsia="Calibri" w:hAnsi="Calibri" w:cs="Calibri"/>
+          <w:b/>
+          <w:bCs/>
+          <w:color w:val="B8860B"/>
+          <w:sz w:val="24"/>
+          <w:szCs w:val="24"/>
+          <w:rtl/>
+        </w:rPr>
+        <w:t xml:space="preserve">  (1)</w:t>
+      </w:r>
+    </w:p>
+    <w:p>
+      <w:pPr>
         <w:pBdr>
           <w:bottom w:val="dotted" w:sz="6" w:space="1" w:color="9E9E9E"/>
           <w:between w:val="dotted" w:sz="6" w:space="1" w:color="9E9E9E"/>
@@ -3143,6 +3042,7 @@
     </w:p>
     <w:p>
       <w:pPr>
+        <w:pageBreakBefore/>
         <w:bidi/>
         <w:spacing w:before="0" w:after="0" w:line="200" w:lineRule="exact"/>
       </w:pPr>
@@ -3176,7 +3076,7 @@
       <w:tr>
         <w:trPr>
           <w:cantSplit/>
-          <w:trHeight w:val="560"/>
+          <w:trHeight w:val="580"/>
         </w:trPr>
         <w:tc>
           <w:tcPr>
@@ -3226,8 +3126,8 @@
                 <w:b/>
                 <w:bCs/>
                 <w:color w:val="14532D"/>
-                <w:sz w:val="26"/>
-                <w:szCs w:val="26"/>
+                <w:sz w:val="28"/>
+                <w:szCs w:val="28"/>
                 <w:rtl/>
               </w:rPr>
               <w:t xml:space="preserve">علامتان</w:t>
@@ -3239,14 +3139,30 @@
     <w:p>
       <w:pPr>
         <w:bidi/>
-        <w:spacing w:before="0" w:after="0" w:line="120" w:lineRule="exact"/>
+        <w:spacing w:before="0" w:after="0" w:line="140" w:lineRule="exact"/>
       </w:pPr>
     </w:p>
     <w:p>
       <w:pPr>
         <w:keepNext/>
         <w:bidi/>
-        <w:spacing w:before="0" w:after="80" w:line="276" w:lineRule="auto"/>
+        <w:spacing w:before="0" w:after="40" w:line="276" w:lineRule="auto"/>
+      </w:pPr>
+      <w:r>
+        <w:rPr>
+          <w:rFonts w:ascii="Calibri" w:eastAsia="Calibri" w:hAnsi="Calibri" w:cs="Calibri"/>
+          <w:color w:val="1A1A1A"/>
+          <w:sz w:val="34"/>
+          <w:szCs w:val="34"/>
+          <w:rtl/>
+        </w:rPr>
+        <w:t xml:space="preserve">جد ما يلي:</w:t>
+      </w:r>
+    </w:p>
+    <w:p>
+      <w:pPr>
+        <w:bidi/>
+        <w:spacing w:before="160" w:after="40" w:line="276" w:lineRule="auto"/>
       </w:pPr>
       <w:r>
         <w:rPr>
@@ -3254,30 +3170,21 @@
           <w:b/>
           <w:bCs/>
           <w:color w:val="1A1A1A"/>
-          <w:sz w:val="28"/>
-          <w:szCs w:val="28"/>
-          <w:rtl/>
-        </w:rPr>
-        <w:t xml:space="preserve">جد ال ق.م.أك و ال م.م.أص للأعداد التالية:</w:t>
-      </w:r>
-    </w:p>
-    <w:p>
-      <w:pPr>
-        <w:bidi/>
-        <w:spacing w:after="90"/>
-        <w:rPr>
-          <w:sz w:val="36"/>
-          <w:szCs w:val="36"/>
-        </w:rPr>
-      </w:pPr>
-      <w:r>
-        <w:rPr>
-          <w:rFonts w:ascii="Calibri" w:eastAsia="Calibri" w:hAnsi="Calibri" w:cs="Calibri"/>
-          <w:sz w:val="36"/>
-          <w:szCs w:val="36"/>
-          <w:rtl/>
-        </w:rPr>
-        <w:t>ق.م.اك ( 15 , 20 ) = ......................</w:t>
+          <w:sz w:val="34"/>
+          <w:szCs w:val="34"/>
+          <w:rtl/>
+        </w:rPr>
+        <w:t xml:space="preserve">ق.م.أك ( 15 , 20 )  =  </w:t>
+      </w:r>
+      <w:r>
+        <w:rPr>
+          <w:rFonts w:ascii="Calibri" w:eastAsia="Calibri" w:hAnsi="Calibri" w:cs="Calibri"/>
+          <w:color w:val="9E9E9E"/>
+          <w:sz w:val="34"/>
+          <w:szCs w:val="34"/>
+          <w:rtl/>
+        </w:rPr>
+        <w:t xml:space="preserve">......................................</w:t>
       </w:r>
       <w:r>
         <w:rPr>
@@ -3285,32 +3192,39 @@
           <w:b/>
           <w:bCs/>
           <w:color w:val="B8860B"/>
-          <w:sz w:val="22"/>
-          <w:szCs w:val="22"/>
-          <w:rtl/>
-        </w:rPr>
-        <w:t xml:space="preserve">   (1)</w:t>
-      </w:r>
-    </w:p>
-    <w:p>
-      <w:pPr>
-        <w:bidi/>
-        <w:spacing w:after="90"/>
-        <w:rPr>
-          <w:rFonts w:ascii="Calibri" w:eastAsia="Calibri" w:hAnsi="Calibri" w:cs="Calibri"/>
-          <w:sz w:val="36"/>
-          <w:szCs w:val="36"/>
-          <w:rtl/>
-        </w:rPr>
-      </w:pPr>
-      <w:r>
-        <w:rPr>
-          <w:rFonts w:ascii="Calibri" w:eastAsia="Calibri" w:hAnsi="Calibri" w:cs="Calibri"/>
-          <w:sz w:val="36"/>
-          <w:szCs w:val="36"/>
-          <w:rtl/>
-        </w:rPr>
-        <w:t>م.م.أص ( 15 , 20 ) = ......................</w:t>
+          <w:sz w:val="24"/>
+          <w:szCs w:val="24"/>
+          <w:rtl/>
+        </w:rPr>
+        <w:t xml:space="preserve">  (1)</w:t>
+      </w:r>
+    </w:p>
+    <w:p>
+      <w:pPr>
+        <w:bidi/>
+        <w:spacing w:before="160" w:after="40" w:line="276" w:lineRule="auto"/>
+      </w:pPr>
+      <w:r>
+        <w:rPr>
+          <w:rFonts w:ascii="Calibri" w:eastAsia="Calibri" w:hAnsi="Calibri" w:cs="Calibri"/>
+          <w:b/>
+          <w:bCs/>
+          <w:color w:val="1A1A1A"/>
+          <w:sz w:val="34"/>
+          <w:szCs w:val="34"/>
+          <w:rtl/>
+        </w:rPr>
+        <w:t xml:space="preserve">م.م.أص ( 15 , 20 )  =  </w:t>
+      </w:r>
+      <w:r>
+        <w:rPr>
+          <w:rFonts w:ascii="Calibri" w:eastAsia="Calibri" w:hAnsi="Calibri" w:cs="Calibri"/>
+          <w:color w:val="9E9E9E"/>
+          <w:sz w:val="34"/>
+          <w:szCs w:val="34"/>
+          <w:rtl/>
+        </w:rPr>
+        <w:t xml:space="preserve">......................................</w:t>
       </w:r>
       <w:r>
         <w:rPr>
@@ -3318,11 +3232,11 @@
           <w:b/>
           <w:bCs/>
           <w:color w:val="B8860B"/>
-          <w:sz w:val="22"/>
-          <w:szCs w:val="22"/>
-          <w:rtl/>
-        </w:rPr>
-        <w:t xml:space="preserve">   (1)</w:t>
+          <w:sz w:val="24"/>
+          <w:szCs w:val="24"/>
+          <w:rtl/>
+        </w:rPr>
+        <w:t xml:space="preserve">  (1)</w:t>
       </w:r>
     </w:p>
     <w:p>
@@ -3360,7 +3274,7 @@
       <w:tr>
         <w:trPr>
           <w:cantSplit/>
-          <w:trHeight w:val="560"/>
+          <w:trHeight w:val="580"/>
         </w:trPr>
         <w:tc>
           <w:tcPr>
@@ -3410,8 +3324,8 @@
                 <w:b/>
                 <w:bCs/>
                 <w:color w:val="14532D"/>
-                <w:sz w:val="26"/>
-                <w:szCs w:val="26"/>
+                <w:sz w:val="28"/>
+                <w:szCs w:val="28"/>
                 <w:rtl/>
               </w:rPr>
               <w:t xml:space="preserve">5 علامات</w:t>
@@ -3423,14 +3337,14 @@
     <w:p>
       <w:pPr>
         <w:bidi/>
-        <w:spacing w:before="0" w:after="0" w:line="120" w:lineRule="exact"/>
+        <w:spacing w:before="0" w:after="0" w:line="140" w:lineRule="exact"/>
       </w:pPr>
     </w:p>
     <w:p>
       <w:pPr>
         <w:keepNext/>
         <w:bidi/>
-        <w:spacing w:before="0" w:after="60" w:line="276" w:lineRule="auto"/>
+        <w:spacing w:before="160" w:after="60" w:line="276" w:lineRule="auto"/>
       </w:pPr>
       <w:r>
         <w:rPr>
@@ -3438,23 +3352,11 @@
           <w:b/>
           <w:bCs/>
           <w:color w:val="14532D"/>
-          <w:sz w:val="36"/>
-          <w:szCs w:val="36"/>
-          <w:rtl/>
-        </w:rPr>
-        <w:t xml:space="preserve">أ) </w:t>
-      </w:r>
-      <w:r>
-        <w:rPr>
-          <w:rFonts w:ascii="Calibri" w:eastAsia="Calibri" w:hAnsi="Calibri" w:cs="Calibri"/>
-          <w:b/>
-          <w:bCs/>
-          <w:color w:val="1A1A1A"/>
-          <w:sz w:val="36"/>
-          <w:szCs w:val="36"/>
-          <w:rtl/>
-        </w:rPr>
-        <w:t xml:space="preserve">حدّد نوع كل مثلث من المثلثات التالية.</w:t>
+          <w:sz w:val="34"/>
+          <w:szCs w:val="34"/>
+          <w:rtl/>
+        </w:rPr>
+        <w:t xml:space="preserve">أ) حدّد نوع كل مثلث من المثلثات التالية.  </w:t>
       </w:r>
       <w:r>
         <w:rPr>
@@ -3462,11 +3364,11 @@
           <w:b/>
           <w:bCs/>
           <w:color w:val="B8860B"/>
-          <w:sz w:val="22"/>
-          <w:szCs w:val="22"/>
-          <w:rtl/>
-        </w:rPr>
-        <w:t xml:space="preserve">   (3 علامات)</w:t>
+          <w:sz w:val="24"/>
+          <w:szCs w:val="24"/>
+          <w:rtl/>
+        </w:rPr>
+        <w:t xml:space="preserve">  (3)</w:t>
       </w:r>
     </w:p>
     <w:p>
@@ -3546,7 +3448,9 @@
         <w:gridCol w:w="10440"/>
       </w:tblGrid>
       <w:tr>
-        <w:trPr/>
+        <w:trPr>
+          <w:cantSplit/>
+        </w:trPr>
         <w:tc>
           <w:tcPr>
             <w:tcW w:w="10440" w:type="dxa"/>
@@ -3577,8 +3481,8 @@
                 <w:b/>
                 <w:bCs/>
                 <w:color w:val="1F4E79"/>
-                <w:sz w:val="36"/>
-                <w:szCs w:val="36"/>
+                <w:sz w:val="30"/>
+                <w:szCs w:val="30"/>
                 <w:rtl/>
               </w:rPr>
               <w:t xml:space="preserve">وصف الشكل للمكفوفين:</w:t>
@@ -3586,6 +3490,7 @@
           </w:p>
           <w:p>
             <w:pPr>
+              <w:keepNext/>
               <w:bidi/>
               <w:spacing w:before="0" w:after="40" w:line="276" w:lineRule="auto"/>
             </w:pPr>
@@ -3593,15 +3498,16 @@
               <w:rPr>
                 <w:rFonts w:ascii="Calibri" w:eastAsia="Calibri" w:hAnsi="Calibri" w:cs="Calibri"/>
                 <w:color w:val="1A1A1A"/>
-                <w:sz w:val="36"/>
-                <w:szCs w:val="36"/>
-                <w:rtl/>
-              </w:rPr>
-              <w:t xml:space="preserve">(1) ABC: أضلاعه الثلاثة متساوية، طول كل منها 4 cm.</w:t>
-            </w:r>
-          </w:p>
-          <w:p>
-            <w:pPr>
+                <w:sz w:val="30"/>
+                <w:szCs w:val="30"/>
+                <w:rtl/>
+              </w:rPr>
+              <w:t xml:space="preserve">• (1) ABC: أضلاعه الثلاثة متساوية، طول كل منها 4 cm.</w:t>
+            </w:r>
+          </w:p>
+          <w:p>
+            <w:pPr>
+              <w:keepNext/>
               <w:bidi/>
               <w:spacing w:before="0" w:after="40" w:line="276" w:lineRule="auto"/>
             </w:pPr>
@@ -3609,15 +3515,16 @@
               <w:rPr>
                 <w:rFonts w:ascii="Calibri" w:eastAsia="Calibri" w:hAnsi="Calibri" w:cs="Calibri"/>
                 <w:color w:val="1A1A1A"/>
-                <w:sz w:val="36"/>
-                <w:szCs w:val="36"/>
-                <w:rtl/>
-              </w:rPr>
-              <w:t xml:space="preserve">(2) DEF: الزاوية E قائمة (90°‎)، وأضلاعه 3 cm و 4 cm و 5 cm.</w:t>
-            </w:r>
-          </w:p>
-          <w:p>
-            <w:pPr>
+                <w:sz w:val="30"/>
+                <w:szCs w:val="30"/>
+                <w:rtl/>
+              </w:rPr>
+              <w:t xml:space="preserve">• (2) DEF: الزاوية E قائمة (90°‎)، وأضلاعه 3 cm و 4 cm و 5 cm.</w:t>
+            </w:r>
+          </w:p>
+          <w:p>
+            <w:pPr>
+              <w:keepNext/>
               <w:bidi/>
               <w:spacing w:before="0" w:after="40" w:line="276" w:lineRule="auto"/>
             </w:pPr>
@@ -3625,11 +3532,11 @@
               <w:rPr>
                 <w:rFonts w:ascii="Calibri" w:eastAsia="Calibri" w:hAnsi="Calibri" w:cs="Calibri"/>
                 <w:color w:val="1A1A1A"/>
-                <w:sz w:val="36"/>
-                <w:szCs w:val="36"/>
-                <w:rtl/>
-              </w:rPr>
-              <w:t xml:space="preserve">(3) GHI: الضلعان GH و GI متساويان، طول كل منهما 5 cm، والضلع الثالث HI أقصر منهما.</w:t>
+                <w:sz w:val="30"/>
+                <w:szCs w:val="30"/>
+                <w:rtl/>
+              </w:rPr>
+              <w:t xml:space="preserve">• (3) GHI: الضلعان GH و GI متساويان (5 cm)، والضلع HI أقصر منهما.</w:t>
             </w:r>
           </w:p>
         </w:tc>
@@ -3670,7 +3577,7 @@
       <w:tr>
         <w:trPr>
           <w:cantSplit/>
-          <w:trHeight w:val="480"/>
+          <w:trHeight w:val="460"/>
           <w:tblHeader/>
         </w:trPr>
         <w:tc>
@@ -3691,8 +3598,8 @@
                 <w:b/>
                 <w:bCs/>
                 <w:color w:val="FFFFFF"/>
-                <w:sz w:val="28"/>
-                <w:szCs w:val="28"/>
+                <w:sz w:val="30"/>
+                <w:szCs w:val="30"/>
                 <w:rtl/>
               </w:rPr>
               <w:t xml:space="preserve">المثلث</w:t>
@@ -3717,8 +3624,8 @@
                 <w:b/>
                 <w:bCs/>
                 <w:color w:val="FFFFFF"/>
-                <w:sz w:val="28"/>
-                <w:szCs w:val="28"/>
+                <w:sz w:val="30"/>
+                <w:szCs w:val="30"/>
                 <w:rtl/>
               </w:rPr>
               <w:t xml:space="preserve">نوع المثلث</w:t>
@@ -3729,7 +3636,7 @@
       <w:tr>
         <w:trPr>
           <w:cantSplit/>
-          <w:trHeight w:val="640"/>
+          <w:trHeight w:val="600"/>
         </w:trPr>
         <w:tc>
           <w:tcPr>
@@ -3749,8 +3656,8 @@
                 <w:b/>
                 <w:bCs/>
                 <w:color w:val="14532D"/>
-                <w:sz w:val="36"/>
-                <w:szCs w:val="36"/>
+                <w:sz w:val="30"/>
+                <w:szCs w:val="30"/>
                 <w:rtl/>
               </w:rPr>
               <w:t xml:space="preserve">(1) ABC</w:t>
@@ -3783,7 +3690,7 @@
       <w:tr>
         <w:trPr>
           <w:cantSplit/>
-          <w:trHeight w:val="640"/>
+          <w:trHeight w:val="600"/>
         </w:trPr>
         <w:tc>
           <w:tcPr>
@@ -3803,8 +3710,8 @@
                 <w:b/>
                 <w:bCs/>
                 <w:color w:val="14532D"/>
-                <w:sz w:val="36"/>
-                <w:szCs w:val="36"/>
+                <w:sz w:val="30"/>
+                <w:szCs w:val="30"/>
                 <w:rtl/>
               </w:rPr>
               <w:t xml:space="preserve">(2) DEF</w:t>
@@ -3837,7 +3744,7 @@
       <w:tr>
         <w:trPr>
           <w:cantSplit/>
-          <w:trHeight w:val="640"/>
+          <w:trHeight w:val="600"/>
         </w:trPr>
         <w:tc>
           <w:tcPr>
@@ -3857,8 +3764,8 @@
                 <w:b/>
                 <w:bCs/>
                 <w:color w:val="14532D"/>
-                <w:sz w:val="36"/>
-                <w:szCs w:val="36"/>
+                <w:sz w:val="30"/>
+                <w:szCs w:val="30"/>
                 <w:rtl/>
               </w:rPr>
               <w:t xml:space="preserve">(3) GHI</w:t>
@@ -3891,9 +3798,16 @@
     </w:tbl>
     <w:p>
       <w:pPr>
+        <w:pageBreakBefore/>
+        <w:bidi/>
+        <w:spacing w:before="0" w:after="0" w:line="200" w:lineRule="exact"/>
+      </w:pPr>
+    </w:p>
+    <w:p>
+      <w:pPr>
         <w:keepNext/>
         <w:bidi/>
-        <w:spacing w:before="240" w:after="60" w:line="276" w:lineRule="auto"/>
+        <w:spacing w:before="160" w:after="60" w:line="276" w:lineRule="auto"/>
       </w:pPr>
       <w:r>
         <w:rPr>
@@ -3901,23 +3815,11 @@
           <w:b/>
           <w:bCs/>
           <w:color w:val="14532D"/>
-          <w:sz w:val="36"/>
-          <w:szCs w:val="36"/>
-          <w:rtl/>
-        </w:rPr>
-        <w:t xml:space="preserve">ب) </w:t>
-      </w:r>
-      <w:r>
-        <w:rPr>
-          <w:rFonts w:ascii="Calibri" w:eastAsia="Calibri" w:hAnsi="Calibri" w:cs="Calibri"/>
-          <w:b/>
-          <w:bCs/>
-          <w:color w:val="1A1A1A"/>
-          <w:sz w:val="36"/>
-          <w:szCs w:val="36"/>
-          <w:rtl/>
-        </w:rPr>
-        <w:t xml:space="preserve">احسب قياس الزاوية المجهولة:</w:t>
+          <w:sz w:val="34"/>
+          <w:szCs w:val="34"/>
+          <w:rtl/>
+        </w:rPr>
+        <w:t xml:space="preserve">ب) احسب قياس الزاوية المجهولة في كل مثلث.</w:t>
       </w:r>
       <w:r>
         <w:rPr>
@@ -3925,11 +3827,11 @@
           <w:b/>
           <w:bCs/>
           <w:color w:val="B8860B"/>
-          <w:sz w:val="22"/>
-          <w:szCs w:val="22"/>
-          <w:rtl/>
-        </w:rPr>
-        <w:t xml:space="preserve">   (علامتان)</w:t>
+          <w:sz w:val="24"/>
+          <w:szCs w:val="24"/>
+          <w:rtl/>
+        </w:rPr>
+        <w:t xml:space="preserve">  (2)</w:t>
       </w:r>
     </w:p>
     <w:p>
@@ -4009,7 +3911,9 @@
         <w:gridCol w:w="10440"/>
       </w:tblGrid>
       <w:tr>
-        <w:trPr/>
+        <w:trPr>
+          <w:cantSplit/>
+        </w:trPr>
         <w:tc>
           <w:tcPr>
             <w:tcW w:w="10440" w:type="dxa"/>
@@ -4040,8 +3944,8 @@
                 <w:b/>
                 <w:bCs/>
                 <w:color w:val="1F4E79"/>
-                <w:sz w:val="36"/>
-                <w:szCs w:val="36"/>
+                <w:sz w:val="30"/>
+                <w:szCs w:val="30"/>
                 <w:rtl/>
               </w:rPr>
               <w:t xml:space="preserve">وصف الشكل للمكفوفين:</w:t>
@@ -4049,6 +3953,7 @@
           </w:p>
           <w:p>
             <w:pPr>
+              <w:keepNext/>
               <w:bidi/>
               <w:spacing w:before="0" w:after="40" w:line="276" w:lineRule="auto"/>
             </w:pPr>
@@ -4056,15 +3961,16 @@
               <w:rPr>
                 <w:rFonts w:ascii="Calibri" w:eastAsia="Calibri" w:hAnsi="Calibri" w:cs="Calibri"/>
                 <w:color w:val="1A1A1A"/>
-                <w:sz w:val="36"/>
-                <w:szCs w:val="36"/>
-                <w:rtl/>
-              </w:rPr>
-              <w:t xml:space="preserve">(1) ABC: A = 65°‎ و B = 45°‎، والزاوية C مجهولة.</w:t>
-            </w:r>
-          </w:p>
-          <w:p>
-            <w:pPr>
+                <w:sz w:val="30"/>
+                <w:szCs w:val="30"/>
+                <w:rtl/>
+              </w:rPr>
+              <w:t xml:space="preserve">• (1) ABC: A = 65°‎ و B = 45°‎، والزاوية C مجهولة.</w:t>
+            </w:r>
+          </w:p>
+          <w:p>
+            <w:pPr>
+              <w:keepNext/>
               <w:bidi/>
               <w:spacing w:before="0" w:after="40" w:line="276" w:lineRule="auto"/>
             </w:pPr>
@@ -4072,11 +3978,11 @@
               <w:rPr>
                 <w:rFonts w:ascii="Calibri" w:eastAsia="Calibri" w:hAnsi="Calibri" w:cs="Calibri"/>
                 <w:color w:val="1A1A1A"/>
-                <w:sz w:val="36"/>
-                <w:szCs w:val="36"/>
-                <w:rtl/>
-              </w:rPr>
-              <w:t xml:space="preserve">(2) DEF متساوي الساقين (DE = DF) و D = 40°‎، والزاويتان E و F مجهولتان.</w:t>
+                <w:sz w:val="30"/>
+                <w:szCs w:val="30"/>
+                <w:rtl/>
+              </w:rPr>
+              <w:t xml:space="preserve">• (2) DEF متساوي الساقين (DE = DF) و D = 40°‎، والزاويتان E و F مجهولتان.</w:t>
             </w:r>
           </w:p>
         </w:tc>
@@ -4092,17 +3998,29 @@
       <w:pPr>
         <w:keepNext/>
         <w:bidi/>
-        <w:spacing w:before="100" w:after="0" w:line="276" w:lineRule="auto"/>
-      </w:pPr>
+        <w:spacing w:before="120" w:after="40" w:line="276" w:lineRule="auto"/>
+      </w:pPr>
+      <w:r>
+        <w:rPr>
+          <w:rFonts w:ascii="Calibri" w:eastAsia="Calibri" w:hAnsi="Calibri" w:cs="Calibri"/>
+          <w:b/>
+          <w:bCs/>
+          <w:color w:val="14532D"/>
+          <w:sz w:val="34"/>
+          <w:szCs w:val="34"/>
+          <w:rtl/>
+        </w:rPr>
+        <w:t xml:space="preserve">1) </w:t>
+      </w:r>
       <w:r>
         <w:rPr>
           <w:rFonts w:ascii="Calibri" w:eastAsia="Calibri" w:hAnsi="Calibri" w:cs="Calibri"/>
           <w:color w:val="1A1A1A"/>
-          <w:sz w:val="36"/>
-          <w:szCs w:val="36"/>
-          <w:rtl/>
-        </w:rPr>
-        <w:t xml:space="preserve">1) في المثلث ABC، احسب قياس الزاوية C.</w:t>
+          <w:sz w:val="34"/>
+          <w:szCs w:val="34"/>
+          <w:rtl/>
+        </w:rPr>
+        <w:t xml:space="preserve">في المثلث ABC، احسب قياس الزاوية C.</w:t>
       </w:r>
       <w:r>
         <w:rPr>
@@ -4110,11 +4028,11 @@
           <w:b/>
           <w:bCs/>
           <w:color w:val="B8860B"/>
-          <w:sz w:val="22"/>
-          <w:szCs w:val="22"/>
-          <w:rtl/>
-        </w:rPr>
-        <w:t xml:space="preserve">   (1)</w:t>
+          <w:sz w:val="24"/>
+          <w:szCs w:val="24"/>
+          <w:rtl/>
+        </w:rPr>
+        <w:t xml:space="preserve">  (1)</w:t>
       </w:r>
     </w:p>
     <w:p>
@@ -4161,17 +4079,29 @@
       <w:pPr>
         <w:keepNext/>
         <w:bidi/>
-        <w:spacing w:before="100" w:after="0" w:line="276" w:lineRule="auto"/>
-      </w:pPr>
+        <w:spacing w:before="200" w:after="40" w:line="276" w:lineRule="auto"/>
+      </w:pPr>
+      <w:r>
+        <w:rPr>
+          <w:rFonts w:ascii="Calibri" w:eastAsia="Calibri" w:hAnsi="Calibri" w:cs="Calibri"/>
+          <w:b/>
+          <w:bCs/>
+          <w:color w:val="14532D"/>
+          <w:sz w:val="34"/>
+          <w:szCs w:val="34"/>
+          <w:rtl/>
+        </w:rPr>
+        <w:t xml:space="preserve">2) </w:t>
+      </w:r>
       <w:r>
         <w:rPr>
           <w:rFonts w:ascii="Calibri" w:eastAsia="Calibri" w:hAnsi="Calibri" w:cs="Calibri"/>
           <w:color w:val="1A1A1A"/>
-          <w:sz w:val="36"/>
-          <w:szCs w:val="36"/>
-          <w:rtl/>
-        </w:rPr>
-        <w:t xml:space="preserve">2) في المثلث DEF، احسب قياس الزاويتين E و F.</w:t>
+          <w:sz w:val="34"/>
+          <w:szCs w:val="34"/>
+          <w:rtl/>
+        </w:rPr>
+        <w:t xml:space="preserve">في المثلث DEF، احسب قياس الزاويتين E و F.</w:t>
       </w:r>
       <w:r>
         <w:rPr>
@@ -4179,11 +4109,11 @@
           <w:b/>
           <w:bCs/>
           <w:color w:val="B8860B"/>
-          <w:sz w:val="22"/>
-          <w:szCs w:val="22"/>
-          <w:rtl/>
-        </w:rPr>
-        <w:t xml:space="preserve">   (1)</w:t>
+          <w:sz w:val="24"/>
+          <w:szCs w:val="24"/>
+          <w:rtl/>
+        </w:rPr>
+        <w:t xml:space="preserve">  (1)</w:t>
       </w:r>
     </w:p>
     <w:p>
@@ -4229,7 +4159,7 @@
     <w:p>
       <w:pPr>
         <w:bidi/>
-        <w:spacing w:before="0" w:after="0" w:line="240" w:lineRule="exact"/>
+        <w:spacing w:before="0" w:after="0" w:line="300" w:lineRule="exact"/>
       </w:pPr>
     </w:p>
     <w:p>

</xml_diff>

<commit_message>
Fix question 5 left alone on a page: Arial for Arabic text, looser keep-together
Co-Authored-By: Claude Opus 5.5 <noreply@anthropic.com>
Claude-Session: https://claude.ai/code/session_01PHgZqhLAeFoDhbHXzt9YLK
</commit_message>
<xml_diff>
--- a/exams/امتحان-رياضيات-السابع-مع-المثلثات.docx
+++ b/exams/امتحان-رياضيات-السابع-مع-المثلثات.docx
@@ -112,7 +112,7 @@
             </w:pPr>
             <w:r>
               <w:rPr>
-                <w:rFonts w:ascii="Calibri" w:eastAsia="Calibri" w:hAnsi="Calibri" w:cs="Calibri"/>
+                <w:rFonts w:ascii="Calibri" w:eastAsia="Calibri" w:hAnsi="Calibri" w:cs="Arial"/>
                 <w:b/>
                 <w:bCs/>
                 <w:color w:val="14532D"/>
@@ -124,7 +124,7 @@
             </w:r>
             <w:r>
               <w:rPr>
-                <w:rFonts w:ascii="Calibri" w:eastAsia="Calibri" w:hAnsi="Calibri" w:cs="Calibri"/>
+                <w:rFonts w:ascii="Calibri" w:eastAsia="Calibri" w:hAnsi="Calibri" w:cs="Arial"/>
                 <w:b/>
                 <w:bCs/>
                 <w:color w:val="1A1A1A"/>
@@ -148,7 +148,7 @@
             </w:pPr>
             <w:r>
               <w:rPr>
-                <w:rFonts w:ascii="Calibri" w:eastAsia="Calibri" w:hAnsi="Calibri" w:cs="Calibri"/>
+                <w:rFonts w:ascii="Calibri" w:eastAsia="Calibri" w:hAnsi="Calibri" w:cs="Arial"/>
                 <w:b/>
                 <w:bCs/>
                 <w:color w:val="14532D"/>
@@ -160,7 +160,7 @@
             </w:r>
             <w:r>
               <w:rPr>
-                <w:rFonts w:ascii="Calibri" w:eastAsia="Calibri" w:hAnsi="Calibri" w:cs="Calibri"/>
+                <w:rFonts w:ascii="Calibri" w:eastAsia="Calibri" w:hAnsi="Calibri" w:cs="Arial"/>
                 <w:b/>
                 <w:bCs/>
                 <w:color w:val="1A1A1A"/>
@@ -186,7 +186,7 @@
             </w:pPr>
             <w:r>
               <w:rPr>
-                <w:rFonts w:ascii="Calibri" w:eastAsia="Calibri" w:hAnsi="Calibri" w:cs="Calibri"/>
+                <w:rFonts w:ascii="Calibri" w:eastAsia="Calibri" w:hAnsi="Calibri" w:cs="Arial"/>
                 <w:b/>
                 <w:bCs/>
                 <w:color w:val="FFFFFF"/>
@@ -216,7 +216,7 @@
             </w:pPr>
             <w:r>
               <w:rPr>
-                <w:rFonts w:ascii="Calibri" w:eastAsia="Calibri" w:hAnsi="Calibri" w:cs="Calibri"/>
+                <w:rFonts w:ascii="Calibri" w:eastAsia="Calibri" w:hAnsi="Calibri" w:cs="Arial"/>
                 <w:b/>
                 <w:bCs/>
                 <w:color w:val="14532D"/>
@@ -228,7 +228,7 @@
             </w:r>
             <w:r>
               <w:rPr>
-                <w:rFonts w:ascii="Calibri" w:eastAsia="Calibri" w:hAnsi="Calibri" w:cs="Calibri"/>
+                <w:rFonts w:ascii="Calibri" w:eastAsia="Calibri" w:hAnsi="Calibri" w:cs="Arial"/>
                 <w:b/>
                 <w:bCs/>
                 <w:color w:val="1A1A1A"/>
@@ -252,7 +252,7 @@
             </w:pPr>
             <w:r>
               <w:rPr>
-                <w:rFonts w:ascii="Calibri" w:eastAsia="Calibri" w:hAnsi="Calibri" w:cs="Calibri"/>
+                <w:rFonts w:ascii="Calibri" w:eastAsia="Calibri" w:hAnsi="Calibri" w:cs="Arial"/>
                 <w:b/>
                 <w:bCs/>
                 <w:color w:val="14532D"/>
@@ -264,7 +264,7 @@
             </w:r>
             <w:r>
               <w:rPr>
-                <w:rFonts w:ascii="Calibri" w:eastAsia="Calibri" w:hAnsi="Calibri" w:cs="Calibri"/>
+                <w:rFonts w:ascii="Calibri" w:eastAsia="Calibri" w:hAnsi="Calibri" w:cs="Arial"/>
                 <w:b/>
                 <w:bCs/>
                 <w:color w:val="1A1A1A"/>
@@ -290,7 +290,7 @@
             </w:pPr>
             <w:r>
               <w:rPr>
-                <w:rFonts w:ascii="Calibri" w:eastAsia="Calibri" w:hAnsi="Calibri" w:cs="Calibri"/>
+                <w:rFonts w:ascii="Calibri" w:eastAsia="Calibri" w:hAnsi="Calibri" w:cs="Arial"/>
                 <w:b/>
                 <w:bCs/>
                 <w:color w:val="14532D"/>
@@ -364,7 +364,7 @@
             </w:pPr>
             <w:r>
               <w:rPr>
-                <w:rFonts w:ascii="Calibri" w:eastAsia="Calibri" w:hAnsi="Calibri" w:cs="Calibri"/>
+                <w:rFonts w:ascii="Calibri" w:eastAsia="Calibri" w:hAnsi="Calibri" w:cs="Arial"/>
                 <w:b/>
                 <w:bCs/>
                 <w:color w:val="FFFFFF"/>
@@ -391,7 +391,7 @@
             </w:pPr>
             <w:r>
               <w:rPr>
-                <w:rFonts w:ascii="Calibri" w:eastAsia="Calibri" w:hAnsi="Calibri" w:cs="Calibri"/>
+                <w:rFonts w:ascii="Calibri" w:eastAsia="Calibri" w:hAnsi="Calibri" w:cs="Arial"/>
                 <w:b/>
                 <w:bCs/>
                 <w:color w:val="14532D"/>
@@ -419,7 +419,7 @@
       </w:pPr>
       <w:r>
         <w:rPr>
-          <w:rFonts w:ascii="Calibri" w:eastAsia="Calibri" w:hAnsi="Calibri" w:cs="Calibri"/>
+          <w:rFonts w:ascii="Calibri" w:eastAsia="Calibri" w:hAnsi="Calibri" w:cs="Arial"/>
           <w:b/>
           <w:bCs/>
           <w:color w:val="1A1A1A"/>
@@ -431,7 +431,7 @@
       </w:r>
       <w:r>
         <w:rPr>
-          <w:rFonts w:ascii="Calibri" w:eastAsia="Calibri" w:hAnsi="Calibri" w:cs="Calibri"/>
+          <w:rFonts w:ascii="Calibri" w:eastAsia="Calibri" w:hAnsi="Calibri" w:cs="Arial"/>
           <w:b/>
           <w:bCs/>
           <w:color w:val="B8860B"/>
@@ -439,7 +439,7 @@
           <w:szCs w:val="24"/>
           <w:rtl/>
         </w:rPr>
-        <w:t xml:space="preserve">  (0.5 لكل عبارة)</w:t>
+        <w:t xml:space="preserve">  (0.5 لكل عبارة)</w:t>
       </w:r>
     </w:p>
     <w:p>
@@ -450,7 +450,7 @@
       </w:pPr>
       <w:r>
         <w:rPr>
-          <w:rFonts w:ascii="Calibri" w:eastAsia="Calibri" w:hAnsi="Calibri" w:cs="Calibri"/>
+          <w:rFonts w:ascii="Calibri" w:eastAsia="Calibri" w:hAnsi="Calibri" w:cs="Arial"/>
           <w:i/>
           <w:iCs/>
           <w:color w:val="1F4E79"/>
@@ -509,7 +509,7 @@
             </w:pPr>
             <w:r>
               <w:rPr>
-                <w:rFonts w:ascii="Calibri" w:eastAsia="Calibri" w:hAnsi="Calibri" w:cs="Calibri"/>
+                <w:rFonts w:ascii="Calibri" w:eastAsia="Calibri" w:hAnsi="Calibri" w:cs="Arial"/>
                 <w:b/>
                 <w:bCs/>
                 <w:color w:val="FFFFFF"/>
@@ -535,7 +535,7 @@
             </w:pPr>
             <w:r>
               <w:rPr>
-                <w:rFonts w:ascii="Calibri" w:eastAsia="Calibri" w:hAnsi="Calibri" w:cs="Calibri"/>
+                <w:rFonts w:ascii="Calibri" w:eastAsia="Calibri" w:hAnsi="Calibri" w:cs="Arial"/>
                 <w:b/>
                 <w:bCs/>
                 <w:color w:val="FFFFFF"/>
@@ -561,7 +561,7 @@
             </w:pPr>
             <w:r>
               <w:rPr>
-                <w:rFonts w:ascii="Calibri" w:eastAsia="Calibri" w:hAnsi="Calibri" w:cs="Calibri"/>
+                <w:rFonts w:ascii="Calibri" w:eastAsia="Calibri" w:hAnsi="Calibri" w:cs="Arial"/>
                 <w:b/>
                 <w:bCs/>
                 <w:color w:val="FFFFFF"/>
@@ -587,7 +587,7 @@
             </w:pPr>
             <w:r>
               <w:rPr>
-                <w:rFonts w:ascii="Calibri" w:eastAsia="Calibri" w:hAnsi="Calibri" w:cs="Calibri"/>
+                <w:rFonts w:ascii="Calibri" w:eastAsia="Calibri" w:hAnsi="Calibri" w:cs="Arial"/>
                 <w:b/>
                 <w:bCs/>
                 <w:color w:val="FFFFFF"/>
@@ -619,7 +619,7 @@
             </w:pPr>
             <w:r>
               <w:rPr>
-                <w:rFonts w:ascii="Calibri" w:eastAsia="Calibri" w:hAnsi="Calibri" w:cs="Calibri"/>
+                <w:rFonts w:ascii="Calibri" w:eastAsia="Calibri" w:hAnsi="Calibri" w:cs="Arial"/>
                 <w:b/>
                 <w:bCs/>
                 <w:color w:val="14532D"/>
@@ -643,7 +643,7 @@
             </w:pPr>
             <w:r>
               <w:rPr>
-                <w:rFonts w:ascii="Calibri" w:eastAsia="Calibri" w:hAnsi="Calibri" w:cs="Calibri"/>
+                <w:rFonts w:ascii="Calibri" w:eastAsia="Calibri" w:hAnsi="Calibri" w:cs="Arial"/>
                 <w:color w:val="1A1A1A"/>
                 <w:sz w:val="30"/>
                 <w:szCs w:val="30"/>
@@ -666,7 +666,7 @@
             </w:pPr>
             <w:r>
               <w:rPr>
-                <w:rFonts w:ascii="Calibri" w:eastAsia="Calibri" w:hAnsi="Calibri" w:cs="Calibri"/>
+                <w:rFonts w:ascii="Calibri" w:eastAsia="Calibri" w:hAnsi="Calibri" w:cs="Arial"/>
                 <w:color w:val="7A7A7A"/>
                 <w:sz w:val="34"/>
                 <w:szCs w:val="34"/>
@@ -689,7 +689,7 @@
             </w:pPr>
             <w:r>
               <w:rPr>
-                <w:rFonts w:ascii="Calibri" w:eastAsia="Calibri" w:hAnsi="Calibri" w:cs="Calibri"/>
+                <w:rFonts w:ascii="Calibri" w:eastAsia="Calibri" w:hAnsi="Calibri" w:cs="Arial"/>
                 <w:color w:val="7A7A7A"/>
                 <w:sz w:val="34"/>
                 <w:szCs w:val="34"/>
@@ -719,7 +719,7 @@
             </w:pPr>
             <w:r>
               <w:rPr>
-                <w:rFonts w:ascii="Calibri" w:eastAsia="Calibri" w:hAnsi="Calibri" w:cs="Calibri"/>
+                <w:rFonts w:ascii="Calibri" w:eastAsia="Calibri" w:hAnsi="Calibri" w:cs="Arial"/>
                 <w:b/>
                 <w:bCs/>
                 <w:color w:val="14532D"/>
@@ -743,7 +743,7 @@
             </w:pPr>
             <w:r>
               <w:rPr>
-                <w:rFonts w:ascii="Calibri" w:eastAsia="Calibri" w:hAnsi="Calibri" w:cs="Calibri"/>
+                <w:rFonts w:ascii="Calibri" w:eastAsia="Calibri" w:hAnsi="Calibri" w:cs="Arial"/>
                 <w:color w:val="1A1A1A"/>
                 <w:sz w:val="30"/>
                 <w:szCs w:val="30"/>
@@ -766,7 +766,7 @@
             </w:pPr>
             <w:r>
               <w:rPr>
-                <w:rFonts w:ascii="Calibri" w:eastAsia="Calibri" w:hAnsi="Calibri" w:cs="Calibri"/>
+                <w:rFonts w:ascii="Calibri" w:eastAsia="Calibri" w:hAnsi="Calibri" w:cs="Arial"/>
                 <w:color w:val="7A7A7A"/>
                 <w:sz w:val="34"/>
                 <w:szCs w:val="34"/>
@@ -789,7 +789,7 @@
             </w:pPr>
             <w:r>
               <w:rPr>
-                <w:rFonts w:ascii="Calibri" w:eastAsia="Calibri" w:hAnsi="Calibri" w:cs="Calibri"/>
+                <w:rFonts w:ascii="Calibri" w:eastAsia="Calibri" w:hAnsi="Calibri" w:cs="Arial"/>
                 <w:color w:val="7A7A7A"/>
                 <w:sz w:val="34"/>
                 <w:szCs w:val="34"/>
@@ -819,7 +819,7 @@
             </w:pPr>
             <w:r>
               <w:rPr>
-                <w:rFonts w:ascii="Calibri" w:eastAsia="Calibri" w:hAnsi="Calibri" w:cs="Calibri"/>
+                <w:rFonts w:ascii="Calibri" w:eastAsia="Calibri" w:hAnsi="Calibri" w:cs="Arial"/>
                 <w:b/>
                 <w:bCs/>
                 <w:color w:val="14532D"/>
@@ -843,7 +843,7 @@
             </w:pPr>
             <w:r>
               <w:rPr>
-                <w:rFonts w:ascii="Calibri" w:eastAsia="Calibri" w:hAnsi="Calibri" w:cs="Calibri"/>
+                <w:rFonts w:ascii="Calibri" w:eastAsia="Calibri" w:hAnsi="Calibri" w:cs="Arial"/>
                 <w:color w:val="1A1A1A"/>
                 <w:sz w:val="30"/>
                 <w:szCs w:val="30"/>
@@ -866,7 +866,7 @@
             </w:pPr>
             <w:r>
               <w:rPr>
-                <w:rFonts w:ascii="Calibri" w:eastAsia="Calibri" w:hAnsi="Calibri" w:cs="Calibri"/>
+                <w:rFonts w:ascii="Calibri" w:eastAsia="Calibri" w:hAnsi="Calibri" w:cs="Arial"/>
                 <w:color w:val="7A7A7A"/>
                 <w:sz w:val="34"/>
                 <w:szCs w:val="34"/>
@@ -889,7 +889,7 @@
             </w:pPr>
             <w:r>
               <w:rPr>
-                <w:rFonts w:ascii="Calibri" w:eastAsia="Calibri" w:hAnsi="Calibri" w:cs="Calibri"/>
+                <w:rFonts w:ascii="Calibri" w:eastAsia="Calibri" w:hAnsi="Calibri" w:cs="Arial"/>
                 <w:color w:val="7A7A7A"/>
                 <w:sz w:val="34"/>
                 <w:szCs w:val="34"/>
@@ -919,7 +919,7 @@
             </w:pPr>
             <w:r>
               <w:rPr>
-                <w:rFonts w:ascii="Calibri" w:eastAsia="Calibri" w:hAnsi="Calibri" w:cs="Calibri"/>
+                <w:rFonts w:ascii="Calibri" w:eastAsia="Calibri" w:hAnsi="Calibri" w:cs="Arial"/>
                 <w:b/>
                 <w:bCs/>
                 <w:color w:val="14532D"/>
@@ -943,7 +943,7 @@
             </w:pPr>
             <w:r>
               <w:rPr>
-                <w:rFonts w:ascii="Calibri" w:eastAsia="Calibri" w:hAnsi="Calibri" w:cs="Calibri"/>
+                <w:rFonts w:ascii="Calibri" w:eastAsia="Calibri" w:hAnsi="Calibri" w:cs="Arial"/>
                 <w:color w:val="1A1A1A"/>
                 <w:sz w:val="30"/>
                 <w:szCs w:val="30"/>
@@ -966,7 +966,7 @@
             </w:pPr>
             <w:r>
               <w:rPr>
-                <w:rFonts w:ascii="Calibri" w:eastAsia="Calibri" w:hAnsi="Calibri" w:cs="Calibri"/>
+                <w:rFonts w:ascii="Calibri" w:eastAsia="Calibri" w:hAnsi="Calibri" w:cs="Arial"/>
                 <w:color w:val="7A7A7A"/>
                 <w:sz w:val="34"/>
                 <w:szCs w:val="34"/>
@@ -989,7 +989,7 @@
             </w:pPr>
             <w:r>
               <w:rPr>
-                <w:rFonts w:ascii="Calibri" w:eastAsia="Calibri" w:hAnsi="Calibri" w:cs="Calibri"/>
+                <w:rFonts w:ascii="Calibri" w:eastAsia="Calibri" w:hAnsi="Calibri" w:cs="Arial"/>
                 <w:color w:val="7A7A7A"/>
                 <w:sz w:val="34"/>
                 <w:szCs w:val="34"/>
@@ -1019,7 +1019,7 @@
             </w:pPr>
             <w:r>
               <w:rPr>
-                <w:rFonts w:ascii="Calibri" w:eastAsia="Calibri" w:hAnsi="Calibri" w:cs="Calibri"/>
+                <w:rFonts w:ascii="Calibri" w:eastAsia="Calibri" w:hAnsi="Calibri" w:cs="Arial"/>
                 <w:b/>
                 <w:bCs/>
                 <w:color w:val="14532D"/>
@@ -1043,7 +1043,7 @@
             </w:pPr>
             <w:r>
               <w:rPr>
-                <w:rFonts w:ascii="Calibri" w:eastAsia="Calibri" w:hAnsi="Calibri" w:cs="Calibri"/>
+                <w:rFonts w:ascii="Calibri" w:eastAsia="Calibri" w:hAnsi="Calibri" w:cs="Arial"/>
                 <w:color w:val="1A1A1A"/>
                 <w:sz w:val="30"/>
                 <w:szCs w:val="30"/>
@@ -1066,7 +1066,7 @@
             </w:pPr>
             <w:r>
               <w:rPr>
-                <w:rFonts w:ascii="Calibri" w:eastAsia="Calibri" w:hAnsi="Calibri" w:cs="Calibri"/>
+                <w:rFonts w:ascii="Calibri" w:eastAsia="Calibri" w:hAnsi="Calibri" w:cs="Arial"/>
                 <w:color w:val="7A7A7A"/>
                 <w:sz w:val="34"/>
                 <w:szCs w:val="34"/>
@@ -1089,7 +1089,7 @@
             </w:pPr>
             <w:r>
               <w:rPr>
-                <w:rFonts w:ascii="Calibri" w:eastAsia="Calibri" w:hAnsi="Calibri" w:cs="Calibri"/>
+                <w:rFonts w:ascii="Calibri" w:eastAsia="Calibri" w:hAnsi="Calibri" w:cs="Arial"/>
                 <w:color w:val="7A7A7A"/>
                 <w:sz w:val="34"/>
                 <w:szCs w:val="34"/>
@@ -1119,7 +1119,7 @@
             </w:pPr>
             <w:r>
               <w:rPr>
-                <w:rFonts w:ascii="Calibri" w:eastAsia="Calibri" w:hAnsi="Calibri" w:cs="Calibri"/>
+                <w:rFonts w:ascii="Calibri" w:eastAsia="Calibri" w:hAnsi="Calibri" w:cs="Arial"/>
                 <w:b/>
                 <w:bCs/>
                 <w:color w:val="14532D"/>
@@ -1143,7 +1143,7 @@
             </w:pPr>
             <w:r>
               <w:rPr>
-                <w:rFonts w:ascii="Calibri" w:eastAsia="Calibri" w:hAnsi="Calibri" w:cs="Calibri"/>
+                <w:rFonts w:ascii="Calibri" w:eastAsia="Calibri" w:hAnsi="Calibri" w:cs="Arial"/>
                 <w:color w:val="1A1A1A"/>
                 <w:sz w:val="30"/>
                 <w:szCs w:val="30"/>
@@ -1166,7 +1166,7 @@
             </w:pPr>
             <w:r>
               <w:rPr>
-                <w:rFonts w:ascii="Calibri" w:eastAsia="Calibri" w:hAnsi="Calibri" w:cs="Calibri"/>
+                <w:rFonts w:ascii="Calibri" w:eastAsia="Calibri" w:hAnsi="Calibri" w:cs="Arial"/>
                 <w:color w:val="7A7A7A"/>
                 <w:sz w:val="34"/>
                 <w:szCs w:val="34"/>
@@ -1189,7 +1189,7 @@
             </w:pPr>
             <w:r>
               <w:rPr>
-                <w:rFonts w:ascii="Calibri" w:eastAsia="Calibri" w:hAnsi="Calibri" w:cs="Calibri"/>
+                <w:rFonts w:ascii="Calibri" w:eastAsia="Calibri" w:hAnsi="Calibri" w:cs="Arial"/>
                 <w:color w:val="7A7A7A"/>
                 <w:sz w:val="34"/>
                 <w:szCs w:val="34"/>
@@ -1219,7 +1219,7 @@
             </w:pPr>
             <w:r>
               <w:rPr>
-                <w:rFonts w:ascii="Calibri" w:eastAsia="Calibri" w:hAnsi="Calibri" w:cs="Calibri"/>
+                <w:rFonts w:ascii="Calibri" w:eastAsia="Calibri" w:hAnsi="Calibri" w:cs="Arial"/>
                 <w:b/>
                 <w:bCs/>
                 <w:color w:val="14532D"/>
@@ -1243,7 +1243,7 @@
             </w:pPr>
             <w:r>
               <w:rPr>
-                <w:rFonts w:ascii="Calibri" w:eastAsia="Calibri" w:hAnsi="Calibri" w:cs="Calibri"/>
+                <w:rFonts w:ascii="Calibri" w:eastAsia="Calibri" w:hAnsi="Calibri" w:cs="Arial"/>
                 <w:color w:val="1A1A1A"/>
                 <w:sz w:val="30"/>
                 <w:szCs w:val="30"/>
@@ -1266,7 +1266,7 @@
             </w:pPr>
             <w:r>
               <w:rPr>
-                <w:rFonts w:ascii="Calibri" w:eastAsia="Calibri" w:hAnsi="Calibri" w:cs="Calibri"/>
+                <w:rFonts w:ascii="Calibri" w:eastAsia="Calibri" w:hAnsi="Calibri" w:cs="Arial"/>
                 <w:color w:val="7A7A7A"/>
                 <w:sz w:val="34"/>
                 <w:szCs w:val="34"/>
@@ -1289,7 +1289,7 @@
             </w:pPr>
             <w:r>
               <w:rPr>
-                <w:rFonts w:ascii="Calibri" w:eastAsia="Calibri" w:hAnsi="Calibri" w:cs="Calibri"/>
+                <w:rFonts w:ascii="Calibri" w:eastAsia="Calibri" w:hAnsi="Calibri" w:cs="Arial"/>
                 <w:color w:val="7A7A7A"/>
                 <w:sz w:val="34"/>
                 <w:szCs w:val="34"/>
@@ -1356,7 +1356,7 @@
             </w:pPr>
             <w:r>
               <w:rPr>
-                <w:rFonts w:ascii="Calibri" w:eastAsia="Calibri" w:hAnsi="Calibri" w:cs="Calibri"/>
+                <w:rFonts w:ascii="Calibri" w:eastAsia="Calibri" w:hAnsi="Calibri" w:cs="Arial"/>
                 <w:b/>
                 <w:bCs/>
                 <w:color w:val="FFFFFF"/>
@@ -1383,7 +1383,7 @@
             </w:pPr>
             <w:r>
               <w:rPr>
-                <w:rFonts w:ascii="Calibri" w:eastAsia="Calibri" w:hAnsi="Calibri" w:cs="Calibri"/>
+                <w:rFonts w:ascii="Calibri" w:eastAsia="Calibri" w:hAnsi="Calibri" w:cs="Arial"/>
                 <w:b/>
                 <w:bCs/>
                 <w:color w:val="14532D"/>
@@ -1411,7 +1411,7 @@
       </w:pPr>
       <w:r>
         <w:rPr>
-          <w:rFonts w:ascii="Calibri" w:eastAsia="Calibri" w:hAnsi="Calibri" w:cs="Calibri"/>
+          <w:rFonts w:ascii="Calibri" w:eastAsia="Calibri" w:hAnsi="Calibri" w:cs="Arial"/>
           <w:color w:val="1A1A1A"/>
           <w:sz w:val="34"/>
           <w:szCs w:val="34"/>
@@ -1751,7 +1751,7 @@
       </w:pPr>
       <w:r>
         <w:rPr>
-          <w:rFonts w:ascii="Calibri" w:eastAsia="Calibri" w:hAnsi="Calibri" w:cs="Calibri"/>
+          <w:rFonts w:ascii="Calibri" w:eastAsia="Calibri" w:hAnsi="Calibri" w:cs="Arial"/>
           <w:b/>
           <w:bCs/>
           <w:color w:val="1A1A1A"/>
@@ -1770,7 +1770,7 @@
       </w:pPr>
       <w:r>
         <w:rPr>
-          <w:rFonts w:ascii="Calibri" w:eastAsia="Calibri" w:hAnsi="Calibri" w:cs="Calibri"/>
+          <w:rFonts w:ascii="Calibri" w:eastAsia="Calibri" w:hAnsi="Calibri" w:cs="Arial"/>
           <w:b/>
           <w:bCs/>
           <w:color w:val="14532D"/>
@@ -1782,17 +1782,17 @@
       </w:r>
       <w:r>
         <w:rPr>
-          <w:rFonts w:ascii="Calibri" w:eastAsia="Calibri" w:hAnsi="Calibri" w:cs="Calibri"/>
+          <w:rFonts w:ascii="Calibri" w:eastAsia="Calibri" w:hAnsi="Calibri" w:cs="Arial"/>
           <w:color w:val="1A1A1A"/>
           <w:sz w:val="34"/>
           <w:szCs w:val="34"/>
           <w:rtl/>
         </w:rPr>
-        <w:t xml:space="preserve">القيمة المدفوعة إذا اشترت ندى كيلو قهوة وقارورتين من عصير الرمان.</w:t>
-      </w:r>
-      <w:r>
-        <w:rPr>
-          <w:rFonts w:ascii="Calibri" w:eastAsia="Calibri" w:hAnsi="Calibri" w:cs="Calibri"/>
+        <w:t xml:space="preserve">اشترت ندى كيلو قهوة وقارورتين من عصير الرمان، احسب المبلغ المدفوع.</w:t>
+      </w:r>
+      <w:r>
+        <w:rPr>
+          <w:rFonts w:ascii="Calibri" w:eastAsia="Calibri" w:hAnsi="Calibri" w:cs="Arial"/>
           <w:b/>
           <w:bCs/>
           <w:color w:val="B8860B"/>
@@ -1800,7 +1800,7 @@
           <w:szCs w:val="24"/>
           <w:rtl/>
         </w:rPr>
-        <w:t xml:space="preserve">  (1.5)</w:t>
+        <w:t xml:space="preserve">  (1.5)</w:t>
       </w:r>
     </w:p>
     <w:p>
@@ -1814,7 +1814,7 @@
       </w:pPr>
       <w:r>
         <w:rPr>
-          <w:rFonts w:ascii="Calibri" w:eastAsia="Calibri" w:hAnsi="Calibri" w:cs="Calibri"/>
+          <w:rFonts w:ascii="Calibri" w:eastAsia="Calibri" w:hAnsi="Calibri" w:cs="Arial"/>
           <w:color w:val="1A1A1A"/>
           <w:sz w:val="28"/>
           <w:szCs w:val="28"/>
@@ -1834,7 +1834,7 @@
       </w:pPr>
       <w:r>
         <w:rPr>
-          <w:rFonts w:ascii="Calibri" w:eastAsia="Calibri" w:hAnsi="Calibri" w:cs="Calibri"/>
+          <w:rFonts w:ascii="Calibri" w:eastAsia="Calibri" w:hAnsi="Calibri" w:cs="Arial"/>
           <w:color w:val="1A1A1A"/>
           <w:sz w:val="28"/>
           <w:szCs w:val="28"/>
@@ -1851,7 +1851,7 @@
       </w:pPr>
       <w:r>
         <w:rPr>
-          <w:rFonts w:ascii="Calibri" w:eastAsia="Calibri" w:hAnsi="Calibri" w:cs="Calibri"/>
+          <w:rFonts w:ascii="Calibri" w:eastAsia="Calibri" w:hAnsi="Calibri" w:cs="Arial"/>
           <w:b/>
           <w:bCs/>
           <w:color w:val="14532D"/>
@@ -1863,7 +1863,7 @@
       </w:r>
       <w:r>
         <w:rPr>
-          <w:rFonts w:ascii="Calibri" w:eastAsia="Calibri" w:hAnsi="Calibri" w:cs="Calibri"/>
+          <w:rFonts w:ascii="Calibri" w:eastAsia="Calibri" w:hAnsi="Calibri" w:cs="Arial"/>
           <w:color w:val="1A1A1A"/>
           <w:sz w:val="34"/>
           <w:szCs w:val="34"/>
@@ -1873,7 +1873,7 @@
       </w:r>
       <w:r>
         <w:rPr>
-          <w:rFonts w:ascii="Calibri" w:eastAsia="Calibri" w:hAnsi="Calibri" w:cs="Calibri"/>
+          <w:rFonts w:ascii="Calibri" w:eastAsia="Calibri" w:hAnsi="Calibri" w:cs="Arial"/>
           <w:b/>
           <w:bCs/>
           <w:color w:val="B8860B"/>
@@ -1881,7 +1881,7 @@
           <w:szCs w:val="24"/>
           <w:rtl/>
         </w:rPr>
-        <w:t xml:space="preserve">  (1.5)</w:t>
+        <w:t xml:space="preserve">  (1.5)</w:t>
       </w:r>
     </w:p>
     <w:p>
@@ -1895,7 +1895,7 @@
       </w:pPr>
       <w:r>
         <w:rPr>
-          <w:rFonts w:ascii="Calibri" w:eastAsia="Calibri" w:hAnsi="Calibri" w:cs="Calibri"/>
+          <w:rFonts w:ascii="Calibri" w:eastAsia="Calibri" w:hAnsi="Calibri" w:cs="Arial"/>
           <w:color w:val="1A1A1A"/>
           <w:sz w:val="28"/>
           <w:szCs w:val="28"/>
@@ -1915,7 +1915,7 @@
       </w:pPr>
       <w:r>
         <w:rPr>
-          <w:rFonts w:ascii="Calibri" w:eastAsia="Calibri" w:hAnsi="Calibri" w:cs="Calibri"/>
+          <w:rFonts w:ascii="Calibri" w:eastAsia="Calibri" w:hAnsi="Calibri" w:cs="Arial"/>
           <w:color w:val="1A1A1A"/>
           <w:sz w:val="28"/>
           <w:szCs w:val="28"/>
@@ -1978,7 +1978,7 @@
             </w:pPr>
             <w:r>
               <w:rPr>
-                <w:rFonts w:ascii="Calibri" w:eastAsia="Calibri" w:hAnsi="Calibri" w:cs="Calibri"/>
+                <w:rFonts w:ascii="Calibri" w:eastAsia="Calibri" w:hAnsi="Calibri" w:cs="Arial"/>
                 <w:b/>
                 <w:bCs/>
                 <w:color w:val="FFFFFF"/>
@@ -2005,7 +2005,7 @@
             </w:pPr>
             <w:r>
               <w:rPr>
-                <w:rFonts w:ascii="Calibri" w:eastAsia="Calibri" w:hAnsi="Calibri" w:cs="Calibri"/>
+                <w:rFonts w:ascii="Calibri" w:eastAsia="Calibri" w:hAnsi="Calibri" w:cs="Arial"/>
                 <w:b/>
                 <w:bCs/>
                 <w:color w:val="14532D"/>
@@ -2032,7 +2032,7 @@
       </w:pPr>
       <w:r>
         <w:rPr>
-          <w:rFonts w:ascii="Calibri" w:eastAsia="Calibri" w:hAnsi="Calibri" w:cs="Calibri"/>
+          <w:rFonts w:ascii="Calibri" w:eastAsia="Calibri" w:hAnsi="Calibri" w:cs="Arial"/>
           <w:b/>
           <w:bCs/>
           <w:color w:val="1A1A1A"/>
@@ -2044,7 +2044,7 @@
       </w:r>
       <w:r>
         <w:rPr>
-          <w:rFonts w:ascii="Calibri" w:eastAsia="Calibri" w:hAnsi="Calibri" w:cs="Calibri"/>
+          <w:rFonts w:ascii="Calibri" w:eastAsia="Calibri" w:hAnsi="Calibri" w:cs="Arial"/>
           <w:color w:val="9E9E9E"/>
           <w:sz w:val="34"/>
           <w:szCs w:val="34"/>
@@ -2054,7 +2054,7 @@
       </w:r>
       <w:r>
         <w:rPr>
-          <w:rFonts w:ascii="Calibri" w:eastAsia="Calibri" w:hAnsi="Calibri" w:cs="Calibri"/>
+          <w:rFonts w:ascii="Calibri" w:eastAsia="Calibri" w:hAnsi="Calibri" w:cs="Arial"/>
           <w:b/>
           <w:bCs/>
           <w:color w:val="B8860B"/>
@@ -2062,7 +2062,7 @@
           <w:szCs w:val="24"/>
           <w:rtl/>
         </w:rPr>
-        <w:t xml:space="preserve">  (0.5)</w:t>
+        <w:t xml:space="preserve">  (0.5)</w:t>
       </w:r>
     </w:p>
     <w:p>
@@ -2072,7 +2072,7 @@
       </w:pPr>
       <w:r>
         <w:rPr>
-          <w:rFonts w:ascii="Calibri" w:eastAsia="Calibri" w:hAnsi="Calibri" w:cs="Calibri"/>
+          <w:rFonts w:ascii="Calibri" w:eastAsia="Calibri" w:hAnsi="Calibri" w:cs="Arial"/>
           <w:b/>
           <w:bCs/>
           <w:color w:val="1A1A1A"/>
@@ -2084,7 +2084,7 @@
       </w:r>
       <w:r>
         <w:rPr>
-          <w:rFonts w:ascii="Calibri" w:eastAsia="Calibri" w:hAnsi="Calibri" w:cs="Calibri"/>
+          <w:rFonts w:ascii="Calibri" w:eastAsia="Calibri" w:hAnsi="Calibri" w:cs="Arial"/>
           <w:color w:val="9E9E9E"/>
           <w:sz w:val="34"/>
           <w:szCs w:val="34"/>
@@ -2094,7 +2094,7 @@
       </w:r>
       <w:r>
         <w:rPr>
-          <w:rFonts w:ascii="Calibri" w:eastAsia="Calibri" w:hAnsi="Calibri" w:cs="Calibri"/>
+          <w:rFonts w:ascii="Calibri" w:eastAsia="Calibri" w:hAnsi="Calibri" w:cs="Arial"/>
           <w:b/>
           <w:bCs/>
           <w:color w:val="B8860B"/>
@@ -2102,7 +2102,7 @@
           <w:szCs w:val="24"/>
           <w:rtl/>
         </w:rPr>
-        <w:t xml:space="preserve">  (0.5)</w:t>
+        <w:t xml:space="preserve">  (0.5)</w:t>
       </w:r>
     </w:p>
     <w:p>
@@ -2112,7 +2112,7 @@
       </w:pPr>
       <w:r>
         <w:rPr>
-          <w:rFonts w:ascii="Calibri" w:eastAsia="Calibri" w:hAnsi="Calibri" w:cs="Calibri"/>
+          <w:rFonts w:ascii="Calibri" w:eastAsia="Calibri" w:hAnsi="Calibri" w:cs="Arial"/>
           <w:b/>
           <w:bCs/>
           <w:color w:val="1A1A1A"/>
@@ -2124,7 +2124,7 @@
       </w:r>
       <w:r>
         <w:rPr>
-          <w:rFonts w:ascii="Calibri" w:eastAsia="Calibri" w:hAnsi="Calibri" w:cs="Calibri"/>
+          <w:rFonts w:ascii="Calibri" w:eastAsia="Calibri" w:hAnsi="Calibri" w:cs="Arial"/>
           <w:color w:val="9E9E9E"/>
           <w:sz w:val="34"/>
           <w:szCs w:val="34"/>
@@ -2134,7 +2134,7 @@
       </w:r>
       <w:r>
         <w:rPr>
-          <w:rFonts w:ascii="Calibri" w:eastAsia="Calibri" w:hAnsi="Calibri" w:cs="Calibri"/>
+          <w:rFonts w:ascii="Calibri" w:eastAsia="Calibri" w:hAnsi="Calibri" w:cs="Arial"/>
           <w:b/>
           <w:bCs/>
           <w:color w:val="B8860B"/>
@@ -2142,7 +2142,7 @@
           <w:szCs w:val="24"/>
           <w:rtl/>
         </w:rPr>
-        <w:t xml:space="preserve">  (0.5)</w:t>
+        <w:t xml:space="preserve">  (0.5)</w:t>
       </w:r>
     </w:p>
     <w:p>
@@ -2199,7 +2199,7 @@
             </w:pPr>
             <w:r>
               <w:rPr>
-                <w:rFonts w:ascii="Calibri" w:eastAsia="Calibri" w:hAnsi="Calibri" w:cs="Calibri"/>
+                <w:rFonts w:ascii="Calibri" w:eastAsia="Calibri" w:hAnsi="Calibri" w:cs="Arial"/>
                 <w:b/>
                 <w:bCs/>
                 <w:color w:val="FFFFFF"/>
@@ -2226,7 +2226,7 @@
             </w:pPr>
             <w:r>
               <w:rPr>
-                <w:rFonts w:ascii="Calibri" w:eastAsia="Calibri" w:hAnsi="Calibri" w:cs="Calibri"/>
+                <w:rFonts w:ascii="Calibri" w:eastAsia="Calibri" w:hAnsi="Calibri" w:cs="Arial"/>
                 <w:b/>
                 <w:bCs/>
                 <w:color w:val="14532D"/>
@@ -2253,7 +2253,7 @@
       </w:pPr>
       <w:r>
         <w:rPr>
-          <w:rFonts w:ascii="Calibri" w:eastAsia="Calibri" w:hAnsi="Calibri" w:cs="Calibri"/>
+          <w:rFonts w:ascii="Calibri" w:eastAsia="Calibri" w:hAnsi="Calibri" w:cs="Arial"/>
           <w:b/>
           <w:bCs/>
           <w:color w:val="14532D"/>
@@ -2306,7 +2306,7 @@
       </m:oMath>
       <w:r>
         <w:rPr>
-          <w:rFonts w:ascii="Calibri" w:eastAsia="Calibri" w:hAnsi="Calibri" w:cs="Calibri"/>
+          <w:rFonts w:ascii="Calibri" w:eastAsia="Calibri" w:hAnsi="Calibri" w:cs="Arial"/>
           <w:b/>
           <w:bCs/>
           <w:color w:val="1A1A1A"/>
@@ -2318,7 +2318,7 @@
       </w:r>
       <w:r>
         <w:rPr>
-          <w:rFonts w:ascii="Calibri" w:eastAsia="Calibri" w:hAnsi="Calibri" w:cs="Calibri"/>
+          <w:rFonts w:ascii="Calibri" w:eastAsia="Calibri" w:hAnsi="Calibri" w:cs="Arial"/>
           <w:color w:val="9E9E9E"/>
           <w:sz w:val="34"/>
           <w:szCs w:val="34"/>
@@ -2328,7 +2328,7 @@
       </w:r>
       <w:r>
         <w:rPr>
-          <w:rFonts w:ascii="Calibri" w:eastAsia="Calibri" w:hAnsi="Calibri" w:cs="Calibri"/>
+          <w:rFonts w:ascii="Calibri" w:eastAsia="Calibri" w:hAnsi="Calibri" w:cs="Arial"/>
           <w:b/>
           <w:bCs/>
           <w:color w:val="B8860B"/>
@@ -2336,7 +2336,7 @@
           <w:szCs w:val="24"/>
           <w:rtl/>
         </w:rPr>
-        <w:t xml:space="preserve">  (1)</w:t>
+        <w:t xml:space="preserve">  (1)</w:t>
       </w:r>
     </w:p>
     <w:p>
@@ -2346,7 +2346,7 @@
       </w:pPr>
       <w:r>
         <w:rPr>
-          <w:rFonts w:ascii="Calibri" w:eastAsia="Calibri" w:hAnsi="Calibri" w:cs="Calibri"/>
+          <w:rFonts w:ascii="Calibri" w:eastAsia="Calibri" w:hAnsi="Calibri" w:cs="Arial"/>
           <w:b/>
           <w:bCs/>
           <w:color w:val="1A1A1A"/>
@@ -2358,7 +2358,7 @@
       </w:r>
       <w:r>
         <w:rPr>
-          <w:rFonts w:ascii="Calibri" w:eastAsia="Calibri" w:hAnsi="Calibri" w:cs="Calibri"/>
+          <w:rFonts w:ascii="Calibri" w:eastAsia="Calibri" w:hAnsi="Calibri" w:cs="Arial"/>
           <w:color w:val="9E9E9E"/>
           <w:sz w:val="34"/>
           <w:szCs w:val="34"/>
@@ -2368,7 +2368,7 @@
       </w:r>
       <w:r>
         <w:rPr>
-          <w:rFonts w:ascii="Calibri" w:eastAsia="Calibri" w:hAnsi="Calibri" w:cs="Calibri"/>
+          <w:rFonts w:ascii="Calibri" w:eastAsia="Calibri" w:hAnsi="Calibri" w:cs="Arial"/>
           <w:b/>
           <w:bCs/>
           <w:color w:val="B8860B"/>
@@ -2376,7 +2376,7 @@
           <w:szCs w:val="24"/>
           <w:rtl/>
         </w:rPr>
-        <w:t xml:space="preserve">  (1)</w:t>
+        <w:t xml:space="preserve">  (1)</w:t>
       </w:r>
     </w:p>
     <w:p>
@@ -2434,7 +2434,7 @@
             </w:pPr>
             <w:r>
               <w:rPr>
-                <w:rFonts w:ascii="Calibri" w:eastAsia="Calibri" w:hAnsi="Calibri" w:cs="Calibri"/>
+                <w:rFonts w:ascii="Calibri" w:eastAsia="Calibri" w:hAnsi="Calibri" w:cs="Arial"/>
                 <w:b/>
                 <w:bCs/>
                 <w:color w:val="FFFFFF"/>
@@ -2461,7 +2461,7 @@
             </w:pPr>
             <w:r>
               <w:rPr>
-                <w:rFonts w:ascii="Calibri" w:eastAsia="Calibri" w:hAnsi="Calibri" w:cs="Calibri"/>
+                <w:rFonts w:ascii="Calibri" w:eastAsia="Calibri" w:hAnsi="Calibri" w:cs="Arial"/>
                 <w:b/>
                 <w:bCs/>
                 <w:color w:val="14532D"/>
@@ -2488,7 +2488,7 @@
       </w:pPr>
       <w:r>
         <w:rPr>
-          <w:rFonts w:ascii="Calibri" w:eastAsia="Calibri" w:hAnsi="Calibri" w:cs="Calibri"/>
+          <w:rFonts w:ascii="Calibri" w:eastAsia="Calibri" w:hAnsi="Calibri" w:cs="Arial"/>
           <w:b/>
           <w:bCs/>
           <w:color w:val="1A1A1A"/>
@@ -2500,7 +2500,7 @@
       </w:r>
       <w:r>
         <w:rPr>
-          <w:rFonts w:ascii="Calibri" w:eastAsia="Calibri" w:hAnsi="Calibri" w:cs="Calibri"/>
+          <w:rFonts w:ascii="Calibri" w:eastAsia="Calibri" w:hAnsi="Calibri" w:cs="Arial"/>
           <w:color w:val="9E9E9E"/>
           <w:sz w:val="34"/>
           <w:szCs w:val="34"/>
@@ -2510,7 +2510,7 @@
       </w:r>
       <w:r>
         <w:rPr>
-          <w:rFonts w:ascii="Calibri" w:eastAsia="Calibri" w:hAnsi="Calibri" w:cs="Calibri"/>
+          <w:rFonts w:ascii="Calibri" w:eastAsia="Calibri" w:hAnsi="Calibri" w:cs="Arial"/>
           <w:b/>
           <w:bCs/>
           <w:color w:val="B8860B"/>
@@ -2518,7 +2518,7 @@
           <w:szCs w:val="24"/>
           <w:rtl/>
         </w:rPr>
-        <w:t xml:space="preserve">  (0.5)</w:t>
+        <w:t xml:space="preserve">  (0.5)</w:t>
       </w:r>
     </w:p>
     <w:p>
@@ -2528,7 +2528,7 @@
       </w:pPr>
       <w:r>
         <w:rPr>
-          <w:rFonts w:ascii="Calibri" w:eastAsia="Calibri" w:hAnsi="Calibri" w:cs="Calibri"/>
+          <w:rFonts w:ascii="Calibri" w:eastAsia="Calibri" w:hAnsi="Calibri" w:cs="Arial"/>
           <w:b/>
           <w:bCs/>
           <w:color w:val="1A1A1A"/>
@@ -2540,7 +2540,7 @@
       </w:r>
       <w:r>
         <w:rPr>
-          <w:rFonts w:ascii="Calibri" w:eastAsia="Calibri" w:hAnsi="Calibri" w:cs="Calibri"/>
+          <w:rFonts w:ascii="Calibri" w:eastAsia="Calibri" w:hAnsi="Calibri" w:cs="Arial"/>
           <w:color w:val="9E9E9E"/>
           <w:sz w:val="34"/>
           <w:szCs w:val="34"/>
@@ -2550,7 +2550,7 @@
       </w:r>
       <w:r>
         <w:rPr>
-          <w:rFonts w:ascii="Calibri" w:eastAsia="Calibri" w:hAnsi="Calibri" w:cs="Calibri"/>
+          <w:rFonts w:ascii="Calibri" w:eastAsia="Calibri" w:hAnsi="Calibri" w:cs="Arial"/>
           <w:b/>
           <w:bCs/>
           <w:color w:val="B8860B"/>
@@ -2558,7 +2558,7 @@
           <w:szCs w:val="24"/>
           <w:rtl/>
         </w:rPr>
-        <w:t xml:space="preserve">  (0.5)</w:t>
+        <w:t xml:space="preserve">  (0.5)</w:t>
       </w:r>
     </w:p>
     <w:p>
@@ -2615,7 +2615,7 @@
             </w:pPr>
             <w:r>
               <w:rPr>
-                <w:rFonts w:ascii="Calibri" w:eastAsia="Calibri" w:hAnsi="Calibri" w:cs="Calibri"/>
+                <w:rFonts w:ascii="Calibri" w:eastAsia="Calibri" w:hAnsi="Calibri" w:cs="Arial"/>
                 <w:b/>
                 <w:bCs/>
                 <w:color w:val="FFFFFF"/>
@@ -2642,7 +2642,7 @@
             </w:pPr>
             <w:r>
               <w:rPr>
-                <w:rFonts w:ascii="Calibri" w:eastAsia="Calibri" w:hAnsi="Calibri" w:cs="Calibri"/>
+                <w:rFonts w:ascii="Calibri" w:eastAsia="Calibri" w:hAnsi="Calibri" w:cs="Arial"/>
                 <w:b/>
                 <w:bCs/>
                 <w:color w:val="14532D"/>
@@ -2670,7 +2670,7 @@
       </w:pPr>
       <w:r>
         <w:rPr>
-          <w:rFonts w:ascii="Calibri" w:eastAsia="Calibri" w:hAnsi="Calibri" w:cs="Calibri"/>
+          <w:rFonts w:ascii="Calibri" w:eastAsia="Calibri" w:hAnsi="Calibri" w:cs="Arial"/>
           <w:color w:val="1A1A1A"/>
           <w:sz w:val="34"/>
           <w:szCs w:val="34"/>
@@ -2680,7 +2680,7 @@
       </w:r>
       <w:r>
         <w:rPr>
-          <w:rFonts w:ascii="Calibri" w:eastAsia="Calibri" w:hAnsi="Calibri" w:cs="Calibri"/>
+          <w:rFonts w:ascii="Calibri" w:eastAsia="Calibri" w:hAnsi="Calibri" w:cs="Arial"/>
           <w:b/>
           <w:bCs/>
           <w:color w:val="1A1A1A"/>
@@ -2692,7 +2692,7 @@
       </w:r>
       <w:r>
         <w:rPr>
-          <w:rFonts w:ascii="Calibri" w:eastAsia="Calibri" w:hAnsi="Calibri" w:cs="Calibri"/>
+          <w:rFonts w:ascii="Calibri" w:eastAsia="Calibri" w:hAnsi="Calibri" w:cs="Arial"/>
           <w:color w:val="1A1A1A"/>
           <w:sz w:val="34"/>
           <w:szCs w:val="34"/>
@@ -2711,7 +2711,7 @@
       <w:r>
         <w:drawing>
           <wp:inline distT="0" distB="0" distL="0" distR="0" wp14:anchorId="6B57460B" wp14:editId="4923BDD4">
-            <wp:extent cx="2926080" cy="2533558"/>
+            <wp:extent cx="2651760" cy="2296037"/>
             <wp:effectExtent l="0" t="0" r="0" b="0"/>
             <wp:docPr id="1438249767" name="Picture 1438249767" descr="دائرة مركزها O وقطرها AB، مع الشعاع OE والنقاط C و D و M"/>
             <wp:cNvGraphicFramePr>
@@ -2736,7 +2736,7 @@
                   <pic:spPr bwMode="auto">
                     <a:xfrm>
                       <a:off x="0" y="0"/>
-                      <a:ext cx="2926080" cy="2533558"/>
+                      <a:ext cx="2651760" cy="2296037"/>
                     </a:xfrm>
                     <a:prstGeom prst="rect">
                       <a:avLst/>
@@ -2810,7 +2810,7 @@
             </w:pPr>
             <w:r>
               <w:rPr>
-                <w:rFonts w:ascii="Calibri" w:eastAsia="Calibri" w:hAnsi="Calibri" w:cs="Calibri"/>
+                <w:rFonts w:ascii="Calibri" w:eastAsia="Calibri" w:hAnsi="Calibri" w:cs="Arial"/>
                 <w:b/>
                 <w:bCs/>
                 <w:color w:val="1F4E79"/>
@@ -2823,13 +2823,12 @@
           </w:p>
           <w:p>
             <w:pPr>
-              <w:keepNext/>
               <w:bidi/>
               <w:spacing w:before="0" w:after="40" w:line="276" w:lineRule="auto"/>
             </w:pPr>
             <w:r>
               <w:rPr>
-                <w:rFonts w:ascii="Calibri" w:eastAsia="Calibri" w:hAnsi="Calibri" w:cs="Calibri"/>
+                <w:rFonts w:ascii="Calibri" w:eastAsia="Calibri" w:hAnsi="Calibri" w:cs="Arial"/>
                 <w:color w:val="1A1A1A"/>
                 <w:sz w:val="30"/>
                 <w:szCs w:val="30"/>
@@ -2840,13 +2839,12 @@
           </w:p>
           <w:p>
             <w:pPr>
-              <w:keepNext/>
               <w:bidi/>
               <w:spacing w:before="0" w:after="40" w:line="276" w:lineRule="auto"/>
             </w:pPr>
             <w:r>
               <w:rPr>
-                <w:rFonts w:ascii="Calibri" w:eastAsia="Calibri" w:hAnsi="Calibri" w:cs="Calibri"/>
+                <w:rFonts w:ascii="Calibri" w:eastAsia="Calibri" w:hAnsi="Calibri" w:cs="Arial"/>
                 <w:color w:val="1A1A1A"/>
                 <w:sz w:val="30"/>
                 <w:szCs w:val="30"/>
@@ -2857,13 +2855,12 @@
           </w:p>
           <w:p>
             <w:pPr>
-              <w:keepNext/>
               <w:bidi/>
               <w:spacing w:before="0" w:after="40" w:line="276" w:lineRule="auto"/>
             </w:pPr>
             <w:r>
               <w:rPr>
-                <w:rFonts w:ascii="Calibri" w:eastAsia="Calibri" w:hAnsi="Calibri" w:cs="Calibri"/>
+                <w:rFonts w:ascii="Calibri" w:eastAsia="Calibri" w:hAnsi="Calibri" w:cs="Arial"/>
                 <w:color w:val="1A1A1A"/>
                 <w:sz w:val="30"/>
                 <w:szCs w:val="30"/>
@@ -2874,13 +2871,12 @@
           </w:p>
           <w:p>
             <w:pPr>
-              <w:keepNext/>
               <w:bidi/>
               <w:spacing w:before="0" w:after="40" w:line="276" w:lineRule="auto"/>
             </w:pPr>
             <w:r>
               <w:rPr>
-                <w:rFonts w:ascii="Calibri" w:eastAsia="Calibri" w:hAnsi="Calibri" w:cs="Calibri"/>
+                <w:rFonts w:ascii="Calibri" w:eastAsia="Calibri" w:hAnsi="Calibri" w:cs="Arial"/>
                 <w:color w:val="1A1A1A"/>
                 <w:sz w:val="30"/>
                 <w:szCs w:val="30"/>
@@ -2906,7 +2902,7 @@
       </w:pPr>
       <w:r>
         <w:rPr>
-          <w:rFonts w:ascii="Calibri" w:eastAsia="Calibri" w:hAnsi="Calibri" w:cs="Calibri"/>
+          <w:rFonts w:ascii="Calibri" w:eastAsia="Calibri" w:hAnsi="Calibri" w:cs="Arial"/>
           <w:b/>
           <w:bCs/>
           <w:color w:val="14532D"/>
@@ -2918,7 +2914,7 @@
       </w:r>
       <w:r>
         <w:rPr>
-          <w:rFonts w:ascii="Calibri" w:eastAsia="Calibri" w:hAnsi="Calibri" w:cs="Calibri"/>
+          <w:rFonts w:ascii="Calibri" w:eastAsia="Calibri" w:hAnsi="Calibri" w:cs="Arial"/>
           <w:color w:val="1A1A1A"/>
           <w:sz w:val="34"/>
           <w:szCs w:val="34"/>
@@ -2928,7 +2924,7 @@
       </w:r>
       <w:r>
         <w:rPr>
-          <w:rFonts w:ascii="Calibri" w:eastAsia="Calibri" w:hAnsi="Calibri" w:cs="Calibri"/>
+          <w:rFonts w:ascii="Calibri" w:eastAsia="Calibri" w:hAnsi="Calibri" w:cs="Arial"/>
           <w:b/>
           <w:bCs/>
           <w:color w:val="B8860B"/>
@@ -2936,7 +2932,7 @@
           <w:szCs w:val="24"/>
           <w:rtl/>
         </w:rPr>
-        <w:t xml:space="preserve">  (1)</w:t>
+        <w:t xml:space="preserve">  (1)</w:t>
       </w:r>
     </w:p>
     <w:p>
@@ -2950,7 +2946,7 @@
       </w:pPr>
       <w:r>
         <w:rPr>
-          <w:rFonts w:ascii="Calibri" w:eastAsia="Calibri" w:hAnsi="Calibri" w:cs="Calibri"/>
+          <w:rFonts w:ascii="Calibri" w:eastAsia="Calibri" w:hAnsi="Calibri" w:cs="Arial"/>
           <w:color w:val="1A1A1A"/>
           <w:sz w:val="28"/>
           <w:szCs w:val="28"/>
@@ -2967,7 +2963,7 @@
       </w:pPr>
       <w:r>
         <w:rPr>
-          <w:rFonts w:ascii="Calibri" w:eastAsia="Calibri" w:hAnsi="Calibri" w:cs="Calibri"/>
+          <w:rFonts w:ascii="Calibri" w:eastAsia="Calibri" w:hAnsi="Calibri" w:cs="Arial"/>
           <w:b/>
           <w:bCs/>
           <w:color w:val="14532D"/>
@@ -2979,7 +2975,7 @@
       </w:r>
       <w:r>
         <w:rPr>
-          <w:rFonts w:ascii="Calibri" w:eastAsia="Calibri" w:hAnsi="Calibri" w:cs="Calibri"/>
+          <w:rFonts w:ascii="Calibri" w:eastAsia="Calibri" w:hAnsi="Calibri" w:cs="Arial"/>
           <w:color w:val="1A1A1A"/>
           <w:sz w:val="34"/>
           <w:szCs w:val="34"/>
@@ -2989,7 +2985,7 @@
       </w:r>
       <w:r>
         <w:rPr>
-          <w:rFonts w:ascii="Calibri" w:eastAsia="Calibri" w:hAnsi="Calibri" w:cs="Calibri"/>
+          <w:rFonts w:ascii="Calibri" w:eastAsia="Calibri" w:hAnsi="Calibri" w:cs="Arial"/>
           <w:b/>
           <w:bCs/>
           <w:color w:val="B8860B"/>
@@ -2997,7 +2993,7 @@
           <w:szCs w:val="24"/>
           <w:rtl/>
         </w:rPr>
-        <w:t xml:space="preserve">  (1)</w:t>
+        <w:t xml:space="preserve">  (1)</w:t>
       </w:r>
     </w:p>
     <w:p>
@@ -3011,7 +3007,7 @@
       </w:pPr>
       <w:r>
         <w:rPr>
-          <w:rFonts w:ascii="Calibri" w:eastAsia="Calibri" w:hAnsi="Calibri" w:cs="Calibri"/>
+          <w:rFonts w:ascii="Calibri" w:eastAsia="Calibri" w:hAnsi="Calibri" w:cs="Arial"/>
           <w:color w:val="1A1A1A"/>
           <w:sz w:val="28"/>
           <w:szCs w:val="28"/>
@@ -3031,7 +3027,7 @@
       </w:pPr>
       <w:r>
         <w:rPr>
-          <w:rFonts w:ascii="Calibri" w:eastAsia="Calibri" w:hAnsi="Calibri" w:cs="Calibri"/>
+          <w:rFonts w:ascii="Calibri" w:eastAsia="Calibri" w:hAnsi="Calibri" w:cs="Arial"/>
           <w:color w:val="1A1A1A"/>
           <w:sz w:val="28"/>
           <w:szCs w:val="28"/>
@@ -3095,7 +3091,7 @@
             </w:pPr>
             <w:r>
               <w:rPr>
-                <w:rFonts w:ascii="Calibri" w:eastAsia="Calibri" w:hAnsi="Calibri" w:cs="Calibri"/>
+                <w:rFonts w:ascii="Calibri" w:eastAsia="Calibri" w:hAnsi="Calibri" w:cs="Arial"/>
                 <w:b/>
                 <w:bCs/>
                 <w:color w:val="FFFFFF"/>
@@ -3122,7 +3118,7 @@
             </w:pPr>
             <w:r>
               <w:rPr>
-                <w:rFonts w:ascii="Calibri" w:eastAsia="Calibri" w:hAnsi="Calibri" w:cs="Calibri"/>
+                <w:rFonts w:ascii="Calibri" w:eastAsia="Calibri" w:hAnsi="Calibri" w:cs="Arial"/>
                 <w:b/>
                 <w:bCs/>
                 <w:color w:val="14532D"/>
@@ -3150,7 +3146,7 @@
       </w:pPr>
       <w:r>
         <w:rPr>
-          <w:rFonts w:ascii="Calibri" w:eastAsia="Calibri" w:hAnsi="Calibri" w:cs="Calibri"/>
+          <w:rFonts w:ascii="Calibri" w:eastAsia="Calibri" w:hAnsi="Calibri" w:cs="Arial"/>
           <w:color w:val="1A1A1A"/>
           <w:sz w:val="34"/>
           <w:szCs w:val="34"/>
@@ -3166,7 +3162,7 @@
       </w:pPr>
       <w:r>
         <w:rPr>
-          <w:rFonts w:ascii="Calibri" w:eastAsia="Calibri" w:hAnsi="Calibri" w:cs="Calibri"/>
+          <w:rFonts w:ascii="Calibri" w:eastAsia="Calibri" w:hAnsi="Calibri" w:cs="Arial"/>
           <w:b/>
           <w:bCs/>
           <w:color w:val="1A1A1A"/>
@@ -3178,7 +3174,7 @@
       </w:r>
       <w:r>
         <w:rPr>
-          <w:rFonts w:ascii="Calibri" w:eastAsia="Calibri" w:hAnsi="Calibri" w:cs="Calibri"/>
+          <w:rFonts w:ascii="Calibri" w:eastAsia="Calibri" w:hAnsi="Calibri" w:cs="Arial"/>
           <w:color w:val="9E9E9E"/>
           <w:sz w:val="34"/>
           <w:szCs w:val="34"/>
@@ -3188,7 +3184,7 @@
       </w:r>
       <w:r>
         <w:rPr>
-          <w:rFonts w:ascii="Calibri" w:eastAsia="Calibri" w:hAnsi="Calibri" w:cs="Calibri"/>
+          <w:rFonts w:ascii="Calibri" w:eastAsia="Calibri" w:hAnsi="Calibri" w:cs="Arial"/>
           <w:b/>
           <w:bCs/>
           <w:color w:val="B8860B"/>
@@ -3196,7 +3192,7 @@
           <w:szCs w:val="24"/>
           <w:rtl/>
         </w:rPr>
-        <w:t xml:space="preserve">  (1)</w:t>
+        <w:t xml:space="preserve">  (1)</w:t>
       </w:r>
     </w:p>
     <w:p>
@@ -3206,7 +3202,7 @@
       </w:pPr>
       <w:r>
         <w:rPr>
-          <w:rFonts w:ascii="Calibri" w:eastAsia="Calibri" w:hAnsi="Calibri" w:cs="Calibri"/>
+          <w:rFonts w:ascii="Calibri" w:eastAsia="Calibri" w:hAnsi="Calibri" w:cs="Arial"/>
           <w:b/>
           <w:bCs/>
           <w:color w:val="1A1A1A"/>
@@ -3218,7 +3214,7 @@
       </w:r>
       <w:r>
         <w:rPr>
-          <w:rFonts w:ascii="Calibri" w:eastAsia="Calibri" w:hAnsi="Calibri" w:cs="Calibri"/>
+          <w:rFonts w:ascii="Calibri" w:eastAsia="Calibri" w:hAnsi="Calibri" w:cs="Arial"/>
           <w:color w:val="9E9E9E"/>
           <w:sz w:val="34"/>
           <w:szCs w:val="34"/>
@@ -3228,7 +3224,7 @@
       </w:r>
       <w:r>
         <w:rPr>
-          <w:rFonts w:ascii="Calibri" w:eastAsia="Calibri" w:hAnsi="Calibri" w:cs="Calibri"/>
+          <w:rFonts w:ascii="Calibri" w:eastAsia="Calibri" w:hAnsi="Calibri" w:cs="Arial"/>
           <w:b/>
           <w:bCs/>
           <w:color w:val="B8860B"/>
@@ -3236,7 +3232,7 @@
           <w:szCs w:val="24"/>
           <w:rtl/>
         </w:rPr>
-        <w:t xml:space="preserve">  (1)</w:t>
+        <w:t xml:space="preserve">  (1)</w:t>
       </w:r>
     </w:p>
     <w:p>
@@ -3293,7 +3289,7 @@
             </w:pPr>
             <w:r>
               <w:rPr>
-                <w:rFonts w:ascii="Calibri" w:eastAsia="Calibri" w:hAnsi="Calibri" w:cs="Calibri"/>
+                <w:rFonts w:ascii="Calibri" w:eastAsia="Calibri" w:hAnsi="Calibri" w:cs="Arial"/>
                 <w:b/>
                 <w:bCs/>
                 <w:color w:val="FFFFFF"/>
@@ -3320,7 +3316,7 @@
             </w:pPr>
             <w:r>
               <w:rPr>
-                <w:rFonts w:ascii="Calibri" w:eastAsia="Calibri" w:hAnsi="Calibri" w:cs="Calibri"/>
+                <w:rFonts w:ascii="Calibri" w:eastAsia="Calibri" w:hAnsi="Calibri" w:cs="Arial"/>
                 <w:b/>
                 <w:bCs/>
                 <w:color w:val="14532D"/>
@@ -3348,7 +3344,7 @@
       </w:pPr>
       <w:r>
         <w:rPr>
-          <w:rFonts w:ascii="Calibri" w:eastAsia="Calibri" w:hAnsi="Calibri" w:cs="Calibri"/>
+          <w:rFonts w:ascii="Calibri" w:eastAsia="Calibri" w:hAnsi="Calibri" w:cs="Arial"/>
           <w:b/>
           <w:bCs/>
           <w:color w:val="14532D"/>
@@ -3360,7 +3356,7 @@
       </w:r>
       <w:r>
         <w:rPr>
-          <w:rFonts w:ascii="Calibri" w:eastAsia="Calibri" w:hAnsi="Calibri" w:cs="Calibri"/>
+          <w:rFonts w:ascii="Calibri" w:eastAsia="Calibri" w:hAnsi="Calibri" w:cs="Arial"/>
           <w:b/>
           <w:bCs/>
           <w:color w:val="B8860B"/>
@@ -3368,7 +3364,7 @@
           <w:szCs w:val="24"/>
           <w:rtl/>
         </w:rPr>
-        <w:t xml:space="preserve">  (3)</w:t>
+        <w:t xml:space="preserve">  (3)</w:t>
       </w:r>
     </w:p>
     <w:p>
@@ -3477,7 +3473,7 @@
             </w:pPr>
             <w:r>
               <w:rPr>
-                <w:rFonts w:ascii="Calibri" w:eastAsia="Calibri" w:hAnsi="Calibri" w:cs="Calibri"/>
+                <w:rFonts w:ascii="Calibri" w:eastAsia="Calibri" w:hAnsi="Calibri" w:cs="Arial"/>
                 <w:b/>
                 <w:bCs/>
                 <w:color w:val="1F4E79"/>
@@ -3490,13 +3486,12 @@
           </w:p>
           <w:p>
             <w:pPr>
-              <w:keepNext/>
               <w:bidi/>
               <w:spacing w:before="0" w:after="40" w:line="276" w:lineRule="auto"/>
             </w:pPr>
             <w:r>
               <w:rPr>
-                <w:rFonts w:ascii="Calibri" w:eastAsia="Calibri" w:hAnsi="Calibri" w:cs="Calibri"/>
+                <w:rFonts w:ascii="Calibri" w:eastAsia="Calibri" w:hAnsi="Calibri" w:cs="Arial"/>
                 <w:color w:val="1A1A1A"/>
                 <w:sz w:val="30"/>
                 <w:szCs w:val="30"/>
@@ -3507,13 +3502,12 @@
           </w:p>
           <w:p>
             <w:pPr>
-              <w:keepNext/>
               <w:bidi/>
               <w:spacing w:before="0" w:after="40" w:line="276" w:lineRule="auto"/>
             </w:pPr>
             <w:r>
               <w:rPr>
-                <w:rFonts w:ascii="Calibri" w:eastAsia="Calibri" w:hAnsi="Calibri" w:cs="Calibri"/>
+                <w:rFonts w:ascii="Calibri" w:eastAsia="Calibri" w:hAnsi="Calibri" w:cs="Arial"/>
                 <w:color w:val="1A1A1A"/>
                 <w:sz w:val="30"/>
                 <w:szCs w:val="30"/>
@@ -3524,13 +3518,12 @@
           </w:p>
           <w:p>
             <w:pPr>
-              <w:keepNext/>
               <w:bidi/>
               <w:spacing w:before="0" w:after="40" w:line="276" w:lineRule="auto"/>
             </w:pPr>
             <w:r>
               <w:rPr>
-                <w:rFonts w:ascii="Calibri" w:eastAsia="Calibri" w:hAnsi="Calibri" w:cs="Calibri"/>
+                <w:rFonts w:ascii="Calibri" w:eastAsia="Calibri" w:hAnsi="Calibri" w:cs="Arial"/>
                 <w:color w:val="1A1A1A"/>
                 <w:sz w:val="30"/>
                 <w:szCs w:val="30"/>
@@ -3594,7 +3587,7 @@
             </w:pPr>
             <w:r>
               <w:rPr>
-                <w:rFonts w:ascii="Calibri" w:eastAsia="Calibri" w:hAnsi="Calibri" w:cs="Calibri"/>
+                <w:rFonts w:ascii="Calibri" w:eastAsia="Calibri" w:hAnsi="Calibri" w:cs="Arial"/>
                 <w:b/>
                 <w:bCs/>
                 <w:color w:val="FFFFFF"/>
@@ -3620,7 +3613,7 @@
             </w:pPr>
             <w:r>
               <w:rPr>
-                <w:rFonts w:ascii="Calibri" w:eastAsia="Calibri" w:hAnsi="Calibri" w:cs="Calibri"/>
+                <w:rFonts w:ascii="Calibri" w:eastAsia="Calibri" w:hAnsi="Calibri" w:cs="Arial"/>
                 <w:b/>
                 <w:bCs/>
                 <w:color w:val="FFFFFF"/>
@@ -3652,7 +3645,7 @@
             </w:pPr>
             <w:r>
               <w:rPr>
-                <w:rFonts w:ascii="Calibri" w:eastAsia="Calibri" w:hAnsi="Calibri" w:cs="Calibri"/>
+                <w:rFonts w:ascii="Calibri" w:eastAsia="Calibri" w:hAnsi="Calibri" w:cs="Arial"/>
                 <w:b/>
                 <w:bCs/>
                 <w:color w:val="14532D"/>
@@ -3676,7 +3669,7 @@
             </w:pPr>
             <w:r>
               <w:rPr>
-                <w:rFonts w:ascii="Calibri" w:eastAsia="Calibri" w:hAnsi="Calibri" w:cs="Calibri"/>
+                <w:rFonts w:ascii="Calibri" w:eastAsia="Calibri" w:hAnsi="Calibri" w:cs="Arial"/>
                 <w:color w:val="1A1A1A"/>
                 <w:sz w:val="28"/>
                 <w:szCs w:val="28"/>
@@ -3706,7 +3699,7 @@
             </w:pPr>
             <w:r>
               <w:rPr>
-                <w:rFonts w:ascii="Calibri" w:eastAsia="Calibri" w:hAnsi="Calibri" w:cs="Calibri"/>
+                <w:rFonts w:ascii="Calibri" w:eastAsia="Calibri" w:hAnsi="Calibri" w:cs="Arial"/>
                 <w:b/>
                 <w:bCs/>
                 <w:color w:val="14532D"/>
@@ -3730,7 +3723,7 @@
             </w:pPr>
             <w:r>
               <w:rPr>
-                <w:rFonts w:ascii="Calibri" w:eastAsia="Calibri" w:hAnsi="Calibri" w:cs="Calibri"/>
+                <w:rFonts w:ascii="Calibri" w:eastAsia="Calibri" w:hAnsi="Calibri" w:cs="Arial"/>
                 <w:color w:val="1A1A1A"/>
                 <w:sz w:val="28"/>
                 <w:szCs w:val="28"/>
@@ -3760,7 +3753,7 @@
             </w:pPr>
             <w:r>
               <w:rPr>
-                <w:rFonts w:ascii="Calibri" w:eastAsia="Calibri" w:hAnsi="Calibri" w:cs="Calibri"/>
+                <w:rFonts w:ascii="Calibri" w:eastAsia="Calibri" w:hAnsi="Calibri" w:cs="Arial"/>
                 <w:b/>
                 <w:bCs/>
                 <w:color w:val="14532D"/>
@@ -3784,7 +3777,7 @@
             </w:pPr>
             <w:r>
               <w:rPr>
-                <w:rFonts w:ascii="Calibri" w:eastAsia="Calibri" w:hAnsi="Calibri" w:cs="Calibri"/>
+                <w:rFonts w:ascii="Calibri" w:eastAsia="Calibri" w:hAnsi="Calibri" w:cs="Arial"/>
                 <w:color w:val="1A1A1A"/>
                 <w:sz w:val="28"/>
                 <w:szCs w:val="28"/>
@@ -3811,7 +3804,7 @@
       </w:pPr>
       <w:r>
         <w:rPr>
-          <w:rFonts w:ascii="Calibri" w:eastAsia="Calibri" w:hAnsi="Calibri" w:cs="Calibri"/>
+          <w:rFonts w:ascii="Calibri" w:eastAsia="Calibri" w:hAnsi="Calibri" w:cs="Arial"/>
           <w:b/>
           <w:bCs/>
           <w:color w:val="14532D"/>
@@ -3823,7 +3816,7 @@
       </w:r>
       <w:r>
         <w:rPr>
-          <w:rFonts w:ascii="Calibri" w:eastAsia="Calibri" w:hAnsi="Calibri" w:cs="Calibri"/>
+          <w:rFonts w:ascii="Calibri" w:eastAsia="Calibri" w:hAnsi="Calibri" w:cs="Arial"/>
           <w:b/>
           <w:bCs/>
           <w:color w:val="B8860B"/>
@@ -3831,7 +3824,7 @@
           <w:szCs w:val="24"/>
           <w:rtl/>
         </w:rPr>
-        <w:t xml:space="preserve">  (2)</w:t>
+        <w:t xml:space="preserve">  (2)</w:t>
       </w:r>
     </w:p>
     <w:p>
@@ -3940,7 +3933,7 @@
             </w:pPr>
             <w:r>
               <w:rPr>
-                <w:rFonts w:ascii="Calibri" w:eastAsia="Calibri" w:hAnsi="Calibri" w:cs="Calibri"/>
+                <w:rFonts w:ascii="Calibri" w:eastAsia="Calibri" w:hAnsi="Calibri" w:cs="Arial"/>
                 <w:b/>
                 <w:bCs/>
                 <w:color w:val="1F4E79"/>
@@ -3953,13 +3946,12 @@
           </w:p>
           <w:p>
             <w:pPr>
-              <w:keepNext/>
               <w:bidi/>
               <w:spacing w:before="0" w:after="40" w:line="276" w:lineRule="auto"/>
             </w:pPr>
             <w:r>
               <w:rPr>
-                <w:rFonts w:ascii="Calibri" w:eastAsia="Calibri" w:hAnsi="Calibri" w:cs="Calibri"/>
+                <w:rFonts w:ascii="Calibri" w:eastAsia="Calibri" w:hAnsi="Calibri" w:cs="Arial"/>
                 <w:color w:val="1A1A1A"/>
                 <w:sz w:val="30"/>
                 <w:szCs w:val="30"/>
@@ -3970,13 +3962,12 @@
           </w:p>
           <w:p>
             <w:pPr>
-              <w:keepNext/>
               <w:bidi/>
               <w:spacing w:before="0" w:after="40" w:line="276" w:lineRule="auto"/>
             </w:pPr>
             <w:r>
               <w:rPr>
-                <w:rFonts w:ascii="Calibri" w:eastAsia="Calibri" w:hAnsi="Calibri" w:cs="Calibri"/>
+                <w:rFonts w:ascii="Calibri" w:eastAsia="Calibri" w:hAnsi="Calibri" w:cs="Arial"/>
                 <w:color w:val="1A1A1A"/>
                 <w:sz w:val="30"/>
                 <w:szCs w:val="30"/>
@@ -4002,7 +3993,7 @@
       </w:pPr>
       <w:r>
         <w:rPr>
-          <w:rFonts w:ascii="Calibri" w:eastAsia="Calibri" w:hAnsi="Calibri" w:cs="Calibri"/>
+          <w:rFonts w:ascii="Calibri" w:eastAsia="Calibri" w:hAnsi="Calibri" w:cs="Arial"/>
           <w:b/>
           <w:bCs/>
           <w:color w:val="14532D"/>
@@ -4014,7 +4005,7 @@
       </w:r>
       <w:r>
         <w:rPr>
-          <w:rFonts w:ascii="Calibri" w:eastAsia="Calibri" w:hAnsi="Calibri" w:cs="Calibri"/>
+          <w:rFonts w:ascii="Calibri" w:eastAsia="Calibri" w:hAnsi="Calibri" w:cs="Arial"/>
           <w:color w:val="1A1A1A"/>
           <w:sz w:val="34"/>
           <w:szCs w:val="34"/>
@@ -4024,7 +4015,7 @@
       </w:r>
       <w:r>
         <w:rPr>
-          <w:rFonts w:ascii="Calibri" w:eastAsia="Calibri" w:hAnsi="Calibri" w:cs="Calibri"/>
+          <w:rFonts w:ascii="Calibri" w:eastAsia="Calibri" w:hAnsi="Calibri" w:cs="Arial"/>
           <w:b/>
           <w:bCs/>
           <w:color w:val="B8860B"/>
@@ -4032,7 +4023,7 @@
           <w:szCs w:val="24"/>
           <w:rtl/>
         </w:rPr>
-        <w:t xml:space="preserve">  (1)</w:t>
+        <w:t xml:space="preserve">  (1)</w:t>
       </w:r>
     </w:p>
     <w:p>
@@ -4046,7 +4037,7 @@
       </w:pPr>
       <w:r>
         <w:rPr>
-          <w:rFonts w:ascii="Calibri" w:eastAsia="Calibri" w:hAnsi="Calibri" w:cs="Calibri"/>
+          <w:rFonts w:ascii="Calibri" w:eastAsia="Calibri" w:hAnsi="Calibri" w:cs="Arial"/>
           <w:color w:val="1A1A1A"/>
           <w:sz w:val="28"/>
           <w:szCs w:val="28"/>
@@ -4066,7 +4057,7 @@
       </w:pPr>
       <w:r>
         <w:rPr>
-          <w:rFonts w:ascii="Calibri" w:eastAsia="Calibri" w:hAnsi="Calibri" w:cs="Calibri"/>
+          <w:rFonts w:ascii="Calibri" w:eastAsia="Calibri" w:hAnsi="Calibri" w:cs="Arial"/>
           <w:color w:val="1A1A1A"/>
           <w:sz w:val="28"/>
           <w:szCs w:val="28"/>
@@ -4083,7 +4074,7 @@
       </w:pPr>
       <w:r>
         <w:rPr>
-          <w:rFonts w:ascii="Calibri" w:eastAsia="Calibri" w:hAnsi="Calibri" w:cs="Calibri"/>
+          <w:rFonts w:ascii="Calibri" w:eastAsia="Calibri" w:hAnsi="Calibri" w:cs="Arial"/>
           <w:b/>
           <w:bCs/>
           <w:color w:val="14532D"/>
@@ -4095,7 +4086,7 @@
       </w:r>
       <w:r>
         <w:rPr>
-          <w:rFonts w:ascii="Calibri" w:eastAsia="Calibri" w:hAnsi="Calibri" w:cs="Calibri"/>
+          <w:rFonts w:ascii="Calibri" w:eastAsia="Calibri" w:hAnsi="Calibri" w:cs="Arial"/>
           <w:color w:val="1A1A1A"/>
           <w:sz w:val="34"/>
           <w:szCs w:val="34"/>
@@ -4105,7 +4096,7 @@
       </w:r>
       <w:r>
         <w:rPr>
-          <w:rFonts w:ascii="Calibri" w:eastAsia="Calibri" w:hAnsi="Calibri" w:cs="Calibri"/>
+          <w:rFonts w:ascii="Calibri" w:eastAsia="Calibri" w:hAnsi="Calibri" w:cs="Arial"/>
           <w:b/>
           <w:bCs/>
           <w:color w:val="B8860B"/>
@@ -4113,7 +4104,7 @@
           <w:szCs w:val="24"/>
           <w:rtl/>
         </w:rPr>
-        <w:t xml:space="preserve">  (1)</w:t>
+        <w:t xml:space="preserve">  (1)</w:t>
       </w:r>
     </w:p>
     <w:p>
@@ -4127,7 +4118,7 @@
       </w:pPr>
       <w:r>
         <w:rPr>
-          <w:rFonts w:ascii="Calibri" w:eastAsia="Calibri" w:hAnsi="Calibri" w:cs="Calibri"/>
+          <w:rFonts w:ascii="Calibri" w:eastAsia="Calibri" w:hAnsi="Calibri" w:cs="Arial"/>
           <w:color w:val="1A1A1A"/>
           <w:sz w:val="28"/>
           <w:szCs w:val="28"/>
@@ -4147,7 +4138,7 @@
       </w:pPr>
       <w:r>
         <w:rPr>
-          <w:rFonts w:ascii="Calibri" w:eastAsia="Calibri" w:hAnsi="Calibri" w:cs="Calibri"/>
+          <w:rFonts w:ascii="Calibri" w:eastAsia="Calibri" w:hAnsi="Calibri" w:cs="Arial"/>
           <w:color w:val="1A1A1A"/>
           <w:sz w:val="28"/>
           <w:szCs w:val="28"/>
@@ -4323,7 +4314,7 @@
     </w:pPr>
     <w:r>
       <w:rPr>
-        <w:rFonts w:ascii="Calibri" w:eastAsia="Calibri" w:hAnsi="Calibri" w:cs="Calibri"/>
+        <w:rFonts w:ascii="Calibri" w:eastAsia="Calibri" w:hAnsi="Calibri" w:cs="Arial"/>
         <w:color w:val="6B6B6B"/>
         <w:sz w:val="20"/>
         <w:szCs w:val="20"/>
@@ -4368,7 +4359,7 @@
     </w:r>
     <w:r>
       <w:rPr>
-        <w:rFonts w:ascii="Calibri" w:eastAsia="Calibri" w:hAnsi="Calibri" w:cs="Calibri"/>
+        <w:rFonts w:ascii="Calibri" w:eastAsia="Calibri" w:hAnsi="Calibri" w:cs="Arial"/>
         <w:color w:val="6B6B6B"/>
         <w:sz w:val="20"/>
         <w:szCs w:val="20"/>

</xml_diff>

<commit_message>
Continuous exam layout: no forced page breaks, headers kept with questions
Co-Authored-By: Claude Opus 5.5 <noreply@anthropic.com>
Claude-Session: https://claude.ai/code/session_01PHgZqhLAeFoDhbHXzt9YLK
</commit_message>
<xml_diff>
--- a/exams/امتحان-رياضيات-السابع-مع-المثلثات.docx
+++ b/exams/امتحان-رياضيات-السابع-مع-المثلثات.docx
@@ -312,104 +312,41 @@
     </w:p>
     <w:p>
       <w:pPr>
-        <w:bidi/>
-        <w:spacing w:before="0" w:after="0" w:line="200" w:lineRule="exact"/>
-      </w:pPr>
-    </w:p>
-    <w:tbl>
-      <w:tblPr>
-        <w:bidiVisual/>
-        <w:tblW w:w="10440" w:type="dxa"/>
-        <w:jc w:val="center"/>
-        <w:tblBorders>
-          <w:top w:val="nil" w:sz="4" w:space="0" w:color="BFBFBF"/>
-          <w:left w:val="nil" w:sz="4" w:space="0" w:color="BFBFBF"/>
-          <w:bottom w:val="nil" w:sz="4" w:space="0" w:color="BFBFBF"/>
-          <w:right w:val="nil" w:sz="4" w:space="0" w:color="BFBFBF"/>
-          <w:insideH w:val="nil" w:sz="4" w:space="0" w:color="BFBFBF"/>
-          <w:insideV w:val="single" w:sz="18" w:space="0" w:color="FFFFFF"/>
-        </w:tblBorders>
-        <w:tblLayout w:type="fixed"/>
-        <w:tblCellMar>
-          <w:top w:w="80" w:type="dxa"/>
-          <w:left w:w="110" w:type="dxa"/>
-          <w:bottom w:w="80" w:type="dxa"/>
-          <w:right w:w="110" w:type="dxa"/>
-        </w:tblCellMar>
-        <w:tblLook w:val="04A0" w:firstRow="1" w:lastRow="0" w:firstColumn="1" w:lastColumn="0" w:noHBand="0" w:noVBand="1"/>
-      </w:tblPr>
-      <w:tblGrid>
-        <w:gridCol w:w="8340"/>
-        <w:gridCol w:w="2100"/>
-      </w:tblGrid>
-      <w:tr>
-        <w:trPr>
-          <w:cantSplit/>
-          <w:trHeight w:val="580"/>
-        </w:trPr>
-        <w:tc>
-          <w:tcPr>
-            <w:tcW w:w="8340" w:type="dxa"/>
-            <w:shd w:val="clear" w:color="auto" w:fill="14532D"/>
-            <w:tcMar>
-              <w:right w:w="200" w:type="dxa"/>
-            </w:tcMar>
-            <w:vAlign w:val="center"/>
-          </w:tcPr>
-          <w:p>
-            <w:pPr>
-              <w:keepNext/>
-              <w:bidi/>
-              <w:spacing w:before="0" w:after="0" w:line="276" w:lineRule="auto"/>
-            </w:pPr>
-            <w:r>
-              <w:rPr>
-                <w:rFonts w:ascii="Calibri" w:eastAsia="Calibri" w:hAnsi="Calibri" w:cs="Arial"/>
-                <w:b/>
-                <w:bCs/>
-                <w:color w:val="FFFFFF"/>
-                <w:sz w:val="32"/>
-                <w:szCs w:val="32"/>
-                <w:rtl/>
-              </w:rPr>
-              <w:t xml:space="preserve">السؤال الأول: صح أم خطأ</w:t>
-            </w:r>
-          </w:p>
-        </w:tc>
-        <w:tc>
-          <w:tcPr>
-            <w:tcW w:w="2100" w:type="dxa"/>
-            <w:shd w:val="clear" w:color="auto" w:fill="F6E9C6"/>
-            <w:vAlign w:val="center"/>
-          </w:tcPr>
-          <w:p>
-            <w:pPr>
-              <w:keepNext/>
-              <w:bidi/>
-              <w:spacing w:before="0" w:after="0" w:line="276" w:lineRule="auto"/>
-              <w:jc w:val="center"/>
-            </w:pPr>
-            <w:r>
-              <w:rPr>
-                <w:rFonts w:ascii="Calibri" w:eastAsia="Calibri" w:hAnsi="Calibri" w:cs="Arial"/>
-                <w:b/>
-                <w:bCs/>
-                <w:color w:val="14532D"/>
-                <w:sz w:val="28"/>
-                <w:szCs w:val="28"/>
-                <w:rtl/>
-              </w:rPr>
-              <w:t xml:space="preserve">3.5 علامات</w:t>
-            </w:r>
-          </w:p>
-        </w:tc>
-      </w:tr>
-    </w:tbl>
-    <w:p>
-      <w:pPr>
-        <w:bidi/>
-        <w:spacing w:before="0" w:after="0" w:line="140" w:lineRule="exact"/>
-      </w:pPr>
+        <w:keepNext/>
+        <w:pBdr>
+          <w:top w:val="single" w:sz="18" w:space="3" w:color="14532D"/>
+          <w:bottom w:val="single" w:sz="18" w:space="3" w:color="14532D"/>
+          <w:right w:val="single" w:sz="48" w:space="6" w:color="B8860B"/>
+        </w:pBdr>
+        <w:shd w:val="clear" w:color="auto" w:fill="14532D"/>
+        <w:bidi/>
+        <w:spacing w:before="240" w:after="120" w:line="276" w:lineRule="auto"/>
+        <w:ind w:left="120" w:right="120"/>
+      </w:pPr>
+      <w:r>
+        <w:rPr>
+          <w:rFonts w:ascii="Calibri" w:eastAsia="Calibri" w:hAnsi="Calibri" w:cs="Arial"/>
+          <w:b/>
+          <w:bCs/>
+          <w:color w:val="FFFFFF"/>
+          <w:sz w:val="32"/>
+          <w:szCs w:val="32"/>
+          <w:rtl/>
+        </w:rPr>
+        <w:t xml:space="preserve">السؤال الأول: صح أم خطأ</w:t>
+      </w:r>
+      <w:r>
+        <w:rPr>
+          <w:rFonts w:ascii="Calibri" w:eastAsia="Calibri" w:hAnsi="Calibri" w:cs="Arial"/>
+          <w:b/>
+          <w:bCs/>
+          <w:color w:val="F6D98B"/>
+          <w:sz w:val="28"/>
+          <w:szCs w:val="28"/>
+          <w:rtl/>
+        </w:rPr>
+        <w:t xml:space="preserve">   —  3.5 علامات</w:t>
+      </w:r>
     </w:p>
     <w:p>
       <w:pPr>
@@ -603,7 +540,7 @@
       <w:tr>
         <w:trPr>
           <w:cantSplit/>
-          <w:trHeight w:val="520"/>
+          <w:trHeight w:val="440"/>
         </w:trPr>
         <w:tc>
           <w:tcPr>
@@ -703,7 +640,7 @@
       <w:tr>
         <w:trPr>
           <w:cantSplit/>
-          <w:trHeight w:val="520"/>
+          <w:trHeight w:val="440"/>
         </w:trPr>
         <w:tc>
           <w:tcPr>
@@ -803,7 +740,7 @@
       <w:tr>
         <w:trPr>
           <w:cantSplit/>
-          <w:trHeight w:val="520"/>
+          <w:trHeight w:val="440"/>
         </w:trPr>
         <w:tc>
           <w:tcPr>
@@ -903,7 +840,7 @@
       <w:tr>
         <w:trPr>
           <w:cantSplit/>
-          <w:trHeight w:val="520"/>
+          <w:trHeight w:val="440"/>
         </w:trPr>
         <w:tc>
           <w:tcPr>
@@ -1003,7 +940,7 @@
       <w:tr>
         <w:trPr>
           <w:cantSplit/>
-          <w:trHeight w:val="520"/>
+          <w:trHeight w:val="440"/>
         </w:trPr>
         <w:tc>
           <w:tcPr>
@@ -1103,7 +1040,7 @@
       <w:tr>
         <w:trPr>
           <w:cantSplit/>
-          <w:trHeight w:val="520"/>
+          <w:trHeight w:val="440"/>
         </w:trPr>
         <w:tc>
           <w:tcPr>
@@ -1203,7 +1140,7 @@
       <w:tr>
         <w:trPr>
           <w:cantSplit/>
-          <w:trHeight w:val="520"/>
+          <w:trHeight w:val="440"/>
         </w:trPr>
         <w:tc>
           <w:tcPr>
@@ -1303,105 +1240,41 @@
     </w:tbl>
     <w:p>
       <w:pPr>
-        <w:pageBreakBefore/>
-        <w:bidi/>
-        <w:spacing w:before="0" w:after="0" w:line="200" w:lineRule="exact"/>
-      </w:pPr>
-    </w:p>
-    <w:tbl>
-      <w:tblPr>
-        <w:bidiVisual/>
-        <w:tblW w:w="10440" w:type="dxa"/>
-        <w:jc w:val="center"/>
-        <w:tblBorders>
-          <w:top w:val="nil" w:sz="4" w:space="0" w:color="BFBFBF"/>
-          <w:left w:val="nil" w:sz="4" w:space="0" w:color="BFBFBF"/>
-          <w:bottom w:val="nil" w:sz="4" w:space="0" w:color="BFBFBF"/>
-          <w:right w:val="nil" w:sz="4" w:space="0" w:color="BFBFBF"/>
-          <w:insideH w:val="nil" w:sz="4" w:space="0" w:color="BFBFBF"/>
-          <w:insideV w:val="single" w:sz="18" w:space="0" w:color="FFFFFF"/>
-        </w:tblBorders>
-        <w:tblLayout w:type="fixed"/>
-        <w:tblCellMar>
-          <w:top w:w="80" w:type="dxa"/>
-          <w:left w:w="110" w:type="dxa"/>
-          <w:bottom w:w="80" w:type="dxa"/>
-          <w:right w:w="110" w:type="dxa"/>
-        </w:tblCellMar>
-        <w:tblLook w:val="04A0" w:firstRow="1" w:lastRow="0" w:firstColumn="1" w:lastColumn="0" w:noHBand="0" w:noVBand="1"/>
-      </w:tblPr>
-      <w:tblGrid>
-        <w:gridCol w:w="8340"/>
-        <w:gridCol w:w="2100"/>
-      </w:tblGrid>
-      <w:tr>
-        <w:trPr>
-          <w:cantSplit/>
-          <w:trHeight w:val="580"/>
-        </w:trPr>
-        <w:tc>
-          <w:tcPr>
-            <w:tcW w:w="8340" w:type="dxa"/>
-            <w:shd w:val="clear" w:color="auto" w:fill="14532D"/>
-            <w:tcMar>
-              <w:right w:w="200" w:type="dxa"/>
-            </w:tcMar>
-            <w:vAlign w:val="center"/>
-          </w:tcPr>
-          <w:p>
-            <w:pPr>
-              <w:keepNext/>
-              <w:bidi/>
-              <w:spacing w:before="0" w:after="0" w:line="276" w:lineRule="auto"/>
-            </w:pPr>
-            <w:r>
-              <w:rPr>
-                <w:rFonts w:ascii="Calibri" w:eastAsia="Calibri" w:hAnsi="Calibri" w:cs="Arial"/>
-                <w:b/>
-                <w:bCs/>
-                <w:color w:val="FFFFFF"/>
-                <w:sz w:val="32"/>
-                <w:szCs w:val="32"/>
-                <w:rtl/>
-              </w:rPr>
-              <w:t xml:space="preserve">السؤال الثاني: قائمة الأسعار والنسبة المئوية</w:t>
-            </w:r>
-          </w:p>
-        </w:tc>
-        <w:tc>
-          <w:tcPr>
-            <w:tcW w:w="2100" w:type="dxa"/>
-            <w:shd w:val="clear" w:color="auto" w:fill="F6E9C6"/>
-            <w:vAlign w:val="center"/>
-          </w:tcPr>
-          <w:p>
-            <w:pPr>
-              <w:keepNext/>
-              <w:bidi/>
-              <w:spacing w:before="0" w:after="0" w:line="276" w:lineRule="auto"/>
-              <w:jc w:val="center"/>
-            </w:pPr>
-            <w:r>
-              <w:rPr>
-                <w:rFonts w:ascii="Calibri" w:eastAsia="Calibri" w:hAnsi="Calibri" w:cs="Arial"/>
-                <w:b/>
-                <w:bCs/>
-                <w:color w:val="14532D"/>
-                <w:sz w:val="28"/>
-                <w:szCs w:val="28"/>
-                <w:rtl/>
-              </w:rPr>
-              <w:t xml:space="preserve">3 علامات</w:t>
-            </w:r>
-          </w:p>
-        </w:tc>
-      </w:tr>
-    </w:tbl>
-    <w:p>
-      <w:pPr>
-        <w:bidi/>
-        <w:spacing w:before="0" w:after="0" w:line="140" w:lineRule="exact"/>
-      </w:pPr>
+        <w:keepNext/>
+        <w:pBdr>
+          <w:top w:val="single" w:sz="18" w:space="3" w:color="14532D"/>
+          <w:bottom w:val="single" w:sz="18" w:space="3" w:color="14532D"/>
+          <w:right w:val="single" w:sz="48" w:space="6" w:color="B8860B"/>
+        </w:pBdr>
+        <w:shd w:val="clear" w:color="auto" w:fill="14532D"/>
+        <w:bidi/>
+        <w:spacing w:before="240" w:after="120" w:line="276" w:lineRule="auto"/>
+        <w:ind w:left="120" w:right="120"/>
+      </w:pPr>
+      <w:r>
+        <w:rPr>
+          <w:rFonts w:ascii="Calibri" w:eastAsia="Calibri" w:hAnsi="Calibri" w:cs="Arial"/>
+          <w:b/>
+          <w:bCs/>
+          <w:color w:val="FFFFFF"/>
+          <w:sz w:val="32"/>
+          <w:szCs w:val="32"/>
+          <w:rtl/>
+        </w:rPr>
+        <w:t xml:space="preserve">السؤال الثاني: قائمة الأسعار والنسبة المئوية</w:t>
+      </w:r>
+      <w:r>
+        <w:rPr>
+          <w:rFonts w:ascii="Calibri" w:eastAsia="Calibri" w:hAnsi="Calibri" w:cs="Arial"/>
+          <w:b/>
+          <w:bCs/>
+          <w:color w:val="F6D98B"/>
+          <w:sz w:val="28"/>
+          <w:szCs w:val="28"/>
+          <w:rtl/>
+        </w:rPr>
+        <w:t xml:space="preserve">   —  3 علامات</w:t>
+      </w:r>
     </w:p>
     <w:p>
       <w:pPr>
@@ -1467,6 +1340,7 @@
           </w:tcPr>
           <w:p>
             <w:pPr>
+              <w:keepNext/>
               <w:bidi/>
               <w:spacing w:line="276" w:lineRule="auto"/>
               <w:jc w:val="center"/>
@@ -1514,6 +1388,7 @@
           </w:tcPr>
           <w:p>
             <w:pPr>
+              <w:keepNext/>
               <w:bidi/>
               <w:spacing w:after="15" w:line="276" w:lineRule="auto"/>
               <w:jc w:val="center"/>
@@ -1534,6 +1409,7 @@
           </w:p>
           <w:p>
             <w:pPr>
+              <w:keepNext/>
               <w:bidi/>
               <w:spacing w:line="276" w:lineRule="auto"/>
               <w:jc w:val="center"/>
@@ -1573,6 +1449,7 @@
           </w:tcPr>
           <w:p>
             <w:pPr>
+              <w:keepNext/>
               <w:bidi/>
               <w:spacing w:after="15" w:line="276" w:lineRule="auto"/>
               <w:jc w:val="center"/>
@@ -1593,6 +1470,7 @@
           </w:p>
           <w:p>
             <w:pPr>
+              <w:keepNext/>
               <w:bidi/>
               <w:spacing w:line="276" w:lineRule="auto"/>
               <w:jc w:val="center"/>
@@ -1640,6 +1518,7 @@
           </w:tcPr>
           <w:p>
             <w:pPr>
+              <w:keepNext/>
               <w:bidi/>
               <w:spacing w:after="15" w:line="276" w:lineRule="auto"/>
               <w:jc w:val="center"/>
@@ -1660,6 +1539,7 @@
           </w:p>
           <w:p>
             <w:pPr>
+              <w:keepNext/>
               <w:bidi/>
               <w:spacing w:line="276" w:lineRule="auto"/>
               <w:jc w:val="center"/>
@@ -1699,6 +1579,7 @@
           </w:tcPr>
           <w:p>
             <w:pPr>
+              <w:keepNext/>
               <w:bidi/>
               <w:spacing w:after="15" w:line="276" w:lineRule="auto"/>
               <w:jc w:val="center"/>
@@ -1719,6 +1600,7 @@
           </w:p>
           <w:p>
             <w:pPr>
+              <w:keepNext/>
               <w:bidi/>
               <w:spacing w:line="276" w:lineRule="auto"/>
               <w:jc w:val="center"/>
@@ -1926,104 +1808,41 @@
     </w:p>
     <w:p>
       <w:pPr>
-        <w:bidi/>
-        <w:spacing w:before="0" w:after="0" w:line="200" w:lineRule="exact"/>
-      </w:pPr>
-    </w:p>
-    <w:tbl>
-      <w:tblPr>
-        <w:bidiVisual/>
-        <w:tblW w:w="10440" w:type="dxa"/>
-        <w:jc w:val="center"/>
-        <w:tblBorders>
-          <w:top w:val="nil" w:sz="4" w:space="0" w:color="BFBFBF"/>
-          <w:left w:val="nil" w:sz="4" w:space="0" w:color="BFBFBF"/>
-          <w:bottom w:val="nil" w:sz="4" w:space="0" w:color="BFBFBF"/>
-          <w:right w:val="nil" w:sz="4" w:space="0" w:color="BFBFBF"/>
-          <w:insideH w:val="nil" w:sz="4" w:space="0" w:color="BFBFBF"/>
-          <w:insideV w:val="single" w:sz="18" w:space="0" w:color="FFFFFF"/>
-        </w:tblBorders>
-        <w:tblLayout w:type="fixed"/>
-        <w:tblCellMar>
-          <w:top w:w="80" w:type="dxa"/>
-          <w:left w:w="110" w:type="dxa"/>
-          <w:bottom w:w="80" w:type="dxa"/>
-          <w:right w:w="110" w:type="dxa"/>
-        </w:tblCellMar>
-        <w:tblLook w:val="04A0" w:firstRow="1" w:lastRow="0" w:firstColumn="1" w:lastColumn="0" w:noHBand="0" w:noVBand="1"/>
-      </w:tblPr>
-      <w:tblGrid>
-        <w:gridCol w:w="8340"/>
-        <w:gridCol w:w="2100"/>
-      </w:tblGrid>
-      <w:tr>
-        <w:trPr>
-          <w:cantSplit/>
-          <w:trHeight w:val="580"/>
-        </w:trPr>
-        <w:tc>
-          <w:tcPr>
-            <w:tcW w:w="8340" w:type="dxa"/>
-            <w:shd w:val="clear" w:color="auto" w:fill="14532D"/>
-            <w:tcMar>
-              <w:right w:w="200" w:type="dxa"/>
-            </w:tcMar>
-            <w:vAlign w:val="center"/>
-          </w:tcPr>
-          <w:p>
-            <w:pPr>
-              <w:keepNext/>
-              <w:bidi/>
-              <w:spacing w:before="0" w:after="0" w:line="276" w:lineRule="auto"/>
-            </w:pPr>
-            <w:r>
-              <w:rPr>
-                <w:rFonts w:ascii="Calibri" w:eastAsia="Calibri" w:hAnsi="Calibri" w:cs="Arial"/>
-                <w:b/>
-                <w:bCs/>
-                <w:color w:val="FFFFFF"/>
-                <w:sz w:val="32"/>
-                <w:szCs w:val="32"/>
-                <w:rtl/>
-              </w:rPr>
-              <w:t xml:space="preserve">السؤال الثالث: أكتب على شكل كسر عشري</w:t>
-            </w:r>
-          </w:p>
-        </w:tc>
-        <w:tc>
-          <w:tcPr>
-            <w:tcW w:w="2100" w:type="dxa"/>
-            <w:shd w:val="clear" w:color="auto" w:fill="F6E9C6"/>
-            <w:vAlign w:val="center"/>
-          </w:tcPr>
-          <w:p>
-            <w:pPr>
-              <w:keepNext/>
-              <w:bidi/>
-              <w:spacing w:before="0" w:after="0" w:line="276" w:lineRule="auto"/>
-              <w:jc w:val="center"/>
-            </w:pPr>
-            <w:r>
-              <w:rPr>
-                <w:rFonts w:ascii="Calibri" w:eastAsia="Calibri" w:hAnsi="Calibri" w:cs="Arial"/>
-                <w:b/>
-                <w:bCs/>
-                <w:color w:val="14532D"/>
-                <w:sz w:val="28"/>
-                <w:szCs w:val="28"/>
-                <w:rtl/>
-              </w:rPr>
-              <w:t xml:space="preserve">1.5 علامة</w:t>
-            </w:r>
-          </w:p>
-        </w:tc>
-      </w:tr>
-    </w:tbl>
-    <w:p>
-      <w:pPr>
-        <w:bidi/>
-        <w:spacing w:before="0" w:after="0" w:line="140" w:lineRule="exact"/>
-      </w:pPr>
+        <w:keepNext/>
+        <w:pBdr>
+          <w:top w:val="single" w:sz="18" w:space="3" w:color="14532D"/>
+          <w:bottom w:val="single" w:sz="18" w:space="3" w:color="14532D"/>
+          <w:right w:val="single" w:sz="48" w:space="6" w:color="B8860B"/>
+        </w:pBdr>
+        <w:shd w:val="clear" w:color="auto" w:fill="14532D"/>
+        <w:bidi/>
+        <w:spacing w:before="240" w:after="120" w:line="276" w:lineRule="auto"/>
+        <w:ind w:left="120" w:right="120"/>
+      </w:pPr>
+      <w:r>
+        <w:rPr>
+          <w:rFonts w:ascii="Calibri" w:eastAsia="Calibri" w:hAnsi="Calibri" w:cs="Arial"/>
+          <w:b/>
+          <w:bCs/>
+          <w:color w:val="FFFFFF"/>
+          <w:sz w:val="32"/>
+          <w:szCs w:val="32"/>
+          <w:rtl/>
+        </w:rPr>
+        <w:t xml:space="preserve">السؤال الثالث: أكتب على شكل كسر عشري</w:t>
+      </w:r>
+      <w:r>
+        <w:rPr>
+          <w:rFonts w:ascii="Calibri" w:eastAsia="Calibri" w:hAnsi="Calibri" w:cs="Arial"/>
+          <w:b/>
+          <w:bCs/>
+          <w:color w:val="F6D98B"/>
+          <w:sz w:val="28"/>
+          <w:szCs w:val="28"/>
+          <w:rtl/>
+        </w:rPr>
+        <w:t xml:space="preserve">   —  1.5 علامة</w:t>
+      </w:r>
     </w:p>
     <w:p>
       <w:pPr>
@@ -2147,104 +1966,41 @@
     </w:p>
     <w:p>
       <w:pPr>
-        <w:bidi/>
-        <w:spacing w:before="0" w:after="0" w:line="200" w:lineRule="exact"/>
-      </w:pPr>
-    </w:p>
-    <w:tbl>
-      <w:tblPr>
-        <w:bidiVisual/>
-        <w:tblW w:w="10440" w:type="dxa"/>
-        <w:jc w:val="center"/>
-        <w:tblBorders>
-          <w:top w:val="nil" w:sz="4" w:space="0" w:color="BFBFBF"/>
-          <w:left w:val="nil" w:sz="4" w:space="0" w:color="BFBFBF"/>
-          <w:bottom w:val="nil" w:sz="4" w:space="0" w:color="BFBFBF"/>
-          <w:right w:val="nil" w:sz="4" w:space="0" w:color="BFBFBF"/>
-          <w:insideH w:val="nil" w:sz="4" w:space="0" w:color="BFBFBF"/>
-          <w:insideV w:val="single" w:sz="18" w:space="0" w:color="FFFFFF"/>
-        </w:tblBorders>
-        <w:tblLayout w:type="fixed"/>
-        <w:tblCellMar>
-          <w:top w:w="80" w:type="dxa"/>
-          <w:left w:w="110" w:type="dxa"/>
-          <w:bottom w:w="80" w:type="dxa"/>
-          <w:right w:w="110" w:type="dxa"/>
-        </w:tblCellMar>
-        <w:tblLook w:val="04A0" w:firstRow="1" w:lastRow="0" w:firstColumn="1" w:lastColumn="0" w:noHBand="0" w:noVBand="1"/>
-      </w:tblPr>
-      <w:tblGrid>
-        <w:gridCol w:w="8340"/>
-        <w:gridCol w:w="2100"/>
-      </w:tblGrid>
-      <w:tr>
-        <w:trPr>
-          <w:cantSplit/>
-          <w:trHeight w:val="580"/>
-        </w:trPr>
-        <w:tc>
-          <w:tcPr>
-            <w:tcW w:w="8340" w:type="dxa"/>
-            <w:shd w:val="clear" w:color="auto" w:fill="14532D"/>
-            <w:tcMar>
-              <w:right w:w="200" w:type="dxa"/>
-            </w:tcMar>
-            <w:vAlign w:val="center"/>
-          </w:tcPr>
-          <w:p>
-            <w:pPr>
-              <w:keepNext/>
-              <w:bidi/>
-              <w:spacing w:before="0" w:after="0" w:line="276" w:lineRule="auto"/>
-            </w:pPr>
-            <w:r>
-              <w:rPr>
-                <w:rFonts w:ascii="Calibri" w:eastAsia="Calibri" w:hAnsi="Calibri" w:cs="Arial"/>
-                <w:b/>
-                <w:bCs/>
-                <w:color w:val="FFFFFF"/>
-                <w:sz w:val="32"/>
-                <w:szCs w:val="32"/>
-                <w:rtl/>
-              </w:rPr>
-              <w:t xml:space="preserve">السؤال الرابع: أنجز العمليات الحسابية التالية</w:t>
-            </w:r>
-          </w:p>
-        </w:tc>
-        <w:tc>
-          <w:tcPr>
-            <w:tcW w:w="2100" w:type="dxa"/>
-            <w:shd w:val="clear" w:color="auto" w:fill="F6E9C6"/>
-            <w:vAlign w:val="center"/>
-          </w:tcPr>
-          <w:p>
-            <w:pPr>
-              <w:keepNext/>
-              <w:bidi/>
-              <w:spacing w:before="0" w:after="0" w:line="276" w:lineRule="auto"/>
-              <w:jc w:val="center"/>
-            </w:pPr>
-            <w:r>
-              <w:rPr>
-                <w:rFonts w:ascii="Calibri" w:eastAsia="Calibri" w:hAnsi="Calibri" w:cs="Arial"/>
-                <w:b/>
-                <w:bCs/>
-                <w:color w:val="14532D"/>
-                <w:sz w:val="28"/>
-                <w:szCs w:val="28"/>
-                <w:rtl/>
-              </w:rPr>
-              <w:t xml:space="preserve">علامتان</w:t>
-            </w:r>
-          </w:p>
-        </w:tc>
-      </w:tr>
-    </w:tbl>
-    <w:p>
-      <w:pPr>
-        <w:bidi/>
-        <w:spacing w:before="0" w:after="0" w:line="140" w:lineRule="exact"/>
-      </w:pPr>
+        <w:keepNext/>
+        <w:pBdr>
+          <w:top w:val="single" w:sz="18" w:space="3" w:color="14532D"/>
+          <w:bottom w:val="single" w:sz="18" w:space="3" w:color="14532D"/>
+          <w:right w:val="single" w:sz="48" w:space="6" w:color="B8860B"/>
+        </w:pBdr>
+        <w:shd w:val="clear" w:color="auto" w:fill="14532D"/>
+        <w:bidi/>
+        <w:spacing w:before="240" w:after="120" w:line="276" w:lineRule="auto"/>
+        <w:ind w:left="120" w:right="120"/>
+      </w:pPr>
+      <w:r>
+        <w:rPr>
+          <w:rFonts w:ascii="Calibri" w:eastAsia="Calibri" w:hAnsi="Calibri" w:cs="Arial"/>
+          <w:b/>
+          <w:bCs/>
+          <w:color w:val="FFFFFF"/>
+          <w:sz w:val="32"/>
+          <w:szCs w:val="32"/>
+          <w:rtl/>
+        </w:rPr>
+        <w:t xml:space="preserve">السؤال الرابع: أنجز العمليات الحسابية التالية</w:t>
+      </w:r>
+      <w:r>
+        <w:rPr>
+          <w:rFonts w:ascii="Calibri" w:eastAsia="Calibri" w:hAnsi="Calibri" w:cs="Arial"/>
+          <w:b/>
+          <w:bCs/>
+          <w:color w:val="F6D98B"/>
+          <w:sz w:val="28"/>
+          <w:szCs w:val="28"/>
+          <w:rtl/>
+        </w:rPr>
+        <w:t xml:space="preserve">   —  علامتان</w:t>
+      </w:r>
     </w:p>
     <w:p>
       <w:pPr>
@@ -2381,105 +2137,41 @@
     </w:p>
     <w:p>
       <w:pPr>
-        <w:pageBreakBefore/>
-        <w:bidi/>
-        <w:spacing w:before="0" w:after="0" w:line="200" w:lineRule="exact"/>
-      </w:pPr>
-    </w:p>
-    <w:tbl>
-      <w:tblPr>
-        <w:bidiVisual/>
-        <w:tblW w:w="10440" w:type="dxa"/>
-        <w:jc w:val="center"/>
-        <w:tblBorders>
-          <w:top w:val="nil" w:sz="4" w:space="0" w:color="BFBFBF"/>
-          <w:left w:val="nil" w:sz="4" w:space="0" w:color="BFBFBF"/>
-          <w:bottom w:val="nil" w:sz="4" w:space="0" w:color="BFBFBF"/>
-          <w:right w:val="nil" w:sz="4" w:space="0" w:color="BFBFBF"/>
-          <w:insideH w:val="nil" w:sz="4" w:space="0" w:color="BFBFBF"/>
-          <w:insideV w:val="single" w:sz="18" w:space="0" w:color="FFFFFF"/>
-        </w:tblBorders>
-        <w:tblLayout w:type="fixed"/>
-        <w:tblCellMar>
-          <w:top w:w="80" w:type="dxa"/>
-          <w:left w:w="110" w:type="dxa"/>
-          <w:bottom w:w="80" w:type="dxa"/>
-          <w:right w:w="110" w:type="dxa"/>
-        </w:tblCellMar>
-        <w:tblLook w:val="04A0" w:firstRow="1" w:lastRow="0" w:firstColumn="1" w:lastColumn="0" w:noHBand="0" w:noVBand="1"/>
-      </w:tblPr>
-      <w:tblGrid>
-        <w:gridCol w:w="8340"/>
-        <w:gridCol w:w="2100"/>
-      </w:tblGrid>
-      <w:tr>
-        <w:trPr>
-          <w:cantSplit/>
-          <w:trHeight w:val="580"/>
-        </w:trPr>
-        <w:tc>
-          <w:tcPr>
-            <w:tcW w:w="8340" w:type="dxa"/>
-            <w:shd w:val="clear" w:color="auto" w:fill="14532D"/>
-            <w:tcMar>
-              <w:right w:w="200" w:type="dxa"/>
-            </w:tcMar>
-            <w:vAlign w:val="center"/>
-          </w:tcPr>
-          <w:p>
-            <w:pPr>
-              <w:keepNext/>
-              <w:bidi/>
-              <w:spacing w:before="0" w:after="0" w:line="276" w:lineRule="auto"/>
-            </w:pPr>
-            <w:r>
-              <w:rPr>
-                <w:rFonts w:ascii="Calibri" w:eastAsia="Calibri" w:hAnsi="Calibri" w:cs="Arial"/>
-                <w:b/>
-                <w:bCs/>
-                <w:color w:val="FFFFFF"/>
-                <w:sz w:val="32"/>
-                <w:szCs w:val="32"/>
-                <w:rtl/>
-              </w:rPr>
-              <w:t xml:space="preserve">السؤال الخامس: قرّب إلى أقرب عدد صحيح</w:t>
-            </w:r>
-          </w:p>
-        </w:tc>
-        <w:tc>
-          <w:tcPr>
-            <w:tcW w:w="2100" w:type="dxa"/>
-            <w:shd w:val="clear" w:color="auto" w:fill="F6E9C6"/>
-            <w:vAlign w:val="center"/>
-          </w:tcPr>
-          <w:p>
-            <w:pPr>
-              <w:keepNext/>
-              <w:bidi/>
-              <w:spacing w:before="0" w:after="0" w:line="276" w:lineRule="auto"/>
-              <w:jc w:val="center"/>
-            </w:pPr>
-            <w:r>
-              <w:rPr>
-                <w:rFonts w:ascii="Calibri" w:eastAsia="Calibri" w:hAnsi="Calibri" w:cs="Arial"/>
-                <w:b/>
-                <w:bCs/>
-                <w:color w:val="14532D"/>
-                <w:sz w:val="28"/>
-                <w:szCs w:val="28"/>
-                <w:rtl/>
-              </w:rPr>
-              <w:t xml:space="preserve">علامة واحدة</w:t>
-            </w:r>
-          </w:p>
-        </w:tc>
-      </w:tr>
-    </w:tbl>
-    <w:p>
-      <w:pPr>
-        <w:bidi/>
-        <w:spacing w:before="0" w:after="0" w:line="140" w:lineRule="exact"/>
-      </w:pPr>
+        <w:keepNext/>
+        <w:pBdr>
+          <w:top w:val="single" w:sz="18" w:space="3" w:color="14532D"/>
+          <w:bottom w:val="single" w:sz="18" w:space="3" w:color="14532D"/>
+          <w:right w:val="single" w:sz="48" w:space="6" w:color="B8860B"/>
+        </w:pBdr>
+        <w:shd w:val="clear" w:color="auto" w:fill="14532D"/>
+        <w:bidi/>
+        <w:spacing w:before="240" w:after="120" w:line="276" w:lineRule="auto"/>
+        <w:ind w:left="120" w:right="120"/>
+      </w:pPr>
+      <w:r>
+        <w:rPr>
+          <w:rFonts w:ascii="Calibri" w:eastAsia="Calibri" w:hAnsi="Calibri" w:cs="Arial"/>
+          <w:b/>
+          <w:bCs/>
+          <w:color w:val="FFFFFF"/>
+          <w:sz w:val="32"/>
+          <w:szCs w:val="32"/>
+          <w:rtl/>
+        </w:rPr>
+        <w:t xml:space="preserve">السؤال الخامس: قرّب إلى أقرب عدد صحيح</w:t>
+      </w:r>
+      <w:r>
+        <w:rPr>
+          <w:rFonts w:ascii="Calibri" w:eastAsia="Calibri" w:hAnsi="Calibri" w:cs="Arial"/>
+          <w:b/>
+          <w:bCs/>
+          <w:color w:val="F6D98B"/>
+          <w:sz w:val="28"/>
+          <w:szCs w:val="28"/>
+          <w:rtl/>
+        </w:rPr>
+        <w:t xml:space="preserve">   —  علامة واحدة</w:t>
+      </w:r>
     </w:p>
     <w:p>
       <w:pPr>
@@ -2563,104 +2255,41 @@
     </w:p>
     <w:p>
       <w:pPr>
-        <w:bidi/>
-        <w:spacing w:before="0" w:after="0" w:line="200" w:lineRule="exact"/>
-      </w:pPr>
-    </w:p>
-    <w:tbl>
-      <w:tblPr>
-        <w:bidiVisual/>
-        <w:tblW w:w="10440" w:type="dxa"/>
-        <w:jc w:val="center"/>
-        <w:tblBorders>
-          <w:top w:val="nil" w:sz="4" w:space="0" w:color="BFBFBF"/>
-          <w:left w:val="nil" w:sz="4" w:space="0" w:color="BFBFBF"/>
-          <w:bottom w:val="nil" w:sz="4" w:space="0" w:color="BFBFBF"/>
-          <w:right w:val="nil" w:sz="4" w:space="0" w:color="BFBFBF"/>
-          <w:insideH w:val="nil" w:sz="4" w:space="0" w:color="BFBFBF"/>
-          <w:insideV w:val="single" w:sz="18" w:space="0" w:color="FFFFFF"/>
-        </w:tblBorders>
-        <w:tblLayout w:type="fixed"/>
-        <w:tblCellMar>
-          <w:top w:w="80" w:type="dxa"/>
-          <w:left w:w="110" w:type="dxa"/>
-          <w:bottom w:w="80" w:type="dxa"/>
-          <w:right w:w="110" w:type="dxa"/>
-        </w:tblCellMar>
-        <w:tblLook w:val="04A0" w:firstRow="1" w:lastRow="0" w:firstColumn="1" w:lastColumn="0" w:noHBand="0" w:noVBand="1"/>
-      </w:tblPr>
-      <w:tblGrid>
-        <w:gridCol w:w="8340"/>
-        <w:gridCol w:w="2100"/>
-      </w:tblGrid>
-      <w:tr>
-        <w:trPr>
-          <w:cantSplit/>
-          <w:trHeight w:val="580"/>
-        </w:trPr>
-        <w:tc>
-          <w:tcPr>
-            <w:tcW w:w="8340" w:type="dxa"/>
-            <w:shd w:val="clear" w:color="auto" w:fill="14532D"/>
-            <w:tcMar>
-              <w:right w:w="200" w:type="dxa"/>
-            </w:tcMar>
-            <w:vAlign w:val="center"/>
-          </w:tcPr>
-          <w:p>
-            <w:pPr>
-              <w:keepNext/>
-              <w:bidi/>
-              <w:spacing w:before="0" w:after="0" w:line="276" w:lineRule="auto"/>
-            </w:pPr>
-            <w:r>
-              <w:rPr>
-                <w:rFonts w:ascii="Calibri" w:eastAsia="Calibri" w:hAnsi="Calibri" w:cs="Arial"/>
-                <w:b/>
-                <w:bCs/>
-                <w:color w:val="FFFFFF"/>
-                <w:sz w:val="32"/>
-                <w:szCs w:val="32"/>
-                <w:rtl/>
-              </w:rPr>
-              <w:t xml:space="preserve">السؤال السادس: الدائرة</w:t>
-            </w:r>
-          </w:p>
-        </w:tc>
-        <w:tc>
-          <w:tcPr>
-            <w:tcW w:w="2100" w:type="dxa"/>
-            <w:shd w:val="clear" w:color="auto" w:fill="F6E9C6"/>
-            <w:vAlign w:val="center"/>
-          </w:tcPr>
-          <w:p>
-            <w:pPr>
-              <w:keepNext/>
-              <w:bidi/>
-              <w:spacing w:before="0" w:after="0" w:line="276" w:lineRule="auto"/>
-              <w:jc w:val="center"/>
-            </w:pPr>
-            <w:r>
-              <w:rPr>
-                <w:rFonts w:ascii="Calibri" w:eastAsia="Calibri" w:hAnsi="Calibri" w:cs="Arial"/>
-                <w:b/>
-                <w:bCs/>
-                <w:color w:val="14532D"/>
-                <w:sz w:val="28"/>
-                <w:szCs w:val="28"/>
-                <w:rtl/>
-              </w:rPr>
-              <w:t xml:space="preserve">علامتان</w:t>
-            </w:r>
-          </w:p>
-        </w:tc>
-      </w:tr>
-    </w:tbl>
-    <w:p>
-      <w:pPr>
-        <w:bidi/>
-        <w:spacing w:before="0" w:after="0" w:line="140" w:lineRule="exact"/>
-      </w:pPr>
+        <w:keepNext/>
+        <w:pBdr>
+          <w:top w:val="single" w:sz="18" w:space="3" w:color="14532D"/>
+          <w:bottom w:val="single" w:sz="18" w:space="3" w:color="14532D"/>
+          <w:right w:val="single" w:sz="48" w:space="6" w:color="B8860B"/>
+        </w:pBdr>
+        <w:shd w:val="clear" w:color="auto" w:fill="14532D"/>
+        <w:bidi/>
+        <w:spacing w:before="240" w:after="120" w:line="276" w:lineRule="auto"/>
+        <w:ind w:left="120" w:right="120"/>
+      </w:pPr>
+      <w:r>
+        <w:rPr>
+          <w:rFonts w:ascii="Calibri" w:eastAsia="Calibri" w:hAnsi="Calibri" w:cs="Arial"/>
+          <w:b/>
+          <w:bCs/>
+          <w:color w:val="FFFFFF"/>
+          <w:sz w:val="32"/>
+          <w:szCs w:val="32"/>
+          <w:rtl/>
+        </w:rPr>
+        <w:t xml:space="preserve">السؤال السادس: الدائرة</w:t>
+      </w:r>
+      <w:r>
+        <w:rPr>
+          <w:rFonts w:ascii="Calibri" w:eastAsia="Calibri" w:hAnsi="Calibri" w:cs="Arial"/>
+          <w:b/>
+          <w:bCs/>
+          <w:color w:val="F6D98B"/>
+          <w:sz w:val="28"/>
+          <w:szCs w:val="28"/>
+          <w:rtl/>
+        </w:rPr>
+        <w:t xml:space="preserve">   —  علامتان</w:t>
+      </w:r>
     </w:p>
     <w:p>
       <w:pPr>
@@ -2703,7 +2332,6 @@
     </w:p>
     <w:p>
       <w:pPr>
-        <w:keepNext/>
         <w:bidi/>
         <w:spacing w:before="60" w:after="60"/>
         <w:jc w:val="center"/>
@@ -3038,105 +2666,41 @@
     </w:p>
     <w:p>
       <w:pPr>
-        <w:pageBreakBefore/>
-        <w:bidi/>
-        <w:spacing w:before="0" w:after="0" w:line="200" w:lineRule="exact"/>
-      </w:pPr>
-    </w:p>
-    <w:tbl>
-      <w:tblPr>
-        <w:bidiVisual/>
-        <w:tblW w:w="10440" w:type="dxa"/>
-        <w:jc w:val="center"/>
-        <w:tblBorders>
-          <w:top w:val="nil" w:sz="4" w:space="0" w:color="BFBFBF"/>
-          <w:left w:val="nil" w:sz="4" w:space="0" w:color="BFBFBF"/>
-          <w:bottom w:val="nil" w:sz="4" w:space="0" w:color="BFBFBF"/>
-          <w:right w:val="nil" w:sz="4" w:space="0" w:color="BFBFBF"/>
-          <w:insideH w:val="nil" w:sz="4" w:space="0" w:color="BFBFBF"/>
-          <w:insideV w:val="single" w:sz="18" w:space="0" w:color="FFFFFF"/>
-        </w:tblBorders>
-        <w:tblLayout w:type="fixed"/>
-        <w:tblCellMar>
-          <w:top w:w="80" w:type="dxa"/>
-          <w:left w:w="110" w:type="dxa"/>
-          <w:bottom w:w="80" w:type="dxa"/>
-          <w:right w:w="110" w:type="dxa"/>
-        </w:tblCellMar>
-        <w:tblLook w:val="04A0" w:firstRow="1" w:lastRow="0" w:firstColumn="1" w:lastColumn="0" w:noHBand="0" w:noVBand="1"/>
-      </w:tblPr>
-      <w:tblGrid>
-        <w:gridCol w:w="8340"/>
-        <w:gridCol w:w="2100"/>
-      </w:tblGrid>
-      <w:tr>
-        <w:trPr>
-          <w:cantSplit/>
-          <w:trHeight w:val="580"/>
-        </w:trPr>
-        <w:tc>
-          <w:tcPr>
-            <w:tcW w:w="8340" w:type="dxa"/>
-            <w:shd w:val="clear" w:color="auto" w:fill="14532D"/>
-            <w:tcMar>
-              <w:right w:w="200" w:type="dxa"/>
-            </w:tcMar>
-            <w:vAlign w:val="center"/>
-          </w:tcPr>
-          <w:p>
-            <w:pPr>
-              <w:keepNext/>
-              <w:bidi/>
-              <w:spacing w:before="0" w:after="0" w:line="276" w:lineRule="auto"/>
-            </w:pPr>
-            <w:r>
-              <w:rPr>
-                <w:rFonts w:ascii="Calibri" w:eastAsia="Calibri" w:hAnsi="Calibri" w:cs="Arial"/>
-                <w:b/>
-                <w:bCs/>
-                <w:color w:val="FFFFFF"/>
-                <w:sz w:val="32"/>
-                <w:szCs w:val="32"/>
-                <w:rtl/>
-              </w:rPr>
-              <w:t xml:space="preserve">السؤال السابع: ق.م.أك و م.م.أص</w:t>
-            </w:r>
-          </w:p>
-        </w:tc>
-        <w:tc>
-          <w:tcPr>
-            <w:tcW w:w="2100" w:type="dxa"/>
-            <w:shd w:val="clear" w:color="auto" w:fill="F6E9C6"/>
-            <w:vAlign w:val="center"/>
-          </w:tcPr>
-          <w:p>
-            <w:pPr>
-              <w:keepNext/>
-              <w:bidi/>
-              <w:spacing w:before="0" w:after="0" w:line="276" w:lineRule="auto"/>
-              <w:jc w:val="center"/>
-            </w:pPr>
-            <w:r>
-              <w:rPr>
-                <w:rFonts w:ascii="Calibri" w:eastAsia="Calibri" w:hAnsi="Calibri" w:cs="Arial"/>
-                <w:b/>
-                <w:bCs/>
-                <w:color w:val="14532D"/>
-                <w:sz w:val="28"/>
-                <w:szCs w:val="28"/>
-                <w:rtl/>
-              </w:rPr>
-              <w:t xml:space="preserve">علامتان</w:t>
-            </w:r>
-          </w:p>
-        </w:tc>
-      </w:tr>
-    </w:tbl>
-    <w:p>
-      <w:pPr>
-        <w:bidi/>
-        <w:spacing w:before="0" w:after="0" w:line="140" w:lineRule="exact"/>
-      </w:pPr>
+        <w:keepNext/>
+        <w:pBdr>
+          <w:top w:val="single" w:sz="18" w:space="3" w:color="14532D"/>
+          <w:bottom w:val="single" w:sz="18" w:space="3" w:color="14532D"/>
+          <w:right w:val="single" w:sz="48" w:space="6" w:color="B8860B"/>
+        </w:pBdr>
+        <w:shd w:val="clear" w:color="auto" w:fill="14532D"/>
+        <w:bidi/>
+        <w:spacing w:before="240" w:after="120" w:line="276" w:lineRule="auto"/>
+        <w:ind w:left="120" w:right="120"/>
+      </w:pPr>
+      <w:r>
+        <w:rPr>
+          <w:rFonts w:ascii="Calibri" w:eastAsia="Calibri" w:hAnsi="Calibri" w:cs="Arial"/>
+          <w:b/>
+          <w:bCs/>
+          <w:color w:val="FFFFFF"/>
+          <w:sz w:val="32"/>
+          <w:szCs w:val="32"/>
+          <w:rtl/>
+        </w:rPr>
+        <w:t xml:space="preserve">السؤال السابع: ق.م.أك و م.م.أص</w:t>
+      </w:r>
+      <w:r>
+        <w:rPr>
+          <w:rFonts w:ascii="Calibri" w:eastAsia="Calibri" w:hAnsi="Calibri" w:cs="Arial"/>
+          <w:b/>
+          <w:bCs/>
+          <w:color w:val="F6D98B"/>
+          <w:sz w:val="28"/>
+          <w:szCs w:val="28"/>
+          <w:rtl/>
+        </w:rPr>
+        <w:t xml:space="preserve">   —  علامتان</w:t>
+      </w:r>
     </w:p>
     <w:p>
       <w:pPr>
@@ -3237,104 +2801,41 @@
     </w:p>
     <w:p>
       <w:pPr>
-        <w:bidi/>
-        <w:spacing w:before="0" w:after="0" w:line="200" w:lineRule="exact"/>
-      </w:pPr>
-    </w:p>
-    <w:tbl>
-      <w:tblPr>
-        <w:bidiVisual/>
-        <w:tblW w:w="10440" w:type="dxa"/>
-        <w:jc w:val="center"/>
-        <w:tblBorders>
-          <w:top w:val="nil" w:sz="4" w:space="0" w:color="BFBFBF"/>
-          <w:left w:val="nil" w:sz="4" w:space="0" w:color="BFBFBF"/>
-          <w:bottom w:val="nil" w:sz="4" w:space="0" w:color="BFBFBF"/>
-          <w:right w:val="nil" w:sz="4" w:space="0" w:color="BFBFBF"/>
-          <w:insideH w:val="nil" w:sz="4" w:space="0" w:color="BFBFBF"/>
-          <w:insideV w:val="single" w:sz="18" w:space="0" w:color="FFFFFF"/>
-        </w:tblBorders>
-        <w:tblLayout w:type="fixed"/>
-        <w:tblCellMar>
-          <w:top w:w="80" w:type="dxa"/>
-          <w:left w:w="110" w:type="dxa"/>
-          <w:bottom w:w="80" w:type="dxa"/>
-          <w:right w:w="110" w:type="dxa"/>
-        </w:tblCellMar>
-        <w:tblLook w:val="04A0" w:firstRow="1" w:lastRow="0" w:firstColumn="1" w:lastColumn="0" w:noHBand="0" w:noVBand="1"/>
-      </w:tblPr>
-      <w:tblGrid>
-        <w:gridCol w:w="8340"/>
-        <w:gridCol w:w="2100"/>
-      </w:tblGrid>
-      <w:tr>
-        <w:trPr>
-          <w:cantSplit/>
-          <w:trHeight w:val="580"/>
-        </w:trPr>
-        <w:tc>
-          <w:tcPr>
-            <w:tcW w:w="8340" w:type="dxa"/>
-            <w:shd w:val="clear" w:color="auto" w:fill="14532D"/>
-            <w:tcMar>
-              <w:right w:w="200" w:type="dxa"/>
-            </w:tcMar>
-            <w:vAlign w:val="center"/>
-          </w:tcPr>
-          <w:p>
-            <w:pPr>
-              <w:keepNext/>
-              <w:bidi/>
-              <w:spacing w:before="0" w:after="0" w:line="276" w:lineRule="auto"/>
-            </w:pPr>
-            <w:r>
-              <w:rPr>
-                <w:rFonts w:ascii="Calibri" w:eastAsia="Calibri" w:hAnsi="Calibri" w:cs="Arial"/>
-                <w:b/>
-                <w:bCs/>
-                <w:color w:val="FFFFFF"/>
-                <w:sz w:val="32"/>
-                <w:szCs w:val="32"/>
-                <w:rtl/>
-              </w:rPr>
-              <w:t xml:space="preserve">السؤال الثامن: المثلثات</w:t>
-            </w:r>
-          </w:p>
-        </w:tc>
-        <w:tc>
-          <w:tcPr>
-            <w:tcW w:w="2100" w:type="dxa"/>
-            <w:shd w:val="clear" w:color="auto" w:fill="F6E9C6"/>
-            <w:vAlign w:val="center"/>
-          </w:tcPr>
-          <w:p>
-            <w:pPr>
-              <w:keepNext/>
-              <w:bidi/>
-              <w:spacing w:before="0" w:after="0" w:line="276" w:lineRule="auto"/>
-              <w:jc w:val="center"/>
-            </w:pPr>
-            <w:r>
-              <w:rPr>
-                <w:rFonts w:ascii="Calibri" w:eastAsia="Calibri" w:hAnsi="Calibri" w:cs="Arial"/>
-                <w:b/>
-                <w:bCs/>
-                <w:color w:val="14532D"/>
-                <w:sz w:val="28"/>
-                <w:szCs w:val="28"/>
-                <w:rtl/>
-              </w:rPr>
-              <w:t xml:space="preserve">5 علامات</w:t>
-            </w:r>
-          </w:p>
-        </w:tc>
-      </w:tr>
-    </w:tbl>
-    <w:p>
-      <w:pPr>
-        <w:bidi/>
-        <w:spacing w:before="0" w:after="0" w:line="140" w:lineRule="exact"/>
-      </w:pPr>
+        <w:keepNext/>
+        <w:pBdr>
+          <w:top w:val="single" w:sz="18" w:space="3" w:color="14532D"/>
+          <w:bottom w:val="single" w:sz="18" w:space="3" w:color="14532D"/>
+          <w:right w:val="single" w:sz="48" w:space="6" w:color="B8860B"/>
+        </w:pBdr>
+        <w:shd w:val="clear" w:color="auto" w:fill="14532D"/>
+        <w:bidi/>
+        <w:spacing w:before="240" w:after="120" w:line="276" w:lineRule="auto"/>
+        <w:ind w:left="120" w:right="120"/>
+      </w:pPr>
+      <w:r>
+        <w:rPr>
+          <w:rFonts w:ascii="Calibri" w:eastAsia="Calibri" w:hAnsi="Calibri" w:cs="Arial"/>
+          <w:b/>
+          <w:bCs/>
+          <w:color w:val="FFFFFF"/>
+          <w:sz w:val="32"/>
+          <w:szCs w:val="32"/>
+          <w:rtl/>
+        </w:rPr>
+        <w:t xml:space="preserve">السؤال الثامن: المثلثات</w:t>
+      </w:r>
+      <w:r>
+        <w:rPr>
+          <w:rFonts w:ascii="Calibri" w:eastAsia="Calibri" w:hAnsi="Calibri" w:cs="Arial"/>
+          <w:b/>
+          <w:bCs/>
+          <w:color w:val="F6D98B"/>
+          <w:sz w:val="28"/>
+          <w:szCs w:val="28"/>
+          <w:rtl/>
+        </w:rPr>
+        <w:t xml:space="preserve">   —  5 علامات</w:t>
+      </w:r>
     </w:p>
     <w:p>
       <w:pPr>
@@ -3369,7 +2870,6 @@
     </w:p>
     <w:p>
       <w:pPr>
-        <w:keepNext/>
         <w:bidi/>
         <w:spacing w:before="60" w:after="60"/>
         <w:jc w:val="center"/>
@@ -3791,13 +3291,6 @@
     </w:tbl>
     <w:p>
       <w:pPr>
-        <w:pageBreakBefore/>
-        <w:bidi/>
-        <w:spacing w:before="0" w:after="0" w:line="200" w:lineRule="exact"/>
-      </w:pPr>
-    </w:p>
-    <w:p>
-      <w:pPr>
         <w:keepNext/>
         <w:bidi/>
         <w:spacing w:before="160" w:after="60" w:line="276" w:lineRule="auto"/>
@@ -3829,7 +3322,6 @@
     </w:p>
     <w:p>
       <w:pPr>
-        <w:keepNext/>
         <w:bidi/>
         <w:spacing w:before="60" w:after="60"/>
         <w:jc w:val="center"/>
@@ -4150,7 +3642,7 @@
     <w:p>
       <w:pPr>
         <w:bidi/>
-        <w:spacing w:before="0" w:after="0" w:line="300" w:lineRule="exact"/>
+        <w:spacing w:before="0" w:after="0" w:line="120" w:lineRule="exact"/>
       </w:pPr>
     </w:p>
     <w:p>

</xml_diff>